<commit_message>
docs: update reference notebook and file book through file 035
</commit_message>
<xml_diff>
--- a/docs/notebook/CodeGuard_AI_File_Book.docx
+++ b/docs/notebook/CodeGuard_AI_File_Book.docx
@@ -83,7 +83,7 @@
           <w:sz w:val="19"/>
           <w:szCs w:val="19"/>
         </w:rPr>
-        <w:t xml:space="preserve">Covers Files 001–030. Last updated 15 September 2026.</w:t>
+        <w:t xml:space="preserve">Covers Files 001–035. Last updated 17 September 2026.</w:t>
       </w:r>
     </w:p>
     <w:p>
@@ -15728,7 +15728,135 @@
           <w:sz w:val="28"/>
           <w:szCs w:val="28"/>
         </w:rPr>
-        <w:t xml:space="preserve">Next entry</w:t>
+        <w:t xml:space="preserve">File 031 — apps/api/src/middleware/errorHandler.ts</w:t>
+      </w:r>
+    </w:p>
+    <w:p>
+      <w:pPr>
+        <w:pStyle w:val="Heading3"/>
+        <w:spacing w:after="80" w:before="200"/>
+      </w:pPr>
+      <w:r>
+        <w:rPr>
+          <w:b/>
+          <w:bCs/>
+          <w:color w:val="8A6D1F"/>
+          <w:sz w:val="21"/>
+          <w:szCs w:val="21"/>
+        </w:rPr>
+        <w:t xml:space="preserve">1 · Why this file exists</w:t>
+      </w:r>
+    </w:p>
+    <w:p>
+      <w:pPr>
+        <w:spacing w:after="120"/>
+      </w:pPr>
+      <w:r>
+        <w:rPr>
+          <w:b w:val="false"/>
+          <w:bCs w:val="false"/>
+          <w:i w:val="false"/>
+          <w:iCs w:val="false"/>
+          <w:sz w:val="20"/>
+          <w:szCs w:val="20"/>
+        </w:rPr>
+        <w:t xml:space="preserve">File 030 gave us a way to *raise* errors; this is where they land. An unhandled error previously produced Express's default 500 with a full stack trace in the response body, leaking file paths, Node and library versions, and field names. But the more interesting job is reconciliation: errors arrive in four incompatible shapes, and File 020 proved the first two are genuinely different — an invalid role gives a Mongoose ValidationError while a duplicate email gives a MongoDB E11000. A client should not have to know which of our internal libraries produced a failure.</w:t>
+      </w:r>
+    </w:p>
+    <w:p>
+      <w:pPr>
+        <w:pStyle w:val="Heading3"/>
+        <w:spacing w:after="80" w:before="200"/>
+      </w:pPr>
+      <w:r>
+        <w:rPr>
+          <w:b/>
+          <w:bCs/>
+          <w:color w:val="8A6D1F"/>
+          <w:sz w:val="21"/>
+          <w:szCs w:val="21"/>
+        </w:rPr>
+        <w:t xml:space="preserve">2 · Why it is a separate file</w:t>
+      </w:r>
+    </w:p>
+    <w:p>
+      <w:pPr>
+        <w:spacing w:after="120"/>
+      </w:pPr>
+      <w:r>
+        <w:rPr>
+          <w:b w:val="false"/>
+          <w:bCs w:val="false"/>
+          <w:i w:val="false"/>
+          <w:iCs w:val="false"/>
+          <w:sz w:val="20"/>
+          <w:szCs w:val="20"/>
+        </w:rPr>
+        <w:t xml:space="preserve">Separate from AppError by role — that defines *what an error is* and has zero imports; this defines *what to do with it* and imports Express, Zod, Mongoose and AppError. Separate from app.ts because it is registered there but defined here, the same split as route files. In middleware/ because it genuinely is middleware, and a specific kind.</w:t>
+      </w:r>
+    </w:p>
+    <w:p>
+      <w:pPr>
+        <w:pStyle w:val="Heading3"/>
+        <w:spacing w:after="80" w:before="200"/>
+      </w:pPr>
+      <w:r>
+        <w:rPr>
+          <w:b/>
+          <w:bCs/>
+          <w:color w:val="8A6D1F"/>
+          <w:sz w:val="21"/>
+          <w:szCs w:val="21"/>
+        </w:rPr>
+        <w:t xml:space="preserve">3 · What we do in this file</w:t>
+      </w:r>
+    </w:p>
+    <w:p>
+      <w:pPr>
+        <w:spacing w:after="120"/>
+      </w:pPr>
+      <w:r>
+        <w:rPr>
+          <w:b w:val="false"/>
+          <w:bCs w:val="false"/>
+          <w:i w:val="false"/>
+          <w:iCs w:val="false"/>
+          <w:sz w:val="20"/>
+          <w:szCs w:val="20"/>
+        </w:rPr>
+        <w:t xml:space="preserve">Four translators (AppError, ZodError, Mongoose ValidationError, MongoDB E11000, plus CastError), one response envelope { code, message, details?, requestId }, a per-error request ID, and operational-versus-programmer logging. Plus a notFoundHandler that routes unmatched routes through the same funnel.</w:t>
+      </w:r>
+    </w:p>
+    <w:p>
+      <w:pPr>
+        <w:pStyle w:val="Heading3"/>
+        <w:spacing w:after="80" w:before="200"/>
+      </w:pPr>
+      <w:r>
+        <w:rPr>
+          <w:b/>
+          <w:bCs/>
+          <w:color w:val="8A6D1F"/>
+          <w:sz w:val="21"/>
+          <w:szCs w:val="21"/>
+        </w:rPr>
+        <w:t xml:space="preserve">4 · Changes made later</w:t>
+      </w:r>
+    </w:p>
+    <w:p>
+      <w:pPr>
+        <w:spacing w:after="120"/>
+      </w:pPr>
+      <w:r>
+        <w:rPr>
+          <w:b w:val="false"/>
+          <w:bCs w:val="false"/>
+          <w:i w:val="false"/>
+          <w:iCs w:val="false"/>
+          <w:sz w:val="20"/>
+          <w:szCs w:val="20"/>
+        </w:rPr>
+        <w:t xml:space="preserve">16 Sep 2026 — console.warn and console.error replaced with pino when File 032 landed.</w:t>
       </w:r>
     </w:p>
     <w:p>
@@ -15744,7 +15872,2918 @@
           <w:sz w:val="19"/>
           <w:szCs w:val="19"/>
         </w:rPr>
-        <w:t xml:space="preserve">[ File 031 — apps/api/src/middleware/errorHandler.ts ]</w:t>
+        <w:t xml:space="preserve">[ Date any later change to this file here. ]</w:t>
+      </w:r>
+    </w:p>
+    <w:p>
+      <w:pPr>
+        <w:pStyle w:val="Heading3"/>
+        <w:spacing w:after="80" w:before="200"/>
+      </w:pPr>
+      <w:r>
+        <w:rPr>
+          <w:b/>
+          <w:bCs/>
+          <w:color w:val="8A6D1F"/>
+          <w:sz w:val="21"/>
+          <w:szCs w:val="21"/>
+        </w:rPr>
+        <w:t xml:space="preserve">5 · Where it sits</w:t>
+      </w:r>
+    </w:p>
+    <w:p>
+      <w:pPr>
+        <w:spacing w:after="120"/>
+      </w:pPr>
+      <w:r>
+        <w:rPr>
+          <w:b w:val="false"/>
+          <w:bCs w:val="false"/>
+          <w:i w:val="false"/>
+          <w:iCs w:val="false"/>
+          <w:sz w:val="20"/>
+          <w:szCs w:val="20"/>
+        </w:rPr>
+        <w:t xml:space="preserve">apps/api/src/middleware/errorHandler.ts. Registered last in app.ts, after notFoundHandler and after every route.</w:t>
+      </w:r>
+    </w:p>
+    <w:p>
+      <w:pPr>
+        <w:pStyle w:val="Heading3"/>
+        <w:spacing w:after="80" w:before="200"/>
+      </w:pPr>
+      <w:r>
+        <w:rPr>
+          <w:b/>
+          <w:bCs/>
+          <w:color w:val="8A6D1F"/>
+          <w:sz w:val="21"/>
+          <w:szCs w:val="21"/>
+        </w:rPr>
+        <w:t xml:space="preserve">6 · Libraries used here</w:t>
+      </w:r>
+    </w:p>
+    <w:p>
+      <w:pPr>
+        <w:spacing w:after="120"/>
+      </w:pPr>
+      <w:r>
+        <w:rPr>
+          <w:b w:val="false"/>
+          <w:bCs w:val="false"/>
+          <w:i w:val="false"/>
+          <w:iCs w:val="false"/>
+          <w:sz w:val="20"/>
+          <w:szCs w:val="20"/>
+        </w:rPr>
+        <w:t xml:space="preserve">None new. First use of Express's Request/Response/NextFunction types (import type, per verbatimModuleSyntax), ZodError, and Mongoose's Error namespace renamed on import because `Error` would shadow the global.</w:t>
+      </w:r>
+    </w:p>
+    <w:p>
+      <w:pPr>
+        <w:pStyle w:val="Heading3"/>
+        <w:spacing w:after="80" w:before="200"/>
+      </w:pPr>
+      <w:r>
+        <w:rPr>
+          <w:b/>
+          <w:bCs/>
+          <w:color w:val="8A6D1F"/>
+          <w:sz w:val="21"/>
+          <w:szCs w:val="21"/>
+        </w:rPr>
+        <w:t xml:space="preserve">7 · Functions in this file</w:t>
+      </w:r>
+    </w:p>
+    <w:p>
+      <w:pPr>
+        <w:spacing w:after="120"/>
+      </w:pPr>
+      <w:r>
+        <w:rPr>
+          <w:b w:val="false"/>
+          <w:bCs w:val="false"/>
+          <w:i w:val="false"/>
+          <w:iCs w:val="false"/>
+          <w:sz w:val="20"/>
+          <w:szCs w:val="20"/>
+        </w:rPr>
+        <w:t xml:space="preserve">errorHandler(err, req, res, next) — classifies any thrown value, logs appropriately, sends one envelope. Cannot fail: if every branch misses, the 500 defaults apply.</w:t>
+      </w:r>
+    </w:p>
+    <w:p>
+      <w:pPr>
+        <w:spacing w:after="120"/>
+      </w:pPr>
+      <w:r>
+        <w:rPr>
+          <w:b w:val="false"/>
+          <w:bCs w:val="false"/>
+          <w:i w:val="false"/>
+          <w:iCs w:val="false"/>
+          <w:sz w:val="20"/>
+          <w:szCs w:val="20"/>
+        </w:rPr>
+        <w:t xml:space="preserve">notFoundHandler(req, res, next) — converts an unmatched route into an AppError and calls next(err).</w:t>
+      </w:r>
+    </w:p>
+    <w:p>
+      <w:pPr>
+        <w:spacing w:after="120"/>
+      </w:pPr>
+      <w:r>
+        <w:rPr>
+          <w:b w:val="false"/>
+          <w:bCs w:val="false"/>
+          <w:i w:val="false"/>
+          <w:iCs w:val="false"/>
+          <w:sz w:val="20"/>
+          <w:szCs w:val="20"/>
+        </w:rPr>
+        <w:t xml:space="preserve">isDuplicateKeyError(err) — a type guard, duck-typed on code === 11000 rather than instanceof, because the driver's error class is not reliably exported across versions.</w:t>
+      </w:r>
+    </w:p>
+    <w:p>
+      <w:pPr>
+        <w:spacing w:after="120"/>
+      </w:pPr>
+      <w:r>
+        <w:rPr>
+          <w:b w:val="false"/>
+          <w:bCs w:val="false"/>
+          <w:i w:val="false"/>
+          <w:iCs w:val="false"/>
+          <w:sz w:val="20"/>
+          <w:szCs w:val="20"/>
+        </w:rPr>
+        <w:t xml:space="preserve">fromZod, fromMongooseValidation, fromDuplicateKey — pure translators, separate so the main handler stays a flat else-if chain and each can be unit-tested without HTTP.</w:t>
+      </w:r>
+    </w:p>
+    <w:p>
+      <w:pPr>
+        <w:pStyle w:val="Heading3"/>
+        <w:spacing w:after="80" w:before="200"/>
+      </w:pPr>
+      <w:r>
+        <w:rPr>
+          <w:b/>
+          <w:bCs/>
+          <w:color w:val="8A6D1F"/>
+          <w:sz w:val="21"/>
+          <w:szCs w:val="21"/>
+        </w:rPr>
+        <w:t xml:space="preserve">8 · Technical terms introduced</w:t>
+      </w:r>
+    </w:p>
+    <w:p>
+      <w:pPr>
+        <w:spacing w:after="120"/>
+      </w:pPr>
+      <w:r>
+        <w:rPr>
+          <w:b w:val="false"/>
+          <w:bCs w:val="false"/>
+          <w:i w:val="false"/>
+          <w:iCs w:val="false"/>
+          <w:sz w:val="20"/>
+          <w:szCs w:val="20"/>
+        </w:rPr>
+        <w:t xml:space="preserve">error middleware · arity · error envelope · request ID / correlation ID · CastError · keyPattern vs keyValue · duck typing · destructuring assignment to existing variables · fail-closed</w:t>
+      </w:r>
+    </w:p>
+    <w:p>
+      <w:pPr>
+        <w:pStyle w:val="Heading3"/>
+        <w:spacing w:after="80" w:before="200"/>
+      </w:pPr>
+      <w:r>
+        <w:rPr>
+          <w:b/>
+          <w:bCs/>
+          <w:color w:val="8A6D1F"/>
+          <w:sz w:val="21"/>
+          <w:szCs w:val="21"/>
+        </w:rPr>
+        <w:t xml:space="preserve">9 · Why this approach and not another</w:t>
+      </w:r>
+    </w:p>
+    <w:p>
+      <w:pPr>
+        <w:pStyle w:val="ListParagraph"/>
+        <w:numPr>
+          <w:ilvl w:val="0"/>
+          <w:numId w:val="1"/>
+        </w:numPr>
+        <w:spacing w:after="60"/>
+      </w:pPr>
+      <w:r>
+        <w:rPr>
+          <w:b/>
+          <w:bCs/>
+          <w:sz w:val="20"/>
+          <w:szCs w:val="20"/>
+        </w:rPr>
+        <w:t xml:space="preserve">One central handler over per-route try/catch</w:t>
+      </w:r>
+      <w:r>
+        <w:rPr>
+          <w:sz w:val="20"/>
+          <w:szCs w:val="20"/>
+        </w:rPr>
+        <w:t xml:space="preserve"> — every controller would otherwise repeat the same Mongoose translation, and one that forgot would leak a stack trace.</w:t>
+      </w:r>
+    </w:p>
+    <w:p>
+      <w:pPr>
+        <w:pStyle w:val="ListParagraph"/>
+        <w:numPr>
+          <w:ilvl w:val="0"/>
+          <w:numId w:val="1"/>
+        </w:numPr>
+        <w:spacing w:after="60"/>
+      </w:pPr>
+      <w:r>
+        <w:rPr>
+          <w:b/>
+          <w:bCs/>
+          <w:sz w:val="20"/>
+          <w:szCs w:val="20"/>
+        </w:rPr>
+        <w:t xml:space="preserve">Translating at the boundary over letting library errors through</w:t>
+      </w:r>
+      <w:r>
+        <w:rPr>
+          <w:sz w:val="20"/>
+          <w:szCs w:val="20"/>
+        </w:rPr>
+        <w:t xml:space="preserve"> — a client should not have to know we use Mongoose. If we switched to Prisma, E11000 would become something else — and only this file would change.</w:t>
+      </w:r>
+    </w:p>
+    <w:p>
+      <w:pPr>
+        <w:pStyle w:val="ListParagraph"/>
+        <w:numPr>
+          <w:ilvl w:val="0"/>
+          <w:numId w:val="1"/>
+        </w:numPr>
+        <w:spacing w:after="60"/>
+      </w:pPr>
+      <w:r>
+        <w:rPr>
+          <w:b/>
+          <w:bCs/>
+          <w:sz w:val="20"/>
+          <w:szCs w:val="20"/>
+        </w:rPr>
+        <w:t xml:space="preserve">Never echoing the duplicate value</w:t>
+      </w:r>
+      <w:r>
+        <w:rPr>
+          <w:sz w:val="20"/>
+          <w:szCs w:val="20"/>
+        </w:rPr>
+        <w:t xml:space="preserve"> — MongoDB offers keyValue; using it would leak whether an email is registered, the same enumeration vector AppError.unauthenticated() closes. Naming the field is enough for the UI, and fields.join(“ and ”) handles compound indexes.</w:t>
+      </w:r>
+    </w:p>
+    <w:p>
+      <w:pPr>
+        <w:pStyle w:val="ListParagraph"/>
+        <w:numPr>
+          <w:ilvl w:val="0"/>
+          <w:numId w:val="1"/>
+        </w:numPr>
+        <w:spacing w:after="60"/>
+      </w:pPr>
+      <w:r>
+        <w:rPr>
+          <w:b/>
+          <w:bCs/>
+          <w:sz w:val="20"/>
+          <w:szCs w:val="20"/>
+        </w:rPr>
+        <w:t xml:space="preserve">Generic 500 message over the real one</w:t>
+      </w:r>
+      <w:r>
+        <w:rPr>
+          <w:sz w:val="20"/>
+          <w:szCs w:val="20"/>
+        </w:rPr>
+        <w:t xml:space="preserve"> — stack traces leak absolute file paths, library versions and field names.</w:t>
+      </w:r>
+    </w:p>
+    <w:p>
+      <w:pPr>
+        <w:pStyle w:val="ListParagraph"/>
+        <w:numPr>
+          <w:ilvl w:val="0"/>
+          <w:numId w:val="1"/>
+        </w:numPr>
+        <w:spacing w:after="60"/>
+      </w:pPr>
+      <w:r>
+        <w:rPr>
+          <w:b/>
+          <w:bCs/>
+          <w:sz w:val="20"/>
+          <w:szCs w:val="20"/>
+        </w:rPr>
+        <w:t xml:space="preserve">Development detail gated on validated env.NODE_ENV</w:t>
+      </w:r>
+      <w:r>
+        <w:rPr>
+          <w:sz w:val="20"/>
+          <w:szCs w:val="20"/>
+        </w:rPr>
+        <w:t xml:space="preserve"> — using raw process.env would mean an unset variable silently enables it in production. And only the message is attached, never the stack, so a screenshot of a dev response cannot leak paths.</w:t>
+      </w:r>
+    </w:p>
+    <w:p>
+      <w:pPr>
+        <w:pStyle w:val="ListParagraph"/>
+        <w:numPr>
+          <w:ilvl w:val="0"/>
+          <w:numId w:val="1"/>
+        </w:numPr>
+        <w:spacing w:after="60"/>
+      </w:pPr>
+      <w:r>
+        <w:rPr>
+          <w:b/>
+          <w:bCs/>
+          <w:sz w:val="20"/>
+          <w:szCs w:val="20"/>
+        </w:rPr>
+        <w:t xml:space="preserve">next(err) from the 404 handler over responding directly</w:t>
+      </w:r>
+      <w:r>
+        <w:rPr>
+          <w:sz w:val="20"/>
+          <w:szCs w:val="20"/>
+        </w:rPr>
+        <w:t xml:space="preserve"> — one envelope for every failure. File 010's version returned { error: “Not found” } with error as a *string* while everything else returns an object — a frontend would have had to handle both.</w:t>
+      </w:r>
+    </w:p>
+    <w:p>
+      <w:pPr>
+        <w:pStyle w:val="ListParagraph"/>
+        <w:numPr>
+          <w:ilvl w:val="0"/>
+          <w:numId w:val="1"/>
+        </w:numPr>
+        <w:spacing w:after="60"/>
+      </w:pPr>
+      <w:r>
+        <w:rPr>
+          <w:b/>
+          <w:bCs/>
+          <w:sz w:val="20"/>
+          <w:szCs w:val="20"/>
+        </w:rPr>
+        <w:t xml:space="preserve">Duck-typed E11000 check over instanceof MongoServerError</w:t>
+      </w:r>
+      <w:r>
+        <w:rPr>
+          <w:sz w:val="20"/>
+          <w:szCs w:val="20"/>
+        </w:rPr>
+        <w:t xml:space="preserve"> — the driver's error classes are not reliably exported across versions, and code === 11000 is stable and documented.</w:t>
+      </w:r>
+    </w:p>
+    <w:p>
+      <w:pPr>
+        <w:pStyle w:val="Heading3"/>
+        <w:spacing w:after="80" w:before="200"/>
+      </w:pPr>
+      <w:r>
+        <w:rPr>
+          <w:b/>
+          <w:bCs/>
+          <w:color w:val="8A6D1F"/>
+          <w:sz w:val="21"/>
+          <w:szCs w:val="21"/>
+        </w:rPr>
+        <w:t xml:space="preserve">The four-parameter rule, and a minor inaccuracy</w:t>
+      </w:r>
+    </w:p>
+    <w:p>
+      <w:pPr>
+        <w:pStyle w:val="ListParagraph"/>
+        <w:numPr>
+          <w:ilvl w:val="0"/>
+          <w:numId w:val="1"/>
+        </w:numPr>
+        <w:spacing w:after="60"/>
+      </w:pPr>
+      <w:r>
+        <w:rPr>
+          <w:sz w:val="20"/>
+          <w:szCs w:val="20"/>
+        </w:rPr>
+        <w:t xml:space="preserve">Express counts parameters to decide what a function is — three means normal middleware, four means error middleware, read from fn.length at registration time. So removing the unused `_next` silently turns this into normal middleware: it stops receiving errors, every failure falls through to Express's default handler, and nothing tells you why.</w:t>
+      </w:r>
+    </w:p>
+    <w:p>
+      <w:pPr>
+        <w:pStyle w:val="ListParagraph"/>
+        <w:numPr>
+          <w:ilvl w:val="0"/>
+          <w:numId w:val="1"/>
+        </w:numPr>
+        <w:spacing w:after="60"/>
+      </w:pPr>
+      <w:r>
+        <w:rPr>
+          <w:sz w:val="20"/>
+          <w:szCs w:val="20"/>
+        </w:rPr>
+        <w:t xml:space="preserve">err is typed unknown, not Error. JavaScript lets you throw anything — a string, a number, null. Confirmed in testing: a thrown string produced a clean 500 rather than crashing the handler.</w:t>
+      </w:r>
+    </w:p>
+    <w:p>
+      <w:pPr>
+        <w:pStyle w:val="ListParagraph"/>
+        <w:numPr>
+          <w:ilvl w:val="0"/>
+          <w:numId w:val="1"/>
+        </w:numPr>
+        <w:spacing w:after="60"/>
+      </w:pPr>
+      <w:r>
+        <w:rPr>
+          <w:sz w:val="20"/>
+          <w:szCs w:val="20"/>
+        </w:rPr>
+        <w:t xml:space="preserve">Minor inaccuracy found in testing: the duplicate-key details lists each field of a compound index as separately “must be unique”, but for { code, academicYear } neither is unique alone — the pair is. A frontend highlighting both as individually-invalid would be showing something untrue. Low impact; the message itself is correct. Revisit if the UI needs per-field accuracy.</w:t>
+      </w:r>
+    </w:p>
+    <w:p>
+      <w:pPr>
+        <w:pStyle w:val="ListParagraph"/>
+        <w:numPr>
+          <w:ilvl w:val="0"/>
+          <w:numId w:val="1"/>
+        </w:numPr>
+        <w:spacing w:after="60"/>
+      </w:pPr>
+      <w:r>
+        <w:rPr>
+          <w:sz w:val="20"/>
+          <w:szCs w:val="20"/>
+        </w:rPr>
+        <w:t xml:space="preserve">Known limitation: the request ID is generated at *error* time, so it only exists on failures. A proper implementation attaches one to every request in middleware. Small addition when pino-http is wired.</w:t>
+      </w:r>
+    </w:p>
+    <w:p>
+      <w:r>
+        <w:br w:type="page"/>
+      </w:r>
+    </w:p>
+    <w:p>
+      <w:pPr>
+        <w:pStyle w:val="Heading1"/>
+        <w:pBdr>
+          <w:bottom w:val="single" w:color="8A6D1F" w:sz="8" w:space="4"/>
+        </w:pBdr>
+        <w:spacing w:after="160" w:before="420"/>
+      </w:pPr>
+      <w:r>
+        <w:rPr>
+          <w:b/>
+          <w:bCs/>
+          <w:color w:val="1F3352"/>
+          <w:sz w:val="28"/>
+          <w:szCs w:val="28"/>
+        </w:rPr>
+        <w:t xml:space="preserve">File 032 — apps/api/src/config/logger.ts</w:t>
+      </w:r>
+    </w:p>
+    <w:p>
+      <w:pPr>
+        <w:pStyle w:val="Heading3"/>
+        <w:spacing w:after="80" w:before="200"/>
+      </w:pPr>
+      <w:r>
+        <w:rPr>
+          <w:b/>
+          <w:bCs/>
+          <w:color w:val="8A6D1F"/>
+          <w:sz w:val="21"/>
+          <w:szCs w:val="21"/>
+        </w:rPr>
+        <w:t xml:space="preserve">1 · Why this file exists</w:t>
+      </w:r>
+    </w:p>
+    <w:p>
+      <w:pPr>
+        <w:spacing w:after="120"/>
+      </w:pPr>
+      <w:r>
+        <w:rPr>
+          <w:b w:val="false"/>
+          <w:bCs w:val="false"/>
+          <w:i w:val="false"/>
+          <w:iCs w:val="false"/>
+          <w:sz w:val="20"/>
+          <w:szCs w:val="20"/>
+        </w:rPr>
+        <w:t xml:space="preserve">Three reasons. console.log produces unsearchable prose — “403 FORBIDDEN GET /app-error” cannot answer “show me every 403 for this student in the last hour” without a regex against English. There is no runtime-filterable severity, so the warn-versus-error distinction from File 019 exists only by convention. And redaction: in two files we handle passwords and in three, JWTs, and the commonest way a credential leaks is not an attack but a developer logging a request body while debugging. The mechanism has to exist *before* the code that handles secrets, or adding it means auditing every call site.</w:t>
+      </w:r>
+    </w:p>
+    <w:p>
+      <w:pPr>
+        <w:pStyle w:val="Heading3"/>
+        <w:spacing w:after="80" w:before="200"/>
+      </w:pPr>
+      <w:r>
+        <w:rPr>
+          <w:b/>
+          <w:bCs/>
+          <w:color w:val="8A6D1F"/>
+          <w:sz w:val="21"/>
+          <w:szCs w:val="21"/>
+        </w:rPr>
+        <w:t xml:space="preserve">2 · Why it is a separate file</w:t>
+      </w:r>
+    </w:p>
+    <w:p>
+      <w:pPr>
+        <w:spacing w:after="120"/>
+      </w:pPr>
+      <w:r>
+        <w:rPr>
+          <w:b w:val="false"/>
+          <w:bCs w:val="false"/>
+          <w:i w:val="false"/>
+          <w:iCs w:val="false"/>
+          <w:sz w:val="20"/>
+          <w:szCs w:val="20"/>
+        </w:rPr>
+        <w:t xml:space="preserve">In config/ beside env.ts because logging is configuration — level, format, redaction paths — and it imports env, so it is not a leaf. Separate from errorHandler because logging is not error handling; the handler is one consumer among several.</w:t>
+      </w:r>
+    </w:p>
+    <w:p>
+      <w:pPr>
+        <w:pStyle w:val="Heading3"/>
+        <w:spacing w:after="80" w:before="200"/>
+      </w:pPr>
+      <w:r>
+        <w:rPr>
+          <w:b/>
+          <w:bCs/>
+          <w:color w:val="8A6D1F"/>
+          <w:sz w:val="21"/>
+          <w:szCs w:val="21"/>
+        </w:rPr>
+        <w:t xml:space="preserve">3 · What we do in this file</w:t>
+      </w:r>
+    </w:p>
+    <w:p>
+      <w:pPr>
+        <w:spacing w:after="120"/>
+      </w:pPr>
+      <w:r>
+        <w:rPr>
+          <w:b w:val="false"/>
+          <w:bCs w:val="false"/>
+          <w:i w:val="false"/>
+          <w:iCs w:val="false"/>
+          <w:sz w:val="20"/>
+          <w:szCs w:val="20"/>
+        </w:rPr>
+        <w:t xml:space="preserve">A shared pino instance — level from LOG_LEVEL, ISO timestamps, a service field on every line, pino-pretty in development only, and nineteen redaction paths. Plus componentLogger(), returning a child logger with a component field bound.</w:t>
+      </w:r>
+    </w:p>
+    <w:p>
+      <w:pPr>
+        <w:pStyle w:val="Heading3"/>
+        <w:spacing w:after="80" w:before="200"/>
+      </w:pPr>
+      <w:r>
+        <w:rPr>
+          <w:b/>
+          <w:bCs/>
+          <w:color w:val="8A6D1F"/>
+          <w:sz w:val="21"/>
+          <w:szCs w:val="21"/>
+        </w:rPr>
+        <w:t xml:space="preserve">4 · Changes made later</w:t>
+      </w:r>
+    </w:p>
+    <w:p>
+      <w:pPr>
+        <w:spacing w:after="160"/>
+        <w:ind w:left="360"/>
+      </w:pPr>
+      <w:r>
+        <w:rPr>
+          <w:i/>
+          <w:iCs/>
+          <w:color w:val="9A9A9A"/>
+          <w:sz w:val="19"/>
+          <w:szCs w:val="19"/>
+        </w:rPr>
+        <w:t xml:space="preserve">[ Date any later change to this file here. ]</w:t>
+      </w:r>
+    </w:p>
+    <w:p>
+      <w:pPr>
+        <w:pStyle w:val="Heading3"/>
+        <w:spacing w:after="80" w:before="200"/>
+      </w:pPr>
+      <w:r>
+        <w:rPr>
+          <w:b/>
+          <w:bCs/>
+          <w:color w:val="8A6D1F"/>
+          <w:sz w:val="21"/>
+          <w:szCs w:val="21"/>
+        </w:rPr>
+        <w:t xml:space="preserve">5 · Where it sits</w:t>
+      </w:r>
+    </w:p>
+    <w:p>
+      <w:pPr>
+        <w:spacing w:after="120"/>
+      </w:pPr>
+      <w:r>
+        <w:rPr>
+          <w:b w:val="false"/>
+          <w:bCs w:val="false"/>
+          <w:i w:val="false"/>
+          <w:iCs w:val="false"/>
+          <w:sz w:val="20"/>
+          <w:szCs w:val="20"/>
+        </w:rPr>
+        <w:t xml:space="preserve">apps/api/src/config/logger.ts. Consumed by server.ts, db/connect.ts, middleware/errorHandler.ts and middleware/auth.ts. Output goes to stdout, which Docker collects.</w:t>
+      </w:r>
+    </w:p>
+    <w:p>
+      <w:pPr>
+        <w:pStyle w:val="Heading3"/>
+        <w:spacing w:after="80" w:before="200"/>
+      </w:pPr>
+      <w:r>
+        <w:rPr>
+          <w:b/>
+          <w:bCs/>
+          <w:color w:val="8A6D1F"/>
+          <w:sz w:val="21"/>
+          <w:szCs w:val="21"/>
+        </w:rPr>
+        <w:t xml:space="preserve">6 · Libraries used here</w:t>
+      </w:r>
+    </w:p>
+    <w:p>
+      <w:pPr>
+        <w:spacing w:after="120"/>
+      </w:pPr>
+      <w:r>
+        <w:rPr>
+          <w:b w:val="false"/>
+          <w:bCs w:val="false"/>
+          <w:i w:val="false"/>
+          <w:iCs w:val="false"/>
+          <w:sz w:val="20"/>
+          <w:szCs w:val="20"/>
+        </w:rPr>
+        <w:t xml:space="preserve">pino (structured JSON logging, chosen over winston for speed and because redaction is the feature we actually need), pino-http (installed, not yet wired), pino-pretty (devDependency — development-only terminal formatting).</w:t>
+      </w:r>
+    </w:p>
+    <w:p>
+      <w:pPr>
+        <w:pStyle w:val="Heading3"/>
+        <w:spacing w:after="80" w:before="200"/>
+      </w:pPr>
+      <w:r>
+        <w:rPr>
+          <w:b/>
+          <w:bCs/>
+          <w:color w:val="8A6D1F"/>
+          <w:sz w:val="21"/>
+          <w:szCs w:val="21"/>
+        </w:rPr>
+        <w:t xml:space="preserve">7 · Functions in this file</w:t>
+      </w:r>
+    </w:p>
+    <w:p>
+      <w:pPr>
+        <w:spacing w:after="120"/>
+      </w:pPr>
+      <w:r>
+        <w:rPr>
+          <w:b w:val="false"/>
+          <w:bCs w:val="false"/>
+          <w:i w:val="false"/>
+          <w:iCs w:val="false"/>
+          <w:sz w:val="20"/>
+          <w:szCs w:val="20"/>
+        </w:rPr>
+        <w:t xml:space="preserve">componentLogger(component) — returns logger.child({ component }). The module body runs once at import, constructing the logger and opening its transport, a deliberate side effect on import like env.ts.</w:t>
+      </w:r>
+    </w:p>
+    <w:p>
+      <w:pPr>
+        <w:pStyle w:val="Heading3"/>
+        <w:spacing w:after="80" w:before="200"/>
+      </w:pPr>
+      <w:r>
+        <w:rPr>
+          <w:b/>
+          <w:bCs/>
+          <w:color w:val="8A6D1F"/>
+          <w:sz w:val="21"/>
+          <w:szCs w:val="21"/>
+        </w:rPr>
+        <w:t xml:space="preserve">8 · Technical terms introduced</w:t>
+      </w:r>
+    </w:p>
+    <w:p>
+      <w:pPr>
+        <w:spacing w:after="120"/>
+      </w:pPr>
+      <w:r>
+        <w:rPr>
+          <w:b w:val="false"/>
+          <w:bCs w:val="false"/>
+          <w:i w:val="false"/>
+          <w:iCs w:val="false"/>
+          <w:sz w:val="20"/>
+          <w:szCs w:val="20"/>
+        </w:rPr>
+        <w:t xml:space="preserve">structured logging · log level · redaction · child logger · transport · NDJSON · serialiser · non-enumerable property · spread-a-conditional-object</w:t>
+      </w:r>
+    </w:p>
+    <w:p>
+      <w:pPr>
+        <w:pStyle w:val="Heading3"/>
+        <w:spacing w:after="80" w:before="200"/>
+      </w:pPr>
+      <w:r>
+        <w:rPr>
+          <w:b/>
+          <w:bCs/>
+          <w:color w:val="8A6D1F"/>
+          <w:sz w:val="21"/>
+          <w:szCs w:val="21"/>
+        </w:rPr>
+        <w:t xml:space="preserve">9 · Why this approach and not another</w:t>
+      </w:r>
+    </w:p>
+    <w:p>
+      <w:pPr>
+        <w:pStyle w:val="ListParagraph"/>
+        <w:numPr>
+          <w:ilvl w:val="0"/>
+          <w:numId w:val="1"/>
+        </w:numPr>
+        <w:spacing w:after="60"/>
+      </w:pPr>
+      <w:r>
+        <w:rPr>
+          <w:b/>
+          <w:bCs/>
+          <w:sz w:val="20"/>
+          <w:szCs w:val="20"/>
+        </w:rPr>
+        <w:t xml:space="preserve">Redaction configured centrally over remembering at call sites</w:t>
+      </w:r>
+      <w:r>
+        <w:rPr>
+          <w:sz w:val="20"/>
+          <w:szCs w:val="20"/>
+        </w:rPr>
+        <w:t xml:space="preserve"> — the mistake being guarded against is forgetting. A config file updated once beats a discipline sustained across ninety files.</w:t>
+      </w:r>
+    </w:p>
+    <w:p>
+      <w:pPr>
+        <w:pStyle w:val="ListParagraph"/>
+        <w:numPr>
+          <w:ilvl w:val="0"/>
+          <w:numId w:val="1"/>
+        </w:numPr>
+        <w:spacing w:after="60"/>
+      </w:pPr>
+      <w:r>
+        <w:rPr>
+          <w:b/>
+          <w:bCs/>
+          <w:sz w:val="20"/>
+          <w:szCs w:val="20"/>
+        </w:rPr>
+        <w:t xml:space="preserve">More redaction paths than strictly necessary</w:t>
+      </w:r>
+      <w:r>
+        <w:rPr>
+          <w:sz w:val="20"/>
+          <w:szCs w:val="20"/>
+        </w:rPr>
+        <w:t xml:space="preserve"> — password, *.password and body.password overlap. Cheap, and the failure mode of missing one is a credential on disk.</w:t>
+      </w:r>
+    </w:p>
+    <w:p>
+      <w:pPr>
+        <w:pStyle w:val="ListParagraph"/>
+        <w:numPr>
+          <w:ilvl w:val="0"/>
+          <w:numId w:val="1"/>
+        </w:numPr>
+        <w:spacing w:after="60"/>
+      </w:pPr>
+      <w:r>
+        <w:rPr>
+          <w:b/>
+          <w:bCs/>
+          <w:sz w:val="20"/>
+          <w:szCs w:val="20"/>
+        </w:rPr>
+        <w:t xml:space="preserve">stdout over a file transport</w:t>
+      </w:r>
+      <w:r>
+        <w:rPr>
+          <w:sz w:val="20"/>
+          <w:szCs w:val="20"/>
+        </w:rPr>
+        <w:t xml:space="preserve"> — Twelve-Factor, and Docker already collects stdout. A file inside a container dies with the container and would need volume mounts and rotation.</w:t>
+      </w:r>
+    </w:p>
+    <w:p>
+      <w:pPr>
+        <w:pStyle w:val="ListParagraph"/>
+        <w:numPr>
+          <w:ilvl w:val="0"/>
+          <w:numId w:val="1"/>
+        </w:numPr>
+        <w:spacing w:after="60"/>
+      </w:pPr>
+      <w:r>
+        <w:rPr>
+          <w:b/>
+          <w:bCs/>
+          <w:sz w:val="20"/>
+          <w:szCs w:val="20"/>
+        </w:rPr>
+        <w:t xml:space="preserve">pino-pretty in development only</w:t>
+      </w:r>
+      <w:r>
+        <w:rPr>
+          <w:sz w:val="20"/>
+          <w:szCs w:val="20"/>
+        </w:rPr>
+        <w:t xml:space="preserve"> — not merely aesthetic — it runs in a worker thread and adds overhead, and log aggregators expect newline-delimited JSON, so pretty output would have to be re-parsed badly.</w:t>
+      </w:r>
+    </w:p>
+    <w:p>
+      <w:pPr>
+        <w:pStyle w:val="ListParagraph"/>
+        <w:numPr>
+          <w:ilvl w:val="0"/>
+          <w:numId w:val="1"/>
+        </w:numPr>
+        <w:spacing w:after="60"/>
+      </w:pPr>
+      <w:r>
+        <w:rPr>
+          <w:b/>
+          <w:bCs/>
+          <w:sz w:val="20"/>
+          <w:szCs w:val="20"/>
+        </w:rPr>
+        <w:t xml:space="preserve">ISO timestamps over pino's epoch-millis default</w:t>
+      </w:r>
+      <w:r>
+        <w:rPr>
+          <w:sz w:val="20"/>
+          <w:szCs w:val="20"/>
+        </w:rPr>
+        <w:t xml:space="preserve"> — the default exists because generating a number is faster and pino optimises hard for throughput, but at our volume 1758024293115 is simply not legible.</w:t>
+      </w:r>
+    </w:p>
+    <w:p>
+      <w:pPr>
+        <w:pStyle w:val="ListParagraph"/>
+        <w:numPr>
+          <w:ilvl w:val="0"/>
+          <w:numId w:val="1"/>
+        </w:numPr>
+        <w:spacing w:after="60"/>
+      </w:pPr>
+      <w:r>
+        <w:rPr>
+          <w:b/>
+          <w:bCs/>
+          <w:sz w:val="20"/>
+          <w:szCs w:val="20"/>
+        </w:rPr>
+        <w:t xml:space="preserve">One shared instance over a factory</w:t>
+      </w:r>
+      <w:r>
+        <w:rPr>
+          <w:sz w:val="20"/>
+          <w:szCs w:val="20"/>
+        </w:rPr>
+        <w:t xml:space="preserve"> — the transport should open once per process. Deliberately the opposite of createApp() at File 010, for a concrete reason rather than inconsistency.</w:t>
+      </w:r>
+    </w:p>
+    <w:p>
+      <w:pPr>
+        <w:pStyle w:val="ListParagraph"/>
+        <w:numPr>
+          <w:ilvl w:val="0"/>
+          <w:numId w:val="1"/>
+        </w:numPr>
+        <w:spacing w:after="60"/>
+      </w:pPr>
+      <w:r>
+        <w:rPr>
+          <w:b/>
+          <w:bCs/>
+          <w:sz w:val="20"/>
+          <w:szCs w:val="20"/>
+        </w:rPr>
+        <w:t xml:space="preserve">initModels()'s console.log left alone</w:t>
+      </w:r>
+      <w:r>
+        <w:rPr>
+          <w:sz w:val="20"/>
+          <w:szCs w:val="20"/>
+        </w:rPr>
+        <w:t xml:space="preserve"> — importing config/logger.ts into the model layer would mean a test that merely imports a model constructs a logger and opens a transport. One inconsistency is cheaper than that coupling.</w:t>
+      </w:r>
+    </w:p>
+    <w:p>
+      <w:pPr>
+        <w:pStyle w:val="Heading3"/>
+        <w:spacing w:after="80" w:before="200"/>
+      </w:pPr>
+      <w:r>
+        <w:rPr>
+          <w:b/>
+          <w:bCs/>
+          <w:color w:val="8A6D1F"/>
+          <w:sz w:val="21"/>
+          <w:szCs w:val="21"/>
+        </w:rPr>
+        <w:t xml:space="preserve">Two gotchas and an honest limit</w:t>
+      </w:r>
+    </w:p>
+    <w:p>
+      <w:pPr>
+        <w:pStyle w:val="ListParagraph"/>
+        <w:numPr>
+          <w:ilvl w:val="0"/>
+          <w:numId w:val="1"/>
+        </w:numPr>
+        <w:spacing w:after="60"/>
+      </w:pPr>
+      <w:r>
+        <w:rPr>
+          <w:sz w:val="20"/>
+          <w:szCs w:val="20"/>
+        </w:rPr>
+        <w:t xml:space="preserve">The signature is log.level(mergingObject, message) — the object comes *first*, the reverse of console.log. Getting it backwards produces “[object Object]” as the message text.</w:t>
+      </w:r>
+    </w:p>
+    <w:p>
+      <w:pPr>
+        <w:pStyle w:val="ListParagraph"/>
+        <w:numPr>
+          <w:ilvl w:val="0"/>
+          <w:numId w:val="1"/>
+        </w:numPr>
+        <w:spacing w:after="60"/>
+      </w:pPr>
+      <w:r>
+        <w:rPr>
+          <w:sz w:val="20"/>
+          <w:szCs w:val="20"/>
+        </w:rPr>
+        <w:t xml:space="preserve">The error key must be exactly `err` for the built-in serialiser to fire. { error: err } serialises as {} because Error's message and stack are non-enumerable properties, which JSON.stringify skips. Confirmed in testing, and it is the kind of thing that costs twenty confused minutes once.</w:t>
+      </w:r>
+    </w:p>
+    <w:p>
+      <w:pPr>
+        <w:pStyle w:val="ListParagraph"/>
+        <w:numPr>
+          <w:ilvl w:val="0"/>
+          <w:numId w:val="1"/>
+        </w:numPr>
+        <w:spacing w:after="60"/>
+      </w:pPr>
+      <w:r>
+        <w:rPr>
+          <w:sz w:val="20"/>
+          <w:szCs w:val="20"/>
+        </w:rPr>
+        <w:t xml:space="preserve">Redaction is **path-based, not value-based**. Log a token under a key not in the list and pino has no idea what it is. It is a safety net for the obvious mistakes, not a guarantee — the same honest framing as the AuditLog hooks at File 026. Demonstrated in testing with a `credential` key that was not redacted.</w:t>
+      </w:r>
+    </w:p>
+    <w:p>
+      <w:pPr>
+        <w:pStyle w:val="ListParagraph"/>
+        <w:numPr>
+          <w:ilvl w:val="0"/>
+          <w:numId w:val="1"/>
+        </w:numPr>
+        <w:spacing w:after="60"/>
+      </w:pPr>
+      <w:r>
+        <w:rPr>
+          <w:sz w:val="20"/>
+          <w:szCs w:val="20"/>
+        </w:rPr>
+        <w:t xml:space="preserve">Caught by checking rather than assuming: one console.error survived in connect.ts, in the disconnectDb function rather than with the three at the top. Select-String -Pattern “console\\.” across the changed files is a two-second check; “the type-check passed” does not catch it.</w:t>
+      </w:r>
+    </w:p>
+    <w:p>
+      <w:r>
+        <w:br w:type="page"/>
+      </w:r>
+    </w:p>
+    <w:p>
+      <w:pPr>
+        <w:pStyle w:val="Heading1"/>
+        <w:pBdr>
+          <w:bottom w:val="single" w:color="8A6D1F" w:sz="8" w:space="4"/>
+        </w:pBdr>
+        <w:spacing w:after="160" w:before="420"/>
+      </w:pPr>
+      <w:r>
+        <w:rPr>
+          <w:b/>
+          <w:bCs/>
+          <w:color w:val="1F3352"/>
+          <w:sz w:val="28"/>
+          <w:szCs w:val="28"/>
+        </w:rPr>
+        <w:t xml:space="preserve">File 033 — apps/api/src/utils/password.ts</w:t>
+      </w:r>
+    </w:p>
+    <w:p>
+      <w:pPr>
+        <w:pStyle w:val="Heading3"/>
+        <w:spacing w:after="80" w:before="200"/>
+      </w:pPr>
+      <w:r>
+        <w:rPr>
+          <w:b/>
+          <w:bCs/>
+          <w:color w:val="8A6D1F"/>
+          <w:sz w:val="21"/>
+          <w:szCs w:val="21"/>
+        </w:rPr>
+        <w:t xml:space="preserve">1 · Why this file exists</w:t>
+      </w:r>
+    </w:p>
+    <w:p>
+      <w:pPr>
+        <w:spacing w:after="120"/>
+      </w:pPr>
+      <w:r>
+        <w:rPr>
+          <w:b w:val="false"/>
+          <w:bCs w:val="false"/>
+          <w:i w:val="false"/>
+          <w:iCs w:val="false"/>
+          <w:sz w:val="20"/>
+          <w:szCs w:val="20"/>
+        </w:rPr>
+        <w:t xml:space="preserve">We cannot store passwords, only something that lets us *check* one. Plaintext means a leaked backup or a misconfigured bucket hands over every student's password — and because people reuse passwords, their email accounts too. A plain fast hash is not enough either: SHA-256 is deliberately fast, so a GPU computes billions per second and a dictionary attack recovers weak passwords in minutes. bcrypt is deliberately *slow* and its slowness is tunable.</w:t>
+      </w:r>
+    </w:p>
+    <w:p>
+      <w:pPr>
+        <w:pStyle w:val="Heading3"/>
+        <w:spacing w:after="80" w:before="200"/>
+      </w:pPr>
+      <w:r>
+        <w:rPr>
+          <w:b/>
+          <w:bCs/>
+          <w:color w:val="8A6D1F"/>
+          <w:sz w:val="21"/>
+          <w:szCs w:val="21"/>
+        </w:rPr>
+        <w:t xml:space="preserve">2 · Why it is a separate file</w:t>
+      </w:r>
+    </w:p>
+    <w:p>
+      <w:pPr>
+        <w:spacing w:after="120"/>
+      </w:pPr>
+      <w:r>
+        <w:rPr>
+          <w:b w:val="false"/>
+          <w:bCs w:val="false"/>
+          <w:i w:val="false"/>
+          <w:iCs w:val="false"/>
+          <w:sz w:val="20"/>
+          <w:szCs w:val="20"/>
+        </w:rPr>
+        <w:t xml:space="preserve">The File 020 argument — a model defines what a user *is*; hashing is a behaviour operating on one. In the model, every file importing User would pull in a native module and user.save() would become unpredictably slow in a way the call site cannot see. Separate from authController because these are pure functions with no HTTP, unit-testable without a request or a database.</w:t>
+      </w:r>
+    </w:p>
+    <w:p>
+      <w:pPr>
+        <w:pStyle w:val="Heading3"/>
+        <w:spacing w:after="80" w:before="200"/>
+      </w:pPr>
+      <w:r>
+        <w:rPr>
+          <w:b/>
+          <w:bCs/>
+          <w:color w:val="8A6D1F"/>
+          <w:sz w:val="21"/>
+          <w:szCs w:val="21"/>
+        </w:rPr>
+        <w:t xml:space="preserve">3 · What we do in this file</w:t>
+      </w:r>
+    </w:p>
+    <w:p>
+      <w:pPr>
+        <w:spacing w:after="120"/>
+      </w:pPr>
+      <w:r>
+        <w:rPr>
+          <w:b w:val="false"/>
+          <w:bCs w:val="false"/>
+          <w:i w:val="false"/>
+          <w:iCs w:val="false"/>
+          <w:sz w:val="20"/>
+          <w:szCs w:val="20"/>
+        </w:rPr>
+        <w:t xml:space="preserve">hashPassword (validates length in bytes, hashes at cost 12), verifyPassword (returns false rather than throwing on a malformed hash), fakeVerify (burns the same ~250ms against a throwaway hash), and needsRehash (reads the stored cost for future upgrades).</w:t>
+      </w:r>
+    </w:p>
+    <w:p>
+      <w:pPr>
+        <w:pStyle w:val="Heading3"/>
+        <w:spacing w:after="80" w:before="200"/>
+      </w:pPr>
+      <w:r>
+        <w:rPr>
+          <w:b/>
+          <w:bCs/>
+          <w:color w:val="8A6D1F"/>
+          <w:sz w:val="21"/>
+          <w:szCs w:val="21"/>
+        </w:rPr>
+        <w:t xml:space="preserve">4 · Changes made later</w:t>
+      </w:r>
+    </w:p>
+    <w:p>
+      <w:pPr>
+        <w:spacing w:after="120"/>
+      </w:pPr>
+      <w:r>
+        <w:rPr>
+          <w:b w:val="false"/>
+          <w:bCs w:val="false"/>
+          <w:i w:val="false"/>
+          <w:iCs w:val="false"/>
+          <w:sz w:val="20"/>
+          <w:szCs w:val="20"/>
+        </w:rPr>
+        <w:t xml:space="preserve">16 Sep 2026 — the seed's PLACEHOLDER_HASH became a real hash of “codeguard-dev-2026”, hashed once and reused for all 33 users. Later moved inside seed() after an audit found it at module scope, outside the error handler.</w:t>
+      </w:r>
+    </w:p>
+    <w:p>
+      <w:pPr>
+        <w:spacing w:after="160"/>
+        <w:ind w:left="360"/>
+      </w:pPr>
+      <w:r>
+        <w:rPr>
+          <w:i/>
+          <w:iCs/>
+          <w:color w:val="9A9A9A"/>
+          <w:sz w:val="19"/>
+          <w:szCs w:val="19"/>
+        </w:rPr>
+        <w:t xml:space="preserve">[ Date any later change to this file here. ]</w:t>
+      </w:r>
+    </w:p>
+    <w:p>
+      <w:pPr>
+        <w:pStyle w:val="Heading3"/>
+        <w:spacing w:after="80" w:before="200"/>
+      </w:pPr>
+      <w:r>
+        <w:rPr>
+          <w:b/>
+          <w:bCs/>
+          <w:color w:val="8A6D1F"/>
+          <w:sz w:val="21"/>
+          <w:szCs w:val="21"/>
+        </w:rPr>
+        <w:t xml:space="preserve">5 · Where it sits</w:t>
+      </w:r>
+    </w:p>
+    <w:p>
+      <w:pPr>
+        <w:spacing w:after="120"/>
+      </w:pPr>
+      <w:r>
+        <w:rPr>
+          <w:b w:val="false"/>
+          <w:bCs w:val="false"/>
+          <w:i w:val="false"/>
+          <w:iCs w:val="false"/>
+          <w:sz w:val="20"/>
+          <w:szCs w:val="20"/>
+        </w:rPr>
+        <w:t xml:space="preserve">apps/api/src/utils/password.ts, beside AppError.ts and jwt.ts. Used by the seed script, and by the auth controller from File 038.</w:t>
+      </w:r>
+    </w:p>
+    <w:p>
+      <w:pPr>
+        <w:pStyle w:val="Heading3"/>
+        <w:spacing w:after="80" w:before="200"/>
+      </w:pPr>
+      <w:r>
+        <w:rPr>
+          <w:b/>
+          <w:bCs/>
+          <w:color w:val="8A6D1F"/>
+          <w:sz w:val="21"/>
+          <w:szCs w:val="21"/>
+        </w:rPr>
+        <w:t xml:space="preserve">6 · Libraries used here</w:t>
+      </w:r>
+    </w:p>
+    <w:p>
+      <w:pPr>
+        <w:spacing w:after="120"/>
+      </w:pPr>
+      <w:r>
+        <w:rPr>
+          <w:b w:val="false"/>
+          <w:bCs w:val="false"/>
+          <w:i w:val="false"/>
+          <w:iCs w:val="false"/>
+          <w:sz w:val="20"/>
+          <w:szCs w:val="20"/>
+        </w:rPr>
+        <w:t xml:space="preserve">bcrypt, plus @types/bcrypt — verified against the published tarball that bcrypt ships no types of its own. This is the File 012 decision paying off: bcrypt is a native module whose prebuilt binaries target glibc, and node:22-bookworm-slim was chosen over Alpine specifically so it installs rather than compiling from source.</w:t>
+      </w:r>
+    </w:p>
+    <w:p>
+      <w:pPr>
+        <w:pStyle w:val="Heading3"/>
+        <w:spacing w:after="80" w:before="200"/>
+      </w:pPr>
+      <w:r>
+        <w:rPr>
+          <w:b/>
+          <w:bCs/>
+          <w:color w:val="8A6D1F"/>
+          <w:sz w:val="21"/>
+          <w:szCs w:val="21"/>
+        </w:rPr>
+        <w:t xml:space="preserve">7 · Functions in this file</w:t>
+      </w:r>
+    </w:p>
+    <w:p>
+      <w:pPr>
+        <w:spacing w:after="120"/>
+      </w:pPr>
+      <w:r>
+        <w:rPr>
+          <w:b w:val="false"/>
+          <w:bCs w:val="false"/>
+          <w:i w:val="false"/>
+          <w:iCs w:val="false"/>
+          <w:sz w:val="20"/>
+          <w:szCs w:val="20"/>
+        </w:rPr>
+        <w:t xml:space="preserve">hashPassword(plain) — ~250ms, deliberately. Throws AppError.validation outside 8 characters to 72 bytes.</w:t>
+      </w:r>
+    </w:p>
+    <w:p>
+      <w:pPr>
+        <w:spacing w:after="120"/>
+      </w:pPr>
+      <w:r>
+        <w:rPr>
+          <w:b w:val="false"/>
+          <w:bCs w:val="false"/>
+          <w:i w:val="false"/>
+          <w:iCs w:val="false"/>
+          <w:sz w:val="20"/>
+          <w:szCs w:val="20"/>
+        </w:rPr>
+        <w:t xml:space="preserve">verifyPassword(plain, hash) — returns boolean; a malformed hash returns false rather than throwing.</w:t>
+      </w:r>
+    </w:p>
+    <w:p>
+      <w:pPr>
+        <w:spacing w:after="120"/>
+      </w:pPr>
+      <w:r>
+        <w:rPr>
+          <w:b w:val="false"/>
+          <w:bCs w:val="false"/>
+          <w:i w:val="false"/>
+          <w:iCs w:val="false"/>
+          <w:sz w:val="20"/>
+          <w:szCs w:val="20"/>
+        </w:rPr>
+        <w:t xml:space="preserve">fakeVerify() — runs a real comparison against a dummy hash computed once at module load.</w:t>
+      </w:r>
+    </w:p>
+    <w:p>
+      <w:pPr>
+        <w:spacing w:after="120"/>
+      </w:pPr>
+      <w:r>
+        <w:rPr>
+          <w:b w:val="false"/>
+          <w:bCs w:val="false"/>
+          <w:i w:val="false"/>
+          <w:iCs w:val="false"/>
+          <w:sz w:val="20"/>
+          <w:szCs w:val="20"/>
+        </w:rPr>
+        <w:t xml:space="preserve">needsRehash(hash) — bcrypt.getRounds(hash) &lt; COST_FACTOR; returns true on a malformed hash.</w:t>
+      </w:r>
+    </w:p>
+    <w:p>
+      <w:pPr>
+        <w:pStyle w:val="Heading3"/>
+        <w:spacing w:after="80" w:before="200"/>
+      </w:pPr>
+      <w:r>
+        <w:rPr>
+          <w:b/>
+          <w:bCs/>
+          <w:color w:val="8A6D1F"/>
+          <w:sz w:val="21"/>
+          <w:szCs w:val="21"/>
+        </w:rPr>
+        <w:t xml:space="preserve">8 · Technical terms introduced</w:t>
+      </w:r>
+    </w:p>
+    <w:p>
+      <w:pPr>
+        <w:spacing w:after="120"/>
+      </w:pPr>
+      <w:r>
+        <w:rPr>
+          <w:b w:val="false"/>
+          <w:bCs w:val="false"/>
+          <w:i w:val="false"/>
+          <w:iCs w:val="false"/>
+          <w:sz w:val="20"/>
+          <w:szCs w:val="20"/>
+        </w:rPr>
+        <w:t xml:space="preserve">hash function · salt · rainbow table · work factor / cost · adaptive hashing · memory-hard function · timing attack · constant-time comparison · hashSync · transparent rehashing · k-anonymity</w:t>
+      </w:r>
+    </w:p>
+    <w:p>
+      <w:pPr>
+        <w:pStyle w:val="Heading3"/>
+        <w:spacing w:after="80" w:before="200"/>
+      </w:pPr>
+      <w:r>
+        <w:rPr>
+          <w:b/>
+          <w:bCs/>
+          <w:color w:val="8A6D1F"/>
+          <w:sz w:val="21"/>
+          <w:szCs w:val="21"/>
+        </w:rPr>
+        <w:t xml:space="preserve">9 · Why this approach and not another</w:t>
+      </w:r>
+    </w:p>
+    <w:p>
+      <w:pPr>
+        <w:pStyle w:val="ListParagraph"/>
+        <w:numPr>
+          <w:ilvl w:val="0"/>
+          <w:numId w:val="1"/>
+        </w:numPr>
+        <w:spacing w:after="60"/>
+      </w:pPr>
+      <w:r>
+        <w:rPr>
+          <w:b/>
+          <w:bCs/>
+          <w:sz w:val="20"/>
+          <w:szCs w:val="20"/>
+        </w:rPr>
+        <w:t xml:space="preserve">Cost factor 12</w:t>
+      </w:r>
+      <w:r>
+        <w:rPr>
+          <w:sz w:val="20"/>
+          <w:szCs w:val="20"/>
+        </w:rPr>
+        <w:t xml:space="preserve"> — bcrypt's cost is exponential — 2^cost iterations — so roughly 65ms at 10, 250ms at 12, 1s at 14. Higher is not free: the cost falls on *our* server on every login, so at 14 thirty students logging in at 9am is thirty seconds of CPU and a denial-of-service vector. Lower quadruples an attacker's throughput.</w:t>
+      </w:r>
+    </w:p>
+    <w:p>
+      <w:pPr>
+        <w:pStyle w:val="ListParagraph"/>
+        <w:numPr>
+          <w:ilvl w:val="0"/>
+          <w:numId w:val="1"/>
+        </w:numPr>
+        <w:spacing w:after="60"/>
+      </w:pPr>
+      <w:r>
+        <w:rPr>
+          <w:b/>
+          <w:bCs/>
+          <w:sz w:val="20"/>
+          <w:szCs w:val="20"/>
+        </w:rPr>
+        <w:t xml:space="preserve">Reject over 72 bytes rather than truncating</w:t>
+      </w:r>
+      <w:r>
+        <w:rPr>
+          <w:sz w:val="20"/>
+          <w:szCs w:val="20"/>
+        </w:rPr>
+        <w:t xml:space="preserve"> — bcrypt silently *ignores* anything past 72 — it truncates rather than erroring — so a user with a 100-character passphrase would have only the first 72 bytes checked and anyone knowing those could log in with any suffix.</w:t>
+      </w:r>
+    </w:p>
+    <w:p>
+      <w:pPr>
+        <w:pStyle w:val="ListParagraph"/>
+        <w:numPr>
+          <w:ilvl w:val="0"/>
+          <w:numId w:val="1"/>
+        </w:numPr>
+        <w:spacing w:after="60"/>
+      </w:pPr>
+      <w:r>
+        <w:rPr>
+          <w:b/>
+          <w:bCs/>
+          <w:sz w:val="20"/>
+          <w:szCs w:val="20"/>
+        </w:rPr>
+        <w:t xml:space="preserve">Buffer.byteLength, not .length</w:t>
+      </w:r>
+      <w:r>
+        <w:rPr>
+          <w:sz w:val="20"/>
+          <w:szCs w:val="20"/>
+        </w:rPr>
+        <w:t xml:space="preserve"> — bcrypt's limit is in *bytes* while a JavaScript string's length counts UTF-16 code units. An emoji is four bytes and most Devanagari characters are three — directly relevant for an Indian university. Confirmed: 73 ASCII bytes rejected, 57 Devanagari bytes accepted, 25 emoji (100 bytes) rejected.</w:t>
+      </w:r>
+    </w:p>
+    <w:p>
+      <w:pPr>
+        <w:pStyle w:val="ListParagraph"/>
+        <w:numPr>
+          <w:ilvl w:val="0"/>
+          <w:numId w:val="1"/>
+        </w:numPr>
+        <w:spacing w:after="60"/>
+      </w:pPr>
+      <w:r>
+        <w:rPr>
+          <w:b/>
+          <w:bCs/>
+          <w:sz w:val="20"/>
+          <w:szCs w:val="20"/>
+        </w:rPr>
+        <w:t xml:space="preserve">verifyPassword returns false on a malformed hash</w:t>
+      </w:r>
+      <w:r>
+        <w:rPr>
+          <w:sz w:val="20"/>
+          <w:szCs w:val="20"/>
+        </w:rPr>
+        <w:t xml:space="preserve"> — a corrupted record producing a 500 while a wrong password produces a 401 would identify which accounts have bad data — a form of the same enumeration leak.</w:t>
+      </w:r>
+    </w:p>
+    <w:p>
+      <w:pPr>
+        <w:pStyle w:val="ListParagraph"/>
+        <w:numPr>
+          <w:ilvl w:val="0"/>
+          <w:numId w:val="1"/>
+        </w:numPr>
+        <w:spacing w:after="60"/>
+      </w:pPr>
+      <w:r>
+        <w:rPr>
+          <w:b/>
+          <w:bCs/>
+          <w:sz w:val="20"/>
+          <w:szCs w:val="20"/>
+        </w:rPr>
+        <w:t xml:space="preserve">Length-only validation, no composition rules</w:t>
+      </w:r>
+      <w:r>
+        <w:rPr>
+          <w:sz w:val="20"/>
+          <w:szCs w:val="20"/>
+        </w:rPr>
+        <w:t xml:space="preserve"> — current NIST guidance advises against “must contain a symbol” requirements — they push users toward Password1! rather than genuine entropy, and length matters far more.</w:t>
+      </w:r>
+    </w:p>
+    <w:p>
+      <w:pPr>
+        <w:pStyle w:val="ListParagraph"/>
+        <w:numPr>
+          <w:ilvl w:val="0"/>
+          <w:numId w:val="1"/>
+        </w:numPr>
+        <w:spacing w:after="60"/>
+      </w:pPr>
+      <w:r>
+        <w:rPr>
+          <w:b/>
+          <w:bCs/>
+          <w:sz w:val="20"/>
+          <w:szCs w:val="20"/>
+        </w:rPr>
+        <w:t xml:space="preserve">**argon2 is the technically better choice**</w:t>
+      </w:r>
+      <w:r>
+        <w:rPr>
+          <w:sz w:val="20"/>
+          <w:szCs w:val="20"/>
+        </w:rPr>
+        <w:t xml:space="preserve"> — argon2id won the 2015 Password Hashing Competition and is memory-hard. bcrypt was chosen for two decades of deployment without a practical break, better ecosystem support, and one tunable parameter rather than three interacting ones. Name it in the report as a considered trade-off, not an oversight.</w:t>
+      </w:r>
+    </w:p>
+    <w:p>
+      <w:pPr>
+        <w:pStyle w:val="Heading3"/>
+        <w:spacing w:after="80" w:before="200"/>
+      </w:pPr>
+      <w:r>
+        <w:rPr>
+          <w:b/>
+          <w:bCs/>
+          <w:color w:val="8A6D1F"/>
+          <w:sz w:val="21"/>
+          <w:szCs w:val="21"/>
+        </w:rPr>
+        <w:t xml:space="preserve">No salt field, and the timing leak closed</w:t>
+      </w:r>
+    </w:p>
+    <w:p>
+      <w:pPr>
+        <w:pStyle w:val="ListParagraph"/>
+        <w:numPr>
+          <w:ilvl w:val="0"/>
+          <w:numId w:val="1"/>
+        </w:numPr>
+        <w:spacing w:after="60"/>
+      </w:pPr>
+      <w:r>
+        <w:rPr>
+          <w:sz w:val="20"/>
+          <w:szCs w:val="20"/>
+        </w:rPr>
+        <w:t xml:space="preserve">There is no separate salt column, and that is not an oversight. A salt is random data mixed in before hashing so two users with the same password get different hashes, defeating precomputed rainbow tables. bcrypt generates one per call and *embeds* it in the output along with the algorithm variant and the cost: $2b$12$&lt;22-char salt&gt;&lt;digest&gt;. So compare() reads the cost from the stored hash rather than being told it, and raising COST_FACTOR tomorrow leaves every existing password verifiable.</w:t>
+      </w:r>
+    </w:p>
+    <w:p>
+      <w:pPr>
+        <w:pStyle w:val="ListParagraph"/>
+        <w:numPr>
+          <w:ilvl w:val="0"/>
+          <w:numId w:val="1"/>
+        </w:numPr>
+        <w:spacing w:after="60"/>
+      </w:pPr>
+      <w:r>
+        <w:rPr>
+          <w:sz w:val="20"/>
+          <w:szCs w:val="20"/>
+        </w:rPr>
+        <w:t xml:space="preserve">fakeVerify closes the timing leak flagged at File 030. The vague “Authentication required” message stops an attacker *reading* which emails exist, but a naive login still leaks it by timing: an unknown email returns in ~5ms while a wrong password takes ~255ms, because only the second runs bcrypt. That gap is trivially measurable over a network, so scripting a few thousand addresses yields a clean list of registered accounts and the vague message buys nothing.</w:t>
+      </w:r>
+    </w:p>
+    <w:p>
+      <w:pPr>
+        <w:pStyle w:val="ListParagraph"/>
+        <w:numPr>
+          <w:ilvl w:val="0"/>
+          <w:numId w:val="1"/>
+        </w:numPr>
+        <w:spacing w:after="60"/>
+      </w:pPr>
+      <w:r>
+        <w:rPr>
+          <w:sz w:val="20"/>
+          <w:szCs w:val="20"/>
+        </w:rPr>
+        <w:t xml:space="preserve">The dummy hash is computed with hashSync once at module load — blocking is acceptable there precisely because it is before the server accepts requests, and would be a serious mistake anywhere else.</w:t>
+      </w:r>
+    </w:p>
+    <w:p>
+      <w:pPr>
+        <w:pStyle w:val="ListParagraph"/>
+        <w:numPr>
+          <w:ilvl w:val="0"/>
+          <w:numId w:val="1"/>
+        </w:numPr>
+        <w:spacing w:after="60"/>
+      </w:pPr>
+      <w:r>
+        <w:rPr>
+          <w:sz w:val="20"/>
+          <w:szCs w:val="20"/>
+        </w:rPr>
+        <w:t xml:space="preserve">Honest limitation: fakeVerify equalises the *bcrypt* cost, not the *database* cost. A findOne that misses may be marginally faster than one that hits. That residual is low single-digit milliseconds against a 250ms baseline, far below network noise, but the report should say so rather than claiming the leak is fully closed.</w:t>
+      </w:r>
+    </w:p>
+    <w:p>
+      <w:pPr>
+        <w:pStyle w:val="ListParagraph"/>
+        <w:numPr>
+          <w:ilvl w:val="0"/>
+          <w:numId w:val="1"/>
+        </w:numPr>
+        <w:spacing w:after="60"/>
+      </w:pPr>
+      <w:r>
+        <w:rPr>
+          <w:sz w:val="20"/>
+          <w:szCs w:val="20"/>
+        </w:rPr>
+        <w:t xml:space="preserve">Future work named: breach-list checking via Have I Been Pwned's k-anonymity API would catch known-compromised passwords. Rejected for now as an external HTTP dependency on the registration path.</w:t>
+      </w:r>
+    </w:p>
+    <w:p>
+      <w:r>
+        <w:br w:type="page"/>
+      </w:r>
+    </w:p>
+    <w:p>
+      <w:pPr>
+        <w:pStyle w:val="Heading1"/>
+        <w:pBdr>
+          <w:bottom w:val="single" w:color="8A6D1F" w:sz="8" w:space="4"/>
+        </w:pBdr>
+        <w:spacing w:after="160" w:before="420"/>
+      </w:pPr>
+      <w:r>
+        <w:rPr>
+          <w:b/>
+          <w:bCs/>
+          <w:color w:val="1F3352"/>
+          <w:sz w:val="28"/>
+          <w:szCs w:val="28"/>
+        </w:rPr>
+        <w:t xml:space="preserve">File 034 — apps/api/src/utils/jwt.ts</w:t>
+      </w:r>
+    </w:p>
+    <w:p>
+      <w:pPr>
+        <w:pStyle w:val="Heading3"/>
+        <w:spacing w:after="80" w:before="200"/>
+      </w:pPr>
+      <w:r>
+        <w:rPr>
+          <w:b/>
+          <w:bCs/>
+          <w:color w:val="8A6D1F"/>
+          <w:sz w:val="21"/>
+          <w:szCs w:val="21"/>
+        </w:rPr>
+        <w:t xml:space="preserve">1 · Why this file exists</w:t>
+      </w:r>
+    </w:p>
+    <w:p>
+      <w:pPr>
+        <w:spacing w:after="120"/>
+      </w:pPr>
+      <w:r>
+        <w:rPr>
+          <w:b w:val="false"/>
+          <w:bCs w:val="false"/>
+          <w:i w:val="false"/>
+          <w:iCs w:val="false"/>
+          <w:sz w:val="20"/>
+          <w:szCs w:val="20"/>
+        </w:rPr>
+        <w:t xml:space="preserve">HTTP is stateless, so something must let a request say “I am Sam, and I logged in.” A server-side session stores { sessionId -&gt; userId } and costs a lookup per request; a JWT carries the claims inside itself, signed so they cannot be altered, so the server reads the user id straight out. That matters here because the spec requires one API serving both a React app and an Android app — a token in an Authorization header works identically for both, while cookie sessions are a browser mechanism.</w:t>
+      </w:r>
+    </w:p>
+    <w:p>
+      <w:pPr>
+        <w:pStyle w:val="Heading3"/>
+        <w:spacing w:after="80" w:before="200"/>
+      </w:pPr>
+      <w:r>
+        <w:rPr>
+          <w:b/>
+          <w:bCs/>
+          <w:color w:val="8A6D1F"/>
+          <w:sz w:val="21"/>
+          <w:szCs w:val="21"/>
+        </w:rPr>
+        <w:t xml:space="preserve">2 · Why it is a separate file</w:t>
+      </w:r>
+    </w:p>
+    <w:p>
+      <w:pPr>
+        <w:spacing w:after="120"/>
+      </w:pPr>
+      <w:r>
+        <w:rPr>
+          <w:b w:val="false"/>
+          <w:bCs w:val="false"/>
+          <w:i w:val="false"/>
+          <w:iCs w:val="false"/>
+          <w:sz w:val="20"/>
+          <w:szCs w:val="20"/>
+        </w:rPr>
+        <w:t xml:space="preserve">Separate from middleware/auth.ts by concern — this answers “is this token valid and what does it say?”, a pure function over a string, while the middleware answers “should this request proceed?”, which involves req, res and HTTP semantics. That split lets us unit-test expiry, tampering and type confusion with no HTTP request, the same reasoning as password.ts. Separate from authController because the controller *composes* these.</w:t>
+      </w:r>
+    </w:p>
+    <w:p>
+      <w:pPr>
+        <w:pStyle w:val="Heading3"/>
+        <w:spacing w:after="80" w:before="200"/>
+      </w:pPr>
+      <w:r>
+        <w:rPr>
+          <w:b/>
+          <w:bCs/>
+          <w:color w:val="8A6D1F"/>
+          <w:sz w:val="21"/>
+          <w:szCs w:val="21"/>
+        </w:rPr>
+        <w:t xml:space="preserve">3 · What we do in this file</w:t>
+      </w:r>
+    </w:p>
+    <w:p>
+      <w:pPr>
+        <w:spacing w:after="120"/>
+      </w:pPr>
+      <w:r>
+        <w:rPr>
+          <w:b w:val="false"/>
+          <w:bCs w:val="false"/>
+          <w:i w:val="false"/>
+          <w:iCs w:val="false"/>
+          <w:sz w:val="20"/>
+          <w:szCs w:val="20"/>
+        </w:rPr>
+        <w:t xml:space="preserve">signAccessToken and signRefreshToken with separate secrets, HS256 with the algorithm pinned on verify, registered claims (sub, iss, aud, exp, jti) plus private role and type claims, error translation into AppError, and a bearer-header parser.</w:t>
+      </w:r>
+    </w:p>
+    <w:p>
+      <w:pPr>
+        <w:pStyle w:val="Heading3"/>
+        <w:spacing w:after="80" w:before="200"/>
+      </w:pPr>
+      <w:r>
+        <w:rPr>
+          <w:b/>
+          <w:bCs/>
+          <w:color w:val="8A6D1F"/>
+          <w:sz w:val="21"/>
+          <w:szCs w:val="21"/>
+        </w:rPr>
+        <w:t xml:space="preserve">4 · Changes made later</w:t>
+      </w:r>
+    </w:p>
+    <w:p>
+      <w:pPr>
+        <w:spacing w:after="120"/>
+      </w:pPr>
+      <w:r>
+        <w:rPr>
+          <w:b w:val="false"/>
+          <w:bCs w:val="false"/>
+          <w:i w:val="false"/>
+          <w:iCs w:val="false"/>
+          <w:sz w:val="20"/>
+          <w:szCs w:val="20"/>
+        </w:rPr>
+        <w:t xml:space="preserve">16 Sep 2026 — required a revisit to User.ts adding `export const ROLES = [...] as const` and `export type Role`, the inconsistency noticed at File 022 when Assignment.ts exported LANGUAGES the same way.</w:t>
+      </w:r>
+    </w:p>
+    <w:p>
+      <w:pPr>
+        <w:spacing w:after="160"/>
+        <w:ind w:left="360"/>
+      </w:pPr>
+      <w:r>
+        <w:rPr>
+          <w:i/>
+          <w:iCs/>
+          <w:color w:val="9A9A9A"/>
+          <w:sz w:val="19"/>
+          <w:szCs w:val="19"/>
+        </w:rPr>
+        <w:t xml:space="preserve">[ Date any later change to this file here. ]</w:t>
+      </w:r>
+    </w:p>
+    <w:p>
+      <w:pPr>
+        <w:pStyle w:val="Heading3"/>
+        <w:spacing w:after="80" w:before="200"/>
+      </w:pPr>
+      <w:r>
+        <w:rPr>
+          <w:b/>
+          <w:bCs/>
+          <w:color w:val="8A6D1F"/>
+          <w:sz w:val="21"/>
+          <w:szCs w:val="21"/>
+        </w:rPr>
+        <w:t xml:space="preserve">5 · Where it sits</w:t>
+      </w:r>
+    </w:p>
+    <w:p>
+      <w:pPr>
+        <w:spacing w:after="120"/>
+      </w:pPr>
+      <w:r>
+        <w:rPr>
+          <w:b w:val="false"/>
+          <w:bCs w:val="false"/>
+          <w:i w:val="false"/>
+          <w:iCs w:val="false"/>
+          <w:sz w:val="20"/>
+          <w:szCs w:val="20"/>
+        </w:rPr>
+        <w:t xml:space="preserve">apps/api/src/utils/jwt.ts, beside AppError.ts and password.ts. Used by middleware/auth.ts and by the auth controller from File 038.</w:t>
+      </w:r>
+    </w:p>
+    <w:p>
+      <w:pPr>
+        <w:pStyle w:val="Heading3"/>
+        <w:spacing w:after="80" w:before="200"/>
+      </w:pPr>
+      <w:r>
+        <w:rPr>
+          <w:b/>
+          <w:bCs/>
+          <w:color w:val="8A6D1F"/>
+          <w:sz w:val="21"/>
+          <w:szCs w:val="21"/>
+        </w:rPr>
+        <w:t xml:space="preserve">6 · Libraries used here</w:t>
+      </w:r>
+    </w:p>
+    <w:p>
+      <w:pPr>
+        <w:spacing w:after="120"/>
+      </w:pPr>
+      <w:r>
+        <w:rPr>
+          <w:b w:val="false"/>
+          <w:bCs w:val="false"/>
+          <w:i w:val="false"/>
+          <w:iCs w:val="false"/>
+          <w:sz w:val="20"/>
+          <w:szCs w:val="20"/>
+        </w:rPr>
+        <w:t xml:space="preserve">jsonwebtoken, plus @types/jsonwebtoken — verified that the package ships no types of its own, the same situation as bcrypt. Chosen over jose, which is more modern and supports the full JOSE suite including encryption, because jsonwebtoken is the ecosystem standard and we need none of the extra surface.</w:t>
+      </w:r>
+    </w:p>
+    <w:p>
+      <w:pPr>
+        <w:pStyle w:val="Heading3"/>
+        <w:spacing w:after="80" w:before="200"/>
+      </w:pPr>
+      <w:r>
+        <w:rPr>
+          <w:b/>
+          <w:bCs/>
+          <w:color w:val="8A6D1F"/>
+          <w:sz w:val="21"/>
+          <w:szCs w:val="21"/>
+        </w:rPr>
+        <w:t xml:space="preserve">7 · Functions in this file</w:t>
+      </w:r>
+    </w:p>
+    <w:p>
+      <w:pPr>
+        <w:spacing w:after="120"/>
+      </w:pPr>
+      <w:r>
+        <w:rPr>
+          <w:b w:val="false"/>
+          <w:bCs w:val="false"/>
+          <w:i w:val="false"/>
+          <w:iCs w:val="false"/>
+          <w:sz w:val="20"/>
+          <w:szCs w:val="20"/>
+        </w:rPr>
+        <w:t xml:space="preserve">signAccessToken({ userId, role }) — 15-minute HS256 token.</w:t>
+      </w:r>
+    </w:p>
+    <w:p>
+      <w:pPr>
+        <w:spacing w:after="120"/>
+      </w:pPr>
+      <w:r>
+        <w:rPr>
+          <w:b w:val="false"/>
+          <w:bCs w:val="false"/>
+          <w:i w:val="false"/>
+          <w:iCs w:val="false"/>
+          <w:sz w:val="20"/>
+          <w:szCs w:val="20"/>
+        </w:rPr>
+        <w:t xml:space="preserve">signRefreshToken({ userId, role }) — returns { token, jti }, 7 days. The jti is returned so the caller can store it for revocation without decoding the token again.</w:t>
+      </w:r>
+    </w:p>
+    <w:p>
+      <w:pPr>
+        <w:spacing w:after="120"/>
+      </w:pPr>
+      <w:r>
+        <w:rPr>
+          <w:b w:val="false"/>
+          <w:bCs w:val="false"/>
+          <w:i w:val="false"/>
+          <w:iCs w:val="false"/>
+          <w:sz w:val="20"/>
+          <w:szCs w:val="20"/>
+        </w:rPr>
+        <w:t xml:space="preserve">verify(token, secret, expected) — private. Checks signature, algorithm, issuer, audience and expiry, then the type claim and required fields.</w:t>
+      </w:r>
+    </w:p>
+    <w:p>
+      <w:pPr>
+        <w:spacing w:after="120"/>
+      </w:pPr>
+      <w:r>
+        <w:rPr>
+          <w:b w:val="false"/>
+          <w:bCs w:val="false"/>
+          <w:i w:val="false"/>
+          <w:iCs w:val="false"/>
+          <w:sz w:val="20"/>
+          <w:szCs w:val="20"/>
+        </w:rPr>
+        <w:t xml:space="preserve">verifyAccessToken / verifyRefreshToken — thin wrappers binding the right secret and expected type.</w:t>
+      </w:r>
+    </w:p>
+    <w:p>
+      <w:pPr>
+        <w:spacing w:after="120"/>
+      </w:pPr>
+      <w:r>
+        <w:rPr>
+          <w:b w:val="false"/>
+          <w:bCs w:val="false"/>
+          <w:i w:val="false"/>
+          <w:iCs w:val="false"/>
+          <w:sz w:val="20"/>
+          <w:szCs w:val="20"/>
+        </w:rPr>
+        <w:t xml:space="preserve">extractBearerToken(header) — returns the token or null, never throws, so policy belongs to the middleware.</w:t>
+      </w:r>
+    </w:p>
+    <w:p>
+      <w:pPr>
+        <w:pStyle w:val="Heading3"/>
+        <w:spacing w:after="80" w:before="200"/>
+      </w:pPr>
+      <w:r>
+        <w:rPr>
+          <w:b/>
+          <w:bCs/>
+          <w:color w:val="8A6D1F"/>
+          <w:sz w:val="21"/>
+          <w:szCs w:val="21"/>
+        </w:rPr>
+        <w:t xml:space="preserve">8 · Technical terms introduced</w:t>
+      </w:r>
+    </w:p>
+    <w:p>
+      <w:pPr>
+        <w:spacing w:after="120"/>
+      </w:pPr>
+      <w:r>
+        <w:rPr>
+          <w:b w:val="false"/>
+          <w:bCs w:val="false"/>
+          <w:i w:val="false"/>
+          <w:iCs w:val="false"/>
+          <w:sz w:val="20"/>
+          <w:szCs w:val="20"/>
+        </w:rPr>
+        <w:t xml:space="preserve">JWT · claim · registered claims · HMAC · symmetric vs asymmetric signing · alg:none attack · algorithm confusion attack · token type confusion · bearer token · deny-list · TTL · satisfies</w:t>
+      </w:r>
+    </w:p>
+    <w:p>
+      <w:pPr>
+        <w:pStyle w:val="Heading3"/>
+        <w:spacing w:after="80" w:before="200"/>
+      </w:pPr>
+      <w:r>
+        <w:rPr>
+          <w:b/>
+          <w:bCs/>
+          <w:color w:val="8A6D1F"/>
+          <w:sz w:val="21"/>
+          <w:szCs w:val="21"/>
+        </w:rPr>
+        <w:t xml:space="preserve">9 · Why this approach and not another</w:t>
+      </w:r>
+    </w:p>
+    <w:p>
+      <w:pPr>
+        <w:pStyle w:val="ListParagraph"/>
+        <w:numPr>
+          <w:ilvl w:val="0"/>
+          <w:numId w:val="1"/>
+        </w:numPr>
+        <w:spacing w:after="60"/>
+      </w:pPr>
+      <w:r>
+        <w:rPr>
+          <w:b/>
+          <w:bCs/>
+          <w:sz w:val="20"/>
+          <w:szCs w:val="20"/>
+        </w:rPr>
+        <w:t xml:space="preserve">HS256 rather than RS256</w:t>
+      </w:r>
+      <w:r>
+        <w:rPr>
+          <w:sz w:val="20"/>
+          <w:szCs w:val="20"/>
+        </w:rPr>
+        <w:t xml:space="preserve"> — asymmetric signing matters when a *separate* service must verify without being able to sign; our detector never verifies tokens and only our API does either. One fewer key to distribute.</w:t>
+      </w:r>
+    </w:p>
+    <w:p>
+      <w:pPr>
+        <w:pStyle w:val="ListParagraph"/>
+        <w:numPr>
+          <w:ilvl w:val="0"/>
+          <w:numId w:val="1"/>
+        </w:numPr>
+        <w:spacing w:after="60"/>
+      </w:pPr>
+      <w:r>
+        <w:rPr>
+          <w:b/>
+          <w:bCs/>
+          <w:sz w:val="20"/>
+          <w:szCs w:val="20"/>
+        </w:rPr>
+        <w:t xml:space="preserve">A type claim as well as separate secrets</w:t>
+      </w:r>
+      <w:r>
+        <w:rPr>
+          <w:sz w:val="20"/>
+          <w:szCs w:val="20"/>
+        </w:rPr>
+        <w:t xml:space="preserve"> — a refresh token lives 7 days while an access token lives 15 minutes, so without a type check a stolen refresh token presented as an access token turns a 15-minute exposure into a 7-day one. Separate secrets already prevent this, but the type check still holds if the two were ever accidentally set identical. Same defence-in-depth as select: false plus the toJSON transform.</w:t>
+      </w:r>
+    </w:p>
+    <w:p>
+      <w:pPr>
+        <w:pStyle w:val="ListParagraph"/>
+        <w:numPr>
+          <w:ilvl w:val="0"/>
+          <w:numId w:val="1"/>
+        </w:numPr>
+        <w:spacing w:after="60"/>
+      </w:pPr>
+      <w:r>
+        <w:rPr>
+          <w:b/>
+          <w:bCs/>
+          <w:sz w:val="20"/>
+          <w:szCs w:val="20"/>
+        </w:rPr>
+        <w:t xml:space="preserve">role inside the token</w:t>
+      </w:r>
+      <w:r>
+        <w:rPr>
+          <w:sz w:val="20"/>
+          <w:szCs w:val="20"/>
+        </w:rPr>
+        <w:t xml:space="preserve"> — it makes requireRole a pure function with no database call. The cost is that the role is *frozen at login* for up to 15 minutes — and that window is exactly why the access token is short-lived. The two decisions are one decision.</w:t>
+      </w:r>
+    </w:p>
+    <w:p>
+      <w:pPr>
+        <w:pStyle w:val="ListParagraph"/>
+        <w:numPr>
+          <w:ilvl w:val="0"/>
+          <w:numId w:val="1"/>
+        </w:numPr>
+        <w:spacing w:after="60"/>
+      </w:pPr>
+      <w:r>
+        <w:rPr>
+          <w:b/>
+          <w:bCs/>
+          <w:sz w:val="20"/>
+          <w:szCs w:val="20"/>
+        </w:rPr>
+        <w:t xml:space="preserve">jti now, deny-list later</w:t>
+      </w:r>
+      <w:r>
+        <w:rPr>
+          <w:sz w:val="20"/>
+          <w:szCs w:val="20"/>
+        </w:rPr>
+        <w:t xml:space="preserve"> — a JWT cannot be revoked before it expires. The standard answer is a deny-list keyed on jti in Redis, checked on refresh — stateless where the volume is, stateful where revocation is needed. Adding the claim later would mean every existing token lacks it.</w:t>
+      </w:r>
+    </w:p>
+    <w:p>
+      <w:pPr>
+        <w:pStyle w:val="ListParagraph"/>
+        <w:numPr>
+          <w:ilvl w:val="0"/>
+          <w:numId w:val="1"/>
+        </w:numPr>
+        <w:spacing w:after="60"/>
+      </w:pPr>
+      <w:r>
+        <w:rPr>
+          <w:b/>
+          <w:bCs/>
+          <w:sz w:val="20"/>
+          <w:szCs w:val="20"/>
+        </w:rPr>
+        <w:t xml:space="preserve">issuer and audience checks</w:t>
+      </w:r>
+      <w:r>
+        <w:rPr>
+          <w:sz w:val="20"/>
+          <w:szCs w:val="20"/>
+        </w:rPr>
+        <w:t xml:space="preserve"> — low value today with one API and secrets nobody else has, but valuable with a staging environment alongside production, where a staging token must not work against production data. Belt-and-braces, named as such.</w:t>
+      </w:r>
+    </w:p>
+    <w:p>
+      <w:pPr>
+        <w:pStyle w:val="ListParagraph"/>
+        <w:numPr>
+          <w:ilvl w:val="0"/>
+          <w:numId w:val="1"/>
+        </w:numPr>
+        <w:spacing w:after="60"/>
+      </w:pPr>
+      <w:r>
+        <w:rPr>
+          <w:b/>
+          <w:bCs/>
+          <w:sz w:val="20"/>
+          <w:szCs w:val="20"/>
+        </w:rPr>
+        <w:t xml:space="preserve">Error translation here, which File 031 deferred</w:t>
+      </w:r>
+      <w:r>
+        <w:rPr>
+          <w:sz w:val="20"/>
+          <w:szCs w:val="20"/>
+        </w:rPr>
+        <w:t xml:space="preserve"> — TOKEN_EXPIRED means “your session is fine, refresh silently” while TOKEN_INVALID means “log in again”. Everything else collapses to tokenInvalid deliberately, because distinguishing “bad signature” from “malformed” tells an attacker how close their forgery came.</w:t>
+      </w:r>
+    </w:p>
+    <w:p>
+      <w:pPr>
+        <w:pStyle w:val="Heading3"/>
+        <w:spacing w:after="80" w:before="200"/>
+      </w:pPr>
+      <w:r>
+        <w:rPr>
+          <w:b/>
+          <w:bCs/>
+          <w:color w:val="8A6D1F"/>
+          <w:sz w:val="21"/>
+          <w:szCs w:val="21"/>
+        </w:rPr>
+        <w:t xml:space="preserve">The property to internalise, and the attack it enables</w:t>
+      </w:r>
+    </w:p>
+    <w:p>
+      <w:pPr>
+        <w:pStyle w:val="ListParagraph"/>
+        <w:numPr>
+          <w:ilvl w:val="0"/>
+          <w:numId w:val="1"/>
+        </w:numPr>
+        <w:spacing w:after="60"/>
+      </w:pPr>
+      <w:r>
+        <w:rPr>
+          <w:sz w:val="20"/>
+          <w:szCs w:val="20"/>
+        </w:rPr>
+        <w:t xml:space="preserve">**A JWT payload is base64, not encrypted.** Anyone holding the token can decode and read it — confirmed in testing by decoding the payload segment with no secret. The one consequence: never put a secret in a JWT. Our claims are a user id and a role, both of which the user already knows about themselves. The signature is what makes it trustworthy, not secrecy.</w:t>
+      </w:r>
+    </w:p>
+    <w:p>
+      <w:pPr>
+        <w:pStyle w:val="ListParagraph"/>
+        <w:numPr>
+          <w:ilvl w:val="0"/>
+          <w:numId w:val="1"/>
+        </w:numPr>
+        <w:spacing w:after="60"/>
+      </w:pPr>
+      <w:r>
+        <w:rPr>
+          <w:sz w:val="20"/>
+          <w:szCs w:val="20"/>
+        </w:rPr>
+        <w:t xml:space="preserve">**Pinning `algorithms` on verify is not optional.** The alg:none attack: the JWT spec permits an algorithm named “none” meaning unsigned, so an attacker edits the header, sets role to admin, and drops the signature — a library that trusts the header accepts it. The HS/RS confusion attack: with RS256 an attacker switches the header to HS256 and signs with the *public* key, and a trusting library uses that public key as an HMAC secret. Both work by making the library trust the token's own claim about how it was signed. **Never let the token tell you how to verify it.** Confirmed in testing: an alg:none forgery was rejected.</w:t>
+      </w:r>
+    </w:p>
+    <w:p>
+      <w:pPr>
+        <w:pStyle w:val="ListParagraph"/>
+        <w:numPr>
+          <w:ilvl w:val="0"/>
+          <w:numId w:val="1"/>
+        </w:numPr>
+        <w:spacing w:after="60"/>
+      </w:pPr>
+      <w:r>
+        <w:rPr>
+          <w:sz w:val="20"/>
+          <w:szCs w:val="20"/>
+        </w:rPr>
+        <w:t xml:space="preserve">Honest counter-argument for the report: server-side sessions are *revocable immediately*; JWTs are not. We compensate with a 15-minute access token and a jti for refresh revocation, but “log this user out now” is genuinely harder with JWTs. A real trade, not a free win.</w:t>
+      </w:r>
+    </w:p>
+    <w:p>
+      <w:pPr>
+        <w:pStyle w:val="ListParagraph"/>
+        <w:numPr>
+          <w:ilvl w:val="0"/>
+          <w:numId w:val="1"/>
+        </w:numPr>
+        <w:spacing w:after="60"/>
+      </w:pPr>
+      <w:r>
+        <w:rPr>
+          <w:sz w:val="20"/>
+          <w:szCs w:val="20"/>
+        </w:rPr>
+        <w:t xml:space="preserve">Token size measured: 339 characters, sent on every request. A session ID would be about 32. The concrete cost of statelessness.</w:t>
+      </w:r>
+    </w:p>
+    <w:p>
+      <w:r>
+        <w:br w:type="page"/>
+      </w:r>
+    </w:p>
+    <w:p>
+      <w:pPr>
+        <w:pStyle w:val="Heading1"/>
+        <w:pBdr>
+          <w:bottom w:val="single" w:color="8A6D1F" w:sz="8" w:space="4"/>
+        </w:pBdr>
+        <w:spacing w:after="160" w:before="420"/>
+      </w:pPr>
+      <w:r>
+        <w:rPr>
+          <w:b/>
+          <w:bCs/>
+          <w:color w:val="1F3352"/>
+          <w:sz w:val="28"/>
+          <w:szCs w:val="28"/>
+        </w:rPr>
+        <w:t xml:space="preserve">File 035 — apps/api/src/middleware/auth.ts</w:t>
+      </w:r>
+    </w:p>
+    <w:p>
+      <w:pPr>
+        <w:pStyle w:val="Heading3"/>
+        <w:spacing w:after="80" w:before="200"/>
+      </w:pPr>
+      <w:r>
+        <w:rPr>
+          <w:b/>
+          <w:bCs/>
+          <w:color w:val="8A6D1F"/>
+          <w:sz w:val="21"/>
+          <w:szCs w:val="21"/>
+        </w:rPr>
+        <w:t xml:space="preserve">1 · Why this file exists</w:t>
+      </w:r>
+    </w:p>
+    <w:p>
+      <w:pPr>
+        <w:spacing w:after="120"/>
+      </w:pPr>
+      <w:r>
+        <w:rPr>
+          <w:b w:val="false"/>
+          <w:bCs w:val="false"/>
+          <w:i w:val="false"/>
+          <w:iCs w:val="false"/>
+          <w:sz w:val="20"/>
+          <w:szCs w:val="20"/>
+        </w:rPr>
+        <w:t xml:space="preserve">File 034 can say whether a token is *valid*; this decides whether a request may *proceed*. Two different questions, and conflating them is a classic source of security holes: authentication asks who you are and fails with 401, authorisation asks what you may do and fails with 403. Without middleware, every controller would repeat the same fifteen lines, and the one that forgot would be an open endpoint we found out about from an incident.</w:t>
+      </w:r>
+    </w:p>
+    <w:p>
+      <w:pPr>
+        <w:pStyle w:val="Heading3"/>
+        <w:spacing w:after="80" w:before="200"/>
+      </w:pPr>
+      <w:r>
+        <w:rPr>
+          <w:b/>
+          <w:bCs/>
+          <w:color w:val="8A6D1F"/>
+          <w:sz w:val="21"/>
+          <w:szCs w:val="21"/>
+        </w:rPr>
+        <w:t xml:space="preserve">2 · Why it is a separate file</w:t>
+      </w:r>
+    </w:p>
+    <w:p>
+      <w:pPr>
+        <w:spacing w:after="120"/>
+      </w:pPr>
+      <w:r>
+        <w:rPr>
+          <w:b w:val="false"/>
+          <w:bCs w:val="false"/>
+          <w:i w:val="false"/>
+          <w:iCs w:val="false"/>
+          <w:sz w:val="20"/>
+          <w:szCs w:val="20"/>
+        </w:rPr>
+        <w:t xml:space="preserve">Separate from utils/jwt.ts by the split argued at File 034 — that is a pure function over a string, this touches req, res and HTTP semantics. Separate from controllers because it runs *before* them, so a controller can assume req.user exists rather than checking.</w:t>
+      </w:r>
+    </w:p>
+    <w:p>
+      <w:pPr>
+        <w:pStyle w:val="Heading3"/>
+        <w:spacing w:after="80" w:before="200"/>
+      </w:pPr>
+      <w:r>
+        <w:rPr>
+          <w:b/>
+          <w:bCs/>
+          <w:color w:val="8A6D1F"/>
+          <w:sz w:val="21"/>
+          <w:szCs w:val="21"/>
+        </w:rPr>
+        <w:t xml:space="preserve">3 · What we do in this file</w:t>
+      </w:r>
+    </w:p>
+    <w:p>
+      <w:pPr>
+        <w:spacing w:after="120"/>
+      </w:pPr>
+      <w:r>
+        <w:rPr>
+          <w:b w:val="false"/>
+          <w:bCs w:val="false"/>
+          <w:i w:val="false"/>
+          <w:iCs w:val="false"/>
+          <w:sz w:val="20"/>
+          <w:szCs w:val="20"/>
+        </w:rPr>
+        <w:t xml:space="preserve">requireAuth (verify the bearer token, attach req.user, no database call), optionalAuth (attach if present, never fail), requireRole(...allowed) as a factory, and requireActiveUser (one projected lean query, rejecting deactivated accounts and correcting a stale role). Plus a declare-global block adding req.user to Express's Request type.</w:t>
+      </w:r>
+    </w:p>
+    <w:p>
+      <w:pPr>
+        <w:pStyle w:val="Heading3"/>
+        <w:spacing w:after="80" w:before="200"/>
+      </w:pPr>
+      <w:r>
+        <w:rPr>
+          <w:b/>
+          <w:bCs/>
+          <w:color w:val="8A6D1F"/>
+          <w:sz w:val="21"/>
+          <w:szCs w:val="21"/>
+        </w:rPr>
+        <w:t xml:space="preserve">4 · Changes made later</w:t>
+      </w:r>
+    </w:p>
+    <w:p>
+      <w:pPr>
+        <w:spacing w:after="160"/>
+        <w:ind w:left="360"/>
+      </w:pPr>
+      <w:r>
+        <w:rPr>
+          <w:i/>
+          <w:iCs/>
+          <w:color w:val="9A9A9A"/>
+          <w:sz w:val="19"/>
+          <w:szCs w:val="19"/>
+        </w:rPr>
+        <w:t xml:space="preserve">[ Date any later change to this file here. ]</w:t>
+      </w:r>
+    </w:p>
+    <w:p>
+      <w:pPr>
+        <w:pStyle w:val="Heading3"/>
+        <w:spacing w:after="80" w:before="200"/>
+      </w:pPr>
+      <w:r>
+        <w:rPr>
+          <w:b/>
+          <w:bCs/>
+          <w:color w:val="8A6D1F"/>
+          <w:sz w:val="21"/>
+          <w:szCs w:val="21"/>
+        </w:rPr>
+        <w:t xml:space="preserve">5 · Where it sits</w:t>
+      </w:r>
+    </w:p>
+    <w:p>
+      <w:pPr>
+        <w:spacing w:after="120"/>
+      </w:pPr>
+      <w:r>
+        <w:rPr>
+          <w:b w:val="false"/>
+          <w:bCs w:val="false"/>
+          <w:i w:val="false"/>
+          <w:iCs w:val="false"/>
+          <w:sz w:val="20"/>
+          <w:szCs w:val="20"/>
+        </w:rPr>
+        <w:t xml:space="preserve">apps/api/src/middleware/auth.ts, beside errorHandler.ts. Registered per route rather than globally.</w:t>
+      </w:r>
+    </w:p>
+    <w:p>
+      <w:pPr>
+        <w:pStyle w:val="Heading3"/>
+        <w:spacing w:after="80" w:before="200"/>
+      </w:pPr>
+      <w:r>
+        <w:rPr>
+          <w:b/>
+          <w:bCs/>
+          <w:color w:val="8A6D1F"/>
+          <w:sz w:val="21"/>
+          <w:szCs w:val="21"/>
+        </w:rPr>
+        <w:t xml:space="preserve">6 · Libraries used here</w:t>
+      </w:r>
+    </w:p>
+    <w:p>
+      <w:pPr>
+        <w:spacing w:after="120"/>
+      </w:pPr>
+      <w:r>
+        <w:rPr>
+          <w:b w:val="false"/>
+          <w:bCs w:val="false"/>
+          <w:i w:val="false"/>
+          <w:iCs w:val="false"/>
+          <w:sz w:val="20"/>
+          <w:szCs w:val="20"/>
+        </w:rPr>
+        <w:t xml:space="preserve">None new.</w:t>
+      </w:r>
+    </w:p>
+    <w:p>
+      <w:pPr>
+        <w:pStyle w:val="Heading3"/>
+        <w:spacing w:after="80" w:before="200"/>
+      </w:pPr>
+      <w:r>
+        <w:rPr>
+          <w:b/>
+          <w:bCs/>
+          <w:color w:val="8A6D1F"/>
+          <w:sz w:val="21"/>
+          <w:szCs w:val="21"/>
+        </w:rPr>
+        <w:t xml:space="preserve">7 · Functions in this file</w:t>
+      </w:r>
+    </w:p>
+    <w:p>
+      <w:pPr>
+        <w:spacing w:after="120"/>
+      </w:pPr>
+      <w:r>
+        <w:rPr>
+          <w:b w:val="false"/>
+          <w:bCs w:val="false"/>
+          <w:i w:val="false"/>
+          <w:iCs w:val="false"/>
+          <w:sz w:val="20"/>
+          <w:szCs w:val="20"/>
+        </w:rPr>
+        <w:t xml:space="preserve">requireAuth — extract, verify, attach. No try/catch: Express 5 forwards a synchronous throw to the error handler automatically, which is the version note from File 007 paying off.</w:t>
+      </w:r>
+    </w:p>
+    <w:p>
+      <w:pPr>
+        <w:spacing w:after="120"/>
+      </w:pPr>
+      <w:r>
+        <w:rPr>
+          <w:b w:val="false"/>
+          <w:bCs w:val="false"/>
+          <w:i w:val="false"/>
+          <w:iCs w:val="false"/>
+          <w:sz w:val="20"/>
+          <w:szCs w:val="20"/>
+        </w:rPr>
+        <w:t xml:space="preserve">optionalAuth — same, but swallows a bad token, because on an optional route “your token is malformed” and “you sent no token” should produce the same response.</w:t>
+      </w:r>
+    </w:p>
+    <w:p>
+      <w:pPr>
+        <w:spacing w:after="120"/>
+      </w:pPr>
+      <w:r>
+        <w:rPr>
+          <w:b w:val="false"/>
+          <w:bCs w:val="false"/>
+          <w:i w:val="false"/>
+          <w:iCs w:val="false"/>
+          <w:sz w:val="20"/>
+          <w:szCs w:val="20"/>
+        </w:rPr>
+        <w:t xml:space="preserve">requireRole(...allowed) — a higher-order function returning middleware, so roles can be configured per route.</w:t>
+      </w:r>
+    </w:p>
+    <w:p>
+      <w:pPr>
+        <w:spacing w:after="120"/>
+      </w:pPr>
+      <w:r>
+        <w:rPr>
+          <w:b w:val="false"/>
+          <w:bCs w:val="false"/>
+          <w:i w:val="false"/>
+          <w:iCs w:val="false"/>
+          <w:sz w:val="20"/>
+          <w:szCs w:val="20"/>
+        </w:rPr>
+        <w:t xml:space="preserve">requireActiveUser — async, one query with .select(“role isActive”).lean().</w:t>
+      </w:r>
+    </w:p>
+    <w:p>
+      <w:pPr>
+        <w:pStyle w:val="Heading3"/>
+        <w:spacing w:after="80" w:before="200"/>
+      </w:pPr>
+      <w:r>
+        <w:rPr>
+          <w:b/>
+          <w:bCs/>
+          <w:color w:val="8A6D1F"/>
+          <w:sz w:val="21"/>
+          <w:szCs w:val="21"/>
+        </w:rPr>
+        <w:t xml:space="preserve">8 · Technical terms introduced</w:t>
+      </w:r>
+    </w:p>
+    <w:p>
+      <w:pPr>
+        <w:spacing w:after="120"/>
+      </w:pPr>
+      <w:r>
+        <w:rPr>
+          <w:b w:val="false"/>
+          <w:bCs w:val="false"/>
+          <w:i w:val="false"/>
+          <w:iCs w:val="false"/>
+          <w:sz w:val="20"/>
+          <w:szCs w:val="20"/>
+        </w:rPr>
+        <w:t xml:space="preserve">authentication vs authorisation · declaration merging · ambient declaration · higher-order function · rest parameters · projection · .lean() · RBAC · role hierarchy · stale claim</w:t>
+      </w:r>
+    </w:p>
+    <w:p>
+      <w:pPr>
+        <w:pStyle w:val="Heading3"/>
+        <w:spacing w:after="80" w:before="200"/>
+      </w:pPr>
+      <w:r>
+        <w:rPr>
+          <w:b/>
+          <w:bCs/>
+          <w:color w:val="8A6D1F"/>
+          <w:sz w:val="21"/>
+          <w:szCs w:val="21"/>
+        </w:rPr>
+        <w:t xml:space="preserve">9 · Why this approach and not another</w:t>
+      </w:r>
+    </w:p>
+    <w:p>
+      <w:pPr>
+        <w:pStyle w:val="ListParagraph"/>
+        <w:numPr>
+          <w:ilvl w:val="0"/>
+          <w:numId w:val="1"/>
+        </w:numPr>
+        <w:spacing w:after="60"/>
+      </w:pPr>
+      <w:r>
+        <w:rPr>
+          <w:b/>
+          <w:bCs/>
+          <w:sz w:val="20"/>
+          <w:szCs w:val="20"/>
+        </w:rPr>
+        <w:t xml:space="preserve">No database lookup in requireAuth</w:t>
+      </w:r>
+      <w:r>
+        <w:rPr>
+          <w:sz w:val="20"/>
+          <w:szCs w:val="20"/>
+        </w:rPr>
+        <w:t xml:space="preserve"> — the role is in the token precisely to avoid a query per request. **Honest counter-argument:** at thirty students a findById is about 1ms and always checking would be entirely affordable. The stateless design is a *scalability* choice, not a performance necessity at our scale.</w:t>
+      </w:r>
+    </w:p>
+    <w:p>
+      <w:pPr>
+        <w:pStyle w:val="ListParagraph"/>
+        <w:numPr>
+          <w:ilvl w:val="0"/>
+          <w:numId w:val="1"/>
+        </w:numPr>
+        <w:spacing w:after="60"/>
+      </w:pPr>
+      <w:r>
+        <w:rPr>
+          <w:b/>
+          <w:bCs/>
+          <w:sz w:val="20"/>
+          <w:szCs w:val="20"/>
+        </w:rPr>
+        <w:t xml:space="preserve">No role hierarchy</w:t>
+      </w:r>
+      <w:r>
+        <w:rPr>
+          <w:sz w:val="20"/>
+          <w:szCs w:val="20"/>
+        </w:rPr>
+        <w:t xml:space="preserve"> — admin is not automatically granted faculty permissions; every route lists exactly who may access it. A hierarchy would read shorter, but an implicit grant is invisible at the call site — and in a system where authorisation decisions end up in a disciplinary record, explicit beats concise.</w:t>
+      </w:r>
+    </w:p>
+    <w:p>
+      <w:pPr>
+        <w:pStyle w:val="ListParagraph"/>
+        <w:numPr>
+          <w:ilvl w:val="0"/>
+          <w:numId w:val="1"/>
+        </w:numPr>
+        <w:spacing w:after="60"/>
+      </w:pPr>
+      <w:r>
+        <w:rPr>
+          <w:b/>
+          <w:bCs/>
+          <w:sz w:val="20"/>
+          <w:szCs w:val="20"/>
+        </w:rPr>
+        <w:t xml:space="preserve">A misconfigured route throws a plain Error, not an AppError</w:t>
+      </w:r>
+      <w:r>
+        <w:rPr>
+          <w:sz w:val="20"/>
+          <w:szCs w:val="20"/>
+        </w:rPr>
+        <w:t xml:space="preserve"> — requireRole without requireAuth is a wiring bug, not a client error. File 031's handler turns a non-AppError into a 500 with a full stack in the logs, which is exactly right: returning a 403 would hide a real bug behind a plausible response.</w:t>
+      </w:r>
+    </w:p>
+    <w:p>
+      <w:pPr>
+        <w:pStyle w:val="ListParagraph"/>
+        <w:numPr>
+          <w:ilvl w:val="0"/>
+          <w:numId w:val="1"/>
+        </w:numPr>
+        <w:spacing w:after="60"/>
+      </w:pPr>
+      <w:r>
+        <w:rPr>
+          <w:b/>
+          <w:bCs/>
+          <w:sz w:val="20"/>
+          <w:szCs w:val="20"/>
+        </w:rPr>
+        <w:t xml:space="preserve">Log 403s but not 401s</w:t>
+      </w:r>
+      <w:r>
+        <w:rPr>
+          <w:sz w:val="20"/>
+          <w:szCs w:val="20"/>
+        </w:rPr>
+        <w:t xml:space="preserve"> — a 401 is noise — logged-out sessions, bots. A 403 means someone authenticated *successfully* and then tried something they are not permitted to do, which is either a UI bug or probing.</w:t>
+      </w:r>
+    </w:p>
+    <w:p>
+      <w:pPr>
+        <w:pStyle w:val="ListParagraph"/>
+        <w:numPr>
+          <w:ilvl w:val="0"/>
+          <w:numId w:val="1"/>
+        </w:numPr>
+        <w:spacing w:after="60"/>
+      </w:pPr>
+      <w:r>
+        <w:rPr>
+          <w:b/>
+          <w:bCs/>
+          <w:sz w:val="20"/>
+          <w:szCs w:val="20"/>
+        </w:rPr>
+        <w:t xml:space="preserve">req.user optional rather than an AuthenticatedRequest type</w:t>
+      </w:r>
+      <w:r>
+        <w:rPr>
+          <w:sz w:val="20"/>
+          <w:szCs w:val="20"/>
+        </w:rPr>
+        <w:t xml:space="preserve"> — the precise version means casting at every route registration, because Express's handler types expect Request. The awkwardness of req.user!.id is real but small.</w:t>
+      </w:r>
+    </w:p>
+    <w:p>
+      <w:pPr>
+        <w:pStyle w:val="ListParagraph"/>
+        <w:numPr>
+          <w:ilvl w:val="0"/>
+          <w:numId w:val="1"/>
+        </w:numPr>
+        <w:spacing w:after="60"/>
+      </w:pPr>
+      <w:r>
+        <w:rPr>
+          <w:b/>
+          <w:bCs/>
+          <w:sz w:val="20"/>
+          <w:szCs w:val="20"/>
+        </w:rPr>
+        <w:t xml:space="preserve">Ownership checks left to controllers</w:t>
+      </w:r>
+      <w:r>
+        <w:rPr>
+          <w:sz w:val="20"/>
+          <w:szCs w:val="20"/>
+        </w:rPr>
+        <w:t xml:space="preserve"> — “is this submission yours?” needs the resource, which the controller is already fetching. Here it would mean a second query. Controllers handle ownership, middleware handles role.</w:t>
+      </w:r>
+    </w:p>
+    <w:p>
+      <w:pPr>
+        <w:pStyle w:val="Heading3"/>
+        <w:spacing w:after="80" w:before="200"/>
+      </w:pPr>
+      <w:r>
+        <w:rPr>
+          <w:b/>
+          <w:bCs/>
+          <w:color w:val="8A6D1F"/>
+          <w:sz w:val="21"/>
+          <w:szCs w:val="21"/>
+        </w:rPr>
+        <w:t xml:space="preserve">The honest picture of JWT authorisation</w:t>
+      </w:r>
+    </w:p>
+    <w:p>
+      <w:pPr>
+        <w:pStyle w:val="ListParagraph"/>
+        <w:numPr>
+          <w:ilvl w:val="0"/>
+          <w:numId w:val="1"/>
+        </w:numPr>
+        <w:spacing w:after="60"/>
+      </w:pPr>
+      <w:r>
+        <w:rPr>
+          <w:sz w:val="20"/>
+          <w:szCs w:val="20"/>
+        </w:rPr>
+        <w:t xml:space="preserve">requireActiveUser is the escape hatch, opt-in per route. A JWT cannot be revoked, so a user deactivated via isActive keeps working for up to 15 minutes, and a demoted faculty member keeps faculty access for the same window. For browsing a dashboard that is acceptable; for escalating a flag to a disciplinary committee it is not.</w:t>
+      </w:r>
+    </w:p>
+    <w:p>
+      <w:pPr>
+        <w:pStyle w:val="ListParagraph"/>
+        <w:numPr>
+          <w:ilvl w:val="0"/>
+          <w:numId w:val="1"/>
+        </w:numPr>
+        <w:spacing w:after="60"/>
+      </w:pPr>
+      <w:r>
+        <w:rPr>
+          <w:sz w:val="20"/>
+          <w:szCs w:val="20"/>
+        </w:rPr>
+        <w:t xml:space="preserve">Confirmed in testing: the *same* deactivated-faculty token returns 200 on /faculty-only and 401 on /escalate, and the same demoted token returns 200 on the token-only route and 403 on the checked one. **Those four lines are worth showing an examiner** rather than claiming the system is always current.</w:t>
+      </w:r>
+    </w:p>
+    <w:p>
+      <w:pPr>
+        <w:pStyle w:val="ListParagraph"/>
+        <w:numPr>
+          <w:ilvl w:val="0"/>
+          <w:numId w:val="1"/>
+        </w:numPr>
+        <w:spacing w:after="60"/>
+      </w:pPr>
+      <w:r>
+        <w:rPr>
+          <w:sz w:val="20"/>
+          <w:szCs w:val="20"/>
+        </w:rPr>
+        <w:t xml:space="preserve">A stale role is *corrected in place* rather than rejected, because a demoted user should still be able to do student things. And .lean() returns a plain object rather than a hydrated document, skipping methods and change tracking we do not need for a read.</w:t>
+      </w:r>
+    </w:p>
+    <w:p>
+      <w:pPr>
+        <w:pStyle w:val="ListParagraph"/>
+        <w:numPr>
+          <w:ilvl w:val="0"/>
+          <w:numId w:val="1"/>
+        </w:numPr>
+        <w:spacing w:after="60"/>
+      </w:pPr>
+      <w:r>
+        <w:rPr>
+          <w:sz w:val="20"/>
+          <w:szCs w:val="20"/>
+        </w:rPr>
+        <w:t xml:space="preserve">Ordering dependency the type system cannot enforce: requireActiveUser must come *before* requireRole, or the role check runs against the stale value. Tests should cover it.</w:t>
+      </w:r>
+    </w:p>
+    <w:p>
+      <w:pPr>
+        <w:pStyle w:val="ListParagraph"/>
+        <w:numPr>
+          <w:ilvl w:val="0"/>
+          <w:numId w:val="1"/>
+        </w:numPr>
+        <w:spacing w:after="60"/>
+      </w:pPr>
+      <w:r>
+        <w:rPr>
+          <w:sz w:val="20"/>
+          <w:szCs w:val="20"/>
+        </w:rPr>
+        <w:t xml:space="preserve">Declaration merging is what makes req.user possible. Express's Request type lives in node_modules and we cannot edit it, but TypeScript merges two same-named interface declarations rather than replacing one. `declare global` is required because this file is a module and everything in it would otherwise be module-scoped.</w:t>
+      </w:r>
+    </w:p>
+    <w:p>
+      <w:pPr>
+        <w:pStyle w:val="ListParagraph"/>
+        <w:numPr>
+          <w:ilvl w:val="0"/>
+          <w:numId w:val="1"/>
+        </w:numPr>
+        <w:spacing w:after="60"/>
+      </w:pPr>
+      <w:r>
+        <w:rPr>
+          <w:sz w:val="20"/>
+          <w:szCs w:val="20"/>
+        </w:rPr>
+        <w:t xml:space="preserve">Possibly premature: optionalAuth is not used by anything yet. Included because the review queue will likely want it — a page whose content differs for a signed-in user without requiring one. Fair to call it speculative.</w:t>
+      </w:r>
+    </w:p>
+    <w:p>
+      <w:r>
+        <w:br w:type="page"/>
+      </w:r>
+    </w:p>
+    <w:p>
+      <w:pPr>
+        <w:pStyle w:val="Heading1"/>
+        <w:pBdr>
+          <w:bottom w:val="single" w:color="8A6D1F" w:sz="8" w:space="4"/>
+        </w:pBdr>
+        <w:spacing w:after="160" w:before="420"/>
+      </w:pPr>
+      <w:r>
+        <w:rPr>
+          <w:b/>
+          <w:bCs/>
+          <w:color w:val="1F3352"/>
+          <w:sz w:val="28"/>
+          <w:szCs w:val="28"/>
+        </w:rPr>
+        <w:t xml:space="preserve">Next entry</w:t>
+      </w:r>
+    </w:p>
+    <w:p>
+      <w:pPr>
+        <w:spacing w:after="160"/>
+        <w:ind w:left="360"/>
+      </w:pPr>
+      <w:r>
+        <w:rPr>
+          <w:i/>
+          <w:iCs/>
+          <w:color w:val="9A9A9A"/>
+          <w:sz w:val="19"/>
+          <w:szCs w:val="19"/>
+        </w:rPr>
+        <w:t xml:space="preserve">[ File 036 — apps/api/src/validation/authSchemas.ts ]</w:t>
       </w:r>
     </w:p>
     <w:sectPr>

</xml_diff>

<commit_message>
docs(notebook): bring both notebooks up to File 084
File Book: entries 081-084, plus dated revisit lines on the nine earlier
entries whose files were touched again.

Reference Notebook: Day 22, 12 glossary terms, 4 file index rows, 11 cram
sheet rows, Phase 6 battles, decisions and corrections, and the resolution
of the minio library page.
</commit_message>
<xml_diff>
--- a/docs/notebook/CodeGuard_AI_File_Book.docx
+++ b/docs/notebook/CodeGuard_AI_File_Book.docx
@@ -83,7 +83,7 @@
           <w:sz w:val="19"/>
           <w:szCs w:val="19"/>
         </w:rPr>
-        <w:t>Covers Files 001–080. Last updated 05 October 2026.</w:t>
+        <w:t>Covers Files 001–084. Last updated 06 October 2026.</w:t>
       </w:r>
     </w:p>
     <w:p>
@@ -2688,6 +2688,22 @@
     </w:p>
     <w:p>
       <w:pPr>
+        <w:spacing w:after="120"/>
+      </w:pPr>
+      <w:r>
+        <w:rPr>
+          <w:b w:val="false"/>
+          <w:bCs w:val="false"/>
+          <w:i w:val="false"/>
+          <w:iCs w:val="false"/>
+          <w:sz w:val="20"/>
+          <w:szCs w:val="20"/>
+        </w:rPr>
+        <w:t>06 Oct 2026 — File 081 moved the object store to the pgsty/silo fork, pinned by digest, and added NODE_ENV: production to the api service. File 084 added an environment block carrying DETECTOR_TOKEN to the detector service.</w:t>
+      </w:r>
+    </w:p>
+    <w:p>
+      <w:pPr>
         <w:pStyle w:val="Heading3"/>
         <w:spacing w:after="80" w:before="200"/>
       </w:pPr>
@@ -4256,7 +4272,7 @@
           <w:sz w:val="19"/>
           <w:szCs w:val="19"/>
         </w:rPr>
-        <w:t xml:space="preserve">[ Date any later change to this file here. ]</w:t>
+        <w:t>06 Oct 2026 — File 084 added DETECTOR_TOKEN, validated at 32 characters for the same reason the JWT secrets are.</w:t>
       </w:r>
     </w:p>
     <w:p>
@@ -9024,7 +9040,7 @@
           <w:sz w:val="19"/>
           <w:szCs w:val="19"/>
         </w:rPr>
-        <w:t xml:space="preserve">[ Date any later change to this file here. ]</w:t>
+        <w:t>06 Oct 2026 — superseded in part by File 081, which replaced the object store image and fixed the api container's startup.</w:t>
       </w:r>
     </w:p>
     <w:p>
@@ -24836,6 +24852,22 @@
     </w:p>
     <w:p>
       <w:pPr>
+        <w:spacing w:after="120"/>
+      </w:pPr>
+      <w:r>
+        <w:rPr>
+          <w:b w:val="false"/>
+          <w:bCs w:val="false"/>
+          <w:i w:val="false"/>
+          <w:iCs w:val="false"/>
+          <w:sz w:val="20"/>
+          <w:szCs w:val="20"/>
+        </w:rPr>
+        <w:t>06 Oct 2026 — File 084 added TEST_DETECTOR_TOKEN and set it in useTestSettings, so the suite never depends on the real secret. The comment naming port 8090 was corrected to 8000 the same day.</w:t>
+      </w:r>
+    </w:p>
+    <w:p>
+      <w:pPr>
         <w:pStyle w:val="Heading3"/>
         <w:spacing w:after="80" w:before="200"/>
       </w:pPr>
@@ -26553,6 +26585,22 @@
     </w:p>
     <w:p>
       <w:pPr>
+        <w:spacing w:after="120"/>
+      </w:pPr>
+      <w:r>
+        <w:rPr>
+          <w:b w:val="false"/>
+          <w:bCs w:val="false"/>
+          <w:i w:val="false"/>
+          <w:iCs w:val="false"/>
+          <w:sz w:val="20"/>
+          <w:szCs w:val="20"/>
+        </w:rPr>
+        <w:t>06 Oct 2026 — File 084 sends the X-Detector-Token header on every call, so an unauthenticated detector answers 401 and postJson surfaces it.</w:t>
+      </w:r>
+    </w:p>
+    <w:p>
+      <w:pPr>
         <w:pStyle w:val="Heading3"/>
         <w:spacing w:after="80" w:before="200"/>
       </w:pPr>
@@ -31713,7 +31761,7 @@
           <w:sz w:val="40"/>
           <w:szCs w:val="40"/>
         </w:rPr>
-        <w:t>[ Date any later change to this file here. ]</w:t>
+        <w:t>06 Oct 2026 — File 084 made the stub detector answer 401 without the shared secret, so a client that forgets the header fails this suite.</w:t>
       </w:r>
     </w:p>
     <w:p>
@@ -32265,6 +32313,22 @@
     </w:p>
     <w:p>
       <w:pPr>
+        <w:spacing w:after="120"/>
+      </w:pPr>
+      <w:r>
+        <w:rPr>
+          <w:b w:val="false"/>
+          <w:bCs w:val="false"/>
+          <w:i w:val="false"/>
+          <w:iCs w:val="false"/>
+          <w:sz w:val="20"/>
+          <w:szCs w:val="20"/>
+        </w:rPr>
+        <w:t>06 Oct 2026 — File 083 moved a comment out of the import block. It had been failing ruff's I001 since the file was written on 01 Oct, unnoticed because ruff only ever ran by hand.</w:t>
+      </w:r>
+    </w:p>
+    <w:p>
+      <w:pPr>
         <w:pStyle w:val="Heading3"/>
         <w:spacing w:after="80" w:before="200"/>
       </w:pPr>
@@ -32811,7 +32875,7 @@
           <w:sz w:val="20"/>
           <w:szCs w:val="20"/>
         </w:rPr>
-        <w:t>[ Date any later change to this file here. ]</w:t>
+        <w:t>06 Oct 2026 — File 084 added the shared-secret check and the body-size limit, closing the two gaps this entry opened.</w:t>
       </w:r>
     </w:p>
     <w:p>
@@ -38480,7 +38544,7 @@
           <w:sz w:val="20"/>
           <w:szCs w:val="20"/>
         </w:rPr>
-        <w:t>[ Date any later change to this file here. ]</w:t>
+        <w:t>06 Oct 2026 — File 084 made the stub answer 401 without the shared secret. The beforeAll hook timeout was raised to 30 seconds the same day, after a cold Vite transform cache pushed its eight dynamic imports past vitest's 10 second default.</w:t>
       </w:r>
     </w:p>
     <w:p>
@@ -38819,6 +38883,2146 @@
           <w:sz w:val="28"/>
           <w:szCs w:val="28"/>
         </w:rPr>
+        <w:t>File 081 — infra/docker-compose.yml (revisit)</w:t>
+      </w:r>
+    </w:p>
+    <w:p>
+      <w:pPr>
+        <w:pStyle w:val="Heading3"/>
+        <w:spacing w:after="80" w:before="200"/>
+      </w:pPr>
+      <w:r>
+        <w:rPr>
+          <w:b/>
+          <w:bCs/>
+          <w:color w:val="8A6D1F"/>
+          <w:sz w:val="21"/>
+          <w:szCs w:val="21"/>
+        </w:rPr>
+        <w:t>1 · Why this file exists</w:t>
+      </w:r>
+    </w:p>
+    <w:p>
+      <w:pPr>
+        <w:spacing w:after="120"/>
+      </w:pPr>
+      <w:r>
+        <w:rPr>
+          <w:b w:val="false"/>
+          <w:bCs w:val="false"/>
+          <w:i w:val="false"/>
+          <w:iCs w:val="false"/>
+          <w:sz w:val="20"/>
+          <w:szCs w:val="20"/>
+        </w:rPr>
+        <w:t>The stack could no longer be built from a clean clone. MinIO removed its images from Docker Hub, the commercial successor refuses every S3 operation without a licence, and separately the api container had been restarting in a loop for days. This revisit repairs both.</w:t>
+      </w:r>
+    </w:p>
+    <w:p>
+      <w:pPr>
+        <w:pStyle w:val="Heading3"/>
+        <w:spacing w:after="80" w:before="200"/>
+      </w:pPr>
+      <w:r>
+        <w:rPr>
+          <w:b/>
+          <w:bCs/>
+          <w:color w:val="8A6D1F"/>
+          <w:sz w:val="21"/>
+          <w:szCs w:val="21"/>
+        </w:rPr>
+        <w:t>2 · Why it is a separate file</w:t>
+      </w:r>
+    </w:p>
+    <w:p>
+      <w:pPr>
+        <w:spacing w:after="120"/>
+      </w:pPr>
+      <w:r>
+        <w:rPr>
+          <w:b w:val="false"/>
+          <w:bCs w:val="false"/>
+          <w:i w:val="false"/>
+          <w:iCs w:val="false"/>
+          <w:sz w:val="20"/>
+          <w:szCs w:val="20"/>
+        </w:rPr>
+        <w:t>It is not a separate file. Both faults are configuration rather than code, and both live in the file that defines the data tier. Not one line of TypeScript or Python changed.</w:t>
+      </w:r>
+    </w:p>
+    <w:p>
+      <w:pPr>
+        <w:pStyle w:val="Heading3"/>
+        <w:spacing w:after="80" w:before="200"/>
+      </w:pPr>
+      <w:r>
+        <w:rPr>
+          <w:b/>
+          <w:bCs/>
+          <w:color w:val="8A6D1F"/>
+          <w:sz w:val="21"/>
+          <w:szCs w:val="21"/>
+        </w:rPr>
+        <w:t>3 · What we do in this file</w:t>
+      </w:r>
+    </w:p>
+    <w:p>
+      <w:pPr>
+        <w:spacing w:after="120"/>
+      </w:pPr>
+      <w:r>
+        <w:rPr>
+          <w:b w:val="false"/>
+          <w:bCs w:val="false"/>
+          <w:i w:val="false"/>
+          <w:iCs w:val="false"/>
+          <w:sz w:val="20"/>
+          <w:szCs w:val="20"/>
+        </w:rPr>
+        <w:t>The object store moves to pgsty/silo, the AGPL community fork of MinIO, pinned by digest rather than tag. The api service gains NODE_ENV: production. Everything else is unchanged.</w:t>
+      </w:r>
+    </w:p>
+    <w:p>
+      <w:pPr>
+        <w:pStyle w:val="Heading3"/>
+        <w:spacing w:after="80" w:before="200"/>
+      </w:pPr>
+      <w:r>
+        <w:rPr>
+          <w:b/>
+          <w:bCs/>
+          <w:color w:val="8A6D1F"/>
+          <w:sz w:val="21"/>
+          <w:szCs w:val="21"/>
+        </w:rPr>
+        <w:t>4 · Changes made later</w:t>
+      </w:r>
+    </w:p>
+    <w:p>
+      <w:pPr>
+        <w:spacing w:after="120"/>
+      </w:pPr>
+      <w:r>
+        <w:rPr>
+          <w:b w:val="false"/>
+          <w:bCs w:val="false"/>
+          <w:i w:val="false"/>
+          <w:iCs w:val="false"/>
+          <w:sz w:val="20"/>
+          <w:szCs w:val="20"/>
+        </w:rPr>
+        <w:t>06 Oct 2026 — File 084 added an environment block to the detector service carrying DETECTOR_TOKEN.</w:t>
+      </w:r>
+    </w:p>
+    <w:p>
+      <w:pPr>
+        <w:pStyle w:val="Heading3"/>
+        <w:spacing w:after="80" w:before="200"/>
+      </w:pPr>
+      <w:r>
+        <w:rPr>
+          <w:b/>
+          <w:bCs/>
+          <w:color w:val="8A6D1F"/>
+          <w:sz w:val="21"/>
+          <w:szCs w:val="21"/>
+        </w:rPr>
+        <w:t>5 · Where it sits</w:t>
+      </w:r>
+    </w:p>
+    <w:p>
+      <w:pPr>
+        <w:spacing w:after="120"/>
+      </w:pPr>
+      <w:r>
+        <w:rPr>
+          <w:b w:val="false"/>
+          <w:bCs w:val="false"/>
+          <w:i w:val="false"/>
+          <w:iCs w:val="false"/>
+          <w:sz w:val="20"/>
+          <w:szCs w:val="20"/>
+        </w:rPr>
+        <w:t>infra/docker-compose.yml, beside infra/.env, which compose loads automatically for ${...} interpolation. infra/.env itself did not change.</w:t>
+      </w:r>
+    </w:p>
+    <w:p>
+      <w:pPr>
+        <w:pStyle w:val="Heading3"/>
+        <w:spacing w:after="80" w:before="200"/>
+      </w:pPr>
+      <w:r>
+        <w:rPr>
+          <w:b/>
+          <w:bCs/>
+          <w:color w:val="8A6D1F"/>
+          <w:sz w:val="21"/>
+          <w:szCs w:val="21"/>
+        </w:rPr>
+        <w:t>6 · Libraries used here</w:t>
+      </w:r>
+    </w:p>
+    <w:p>
+      <w:pPr>
+        <w:spacing w:after="120"/>
+      </w:pPr>
+      <w:r>
+        <w:rPr>
+          <w:b w:val="false"/>
+          <w:bCs w:val="false"/>
+          <w:i w:val="false"/>
+          <w:iCs w:val="false"/>
+          <w:sz w:val="20"/>
+          <w:szCs w:val="20"/>
+        </w:rPr>
+        <w:t>One fewer dependency, not one more: the licence file AIStor would have needed is gone, and with it the problem that a licence cannot be committed.</w:t>
+      </w:r>
+    </w:p>
+    <w:p>
+      <w:pPr>
+        <w:pStyle w:val="Heading3"/>
+        <w:spacing w:after="80" w:before="200"/>
+      </w:pPr>
+      <w:r>
+        <w:rPr>
+          <w:b/>
+          <w:bCs/>
+          <w:color w:val="8A6D1F"/>
+          <w:sz w:val="21"/>
+          <w:szCs w:val="21"/>
+        </w:rPr>
+        <w:t>7 · Functions in this file</w:t>
+      </w:r>
+    </w:p>
+    <w:p>
+      <w:pPr>
+        <w:spacing w:after="120"/>
+      </w:pPr>
+      <w:r>
+        <w:rPr>
+          <w:b w:val="false"/>
+          <w:bCs w:val="false"/>
+          <w:i w:val="false"/>
+          <w:iCs w:val="false"/>
+          <w:sz w:val="20"/>
+          <w:szCs w:val="20"/>
+        </w:rPr>
+        <w:t>None. A compose file is declarative.</w:t>
+      </w:r>
+    </w:p>
+    <w:p>
+      <w:pPr>
+        <w:pStyle w:val="Heading3"/>
+        <w:spacing w:after="80" w:before="200"/>
+      </w:pPr>
+      <w:r>
+        <w:rPr>
+          <w:b/>
+          <w:bCs/>
+          <w:color w:val="8A6D1F"/>
+          <w:sz w:val="21"/>
+          <w:szCs w:val="21"/>
+        </w:rPr>
+        <w:t>8 · Technical terms introduced</w:t>
+      </w:r>
+    </w:p>
+    <w:p>
+      <w:pPr>
+        <w:spacing w:after="120"/>
+      </w:pPr>
+      <w:r>
+        <w:rPr>
+          <w:b w:val="false"/>
+          <w:bCs w:val="false"/>
+          <w:i w:val="false"/>
+          <w:iCs w:val="false"/>
+          <w:sz w:val="20"/>
+          <w:szCs w:val="20"/>
+        </w:rPr>
+        <w:t>image digest · content-addressable tag · AGPL community fork · env_file versus environment precedence · dev dependency pruning · fail-open status</w:t>
+      </w:r>
+    </w:p>
+    <w:p>
+      <w:pPr>
+        <w:pStyle w:val="Heading3"/>
+        <w:spacing w:after="80" w:before="200"/>
+      </w:pPr>
+      <w:r>
+        <w:rPr>
+          <w:b/>
+          <w:bCs/>
+          <w:color w:val="8A6D1F"/>
+          <w:sz w:val="21"/>
+          <w:szCs w:val="21"/>
+        </w:rPr>
+        <w:t>9 · Why this approach and not another</w:t>
+      </w:r>
+    </w:p>
+    <w:p>
+      <w:pPr>
+        <w:pStyle w:val="ListParagraph"/>
+        <w:numPr>
+          <w:ilvl w:val="0"/>
+          <w:numId w:val="1"/>
+        </w:numPr>
+        <w:spacing w:after="60"/>
+      </w:pPr>
+      <w:r>
+        <w:rPr>
+          <w:b/>
+          <w:bCs/>
+          <w:sz w:val="20"/>
+          <w:szCs w:val="20"/>
+        </w:rPr>
+        <w:t>A community fork over the official commercial image</w:t>
+      </w:r>
+      <w:r>
+        <w:rPr>
+          <w:sz w:val="20"/>
+          <w:szCs w:val="20"/>
+        </w:rPr>
+        <w:t xml:space="preserve"> — AIStor's free tier exists, but its licence file cannot be committed, so the repository would stop building from a clean clone. That is the same failure as the registry removal itself, a dependency we do not actually have, arriving by a different route. AGPL-3.0 with no registration is also a cleaner sentence in the report.</w:t>
+      </w:r>
+    </w:p>
+    <w:p>
+      <w:pPr>
+        <w:pStyle w:val="ListParagraph"/>
+        <w:numPr>
+          <w:ilvl w:val="0"/>
+          <w:numId w:val="1"/>
+        </w:numPr>
+        <w:spacing w:after="60"/>
+      </w:pPr>
+      <w:r>
+        <w:rPr>
+          <w:b/>
+          <w:bCs/>
+          <w:sz w:val="20"/>
+          <w:szCs w:val="20"/>
+        </w:rPr>
+        <w:t>A digest over a dated tag</w:t>
+      </w:r>
+      <w:r>
+        <w:rPr>
+          <w:sz w:val="20"/>
+          <w:szCs w:val="20"/>
+        </w:rPr>
+        <w:t xml:space="preserve"> — a tag is a mutable pointer, so the bytes behind it can change. The digest is the bytes. It does not protect against withdrawal, which nothing does, but it makes the image tested and the image running in six months provably identical. The digest the pull reported matched the one the registry advertises, which is a check rather than an assertion.</w:t>
+      </w:r>
+    </w:p>
+    <w:p>
+      <w:pPr>
+        <w:pStyle w:val="ListParagraph"/>
+        <w:numPr>
+          <w:ilvl w:val="0"/>
+          <w:numId w:val="1"/>
+        </w:numPr>
+        <w:spacing w:after="60"/>
+      </w:pPr>
+      <w:r>
+        <w:rPr>
+          <w:b/>
+          <w:bCs/>
+          <w:sz w:val="20"/>
+          <w:szCs w:val="20"/>
+        </w:rPr>
+        <w:t>Over Garage or SeaweedFS</w:t>
+      </w:r>
+      <w:r>
+        <w:rPr>
+          <w:sz w:val="20"/>
+          <w:szCs w:val="20"/>
+        </w:rPr>
+        <w:t xml:space="preserve"> — both are credible and licence-free, and both use a different credential and bucket model, so infra, .env and the whole storage path would need reworking and re-verifying. The right answer if Silo disappoints; the wrong first move while a true drop-in exists.</w:t>
+      </w:r>
+    </w:p>
+    <w:p>
+      <w:pPr>
+        <w:pStyle w:val="ListParagraph"/>
+        <w:numPr>
+          <w:ilvl w:val="0"/>
+          <w:numId w:val="1"/>
+        </w:numPr>
+        <w:spacing w:after="60"/>
+      </w:pPr>
+      <w:r>
+        <w:rPr>
+          <w:b/>
+          <w:bCs/>
+          <w:sz w:val="20"/>
+          <w:szCs w:val="20"/>
+        </w:rPr>
+        <w:t>NODE_ENV on the service, not in infra/.env</w:t>
+      </w:r>
+      <w:r>
+        <w:rPr>
+          <w:sz w:val="20"/>
+          <w:szCs w:val="20"/>
+        </w:rPr>
+        <w:t xml:space="preserve"> — putting production in the env file would break the host workflow, where npm run dev genuinely is development. The override belongs where the production artefact is defined.</w:t>
+      </w:r>
+    </w:p>
+    <w:p>
+      <w:pPr>
+        <w:pStyle w:val="ListParagraph"/>
+        <w:numPr>
+          <w:ilvl w:val="0"/>
+          <w:numId w:val="1"/>
+        </w:numPr>
+        <w:spacing w:after="60"/>
+      </w:pPr>
+      <w:r>
+        <w:rPr>
+          <w:b/>
+          <w:bCs/>
+          <w:sz w:val="20"/>
+          <w:szCs w:val="20"/>
+        </w:rPr>
+        <w:t>The healthcheck left exactly as it was</w:t>
+      </w:r>
+      <w:r>
+        <w:rPr>
+          <w:sz w:val="20"/>
+          <w:szCs w:val="20"/>
+        </w:rPr>
+        <w:t xml:space="preserve"> — one variable at a time. If it had failed, that would have been information about Silo's base image rather than a problem with the swap.</w:t>
+      </w:r>
+    </w:p>
+    <w:p>
+      <w:pPr>
+        <w:pStyle w:val="Heading3"/>
+        <w:spacing w:after="80" w:before="200"/>
+      </w:pPr>
+      <w:r>
+        <w:rPr>
+          <w:b/>
+          <w:bCs/>
+          <w:color w:val="8A6D1F"/>
+          <w:sz w:val="21"/>
+          <w:szCs w:val="21"/>
+        </w:rPr>
+        <w:t>Gotcha</w:t>
+      </w:r>
+    </w:p>
+    <w:p>
+      <w:pPr>
+        <w:pStyle w:val="ListParagraph"/>
+        <w:numPr>
+          <w:ilvl w:val="0"/>
+          <w:numId w:val="1"/>
+        </w:numPr>
+        <w:spacing w:after="60"/>
+      </w:pPr>
+      <w:r>
+        <w:rPr>
+          <w:sz w:val="20"/>
+          <w:szCs w:val="20"/>
+        </w:rPr>
+        <w:t>The crash-loop had been invisible for days. env.ts defaults NODE_ENV to development, logger.ts asks pino for the pino-pretty transport in development, and the production image installs without dev dependencies, so pino threw at module load before a line of our code ran. It went unnoticed because restart: unless-stopped makes a container that dies at startup look like one that is Up, and because nothing in the project uses the api container: the tests build the app in-process and the worker runs on the host. A service nothing depends on can be broken indefinitely without a single symptom.</w:t>
+      </w:r>
+    </w:p>
+    <w:p>
+      <w:pPr>
+        <w:pStyle w:val="ListParagraph"/>
+        <w:numPr>
+          <w:ilvl w:val="0"/>
+          <w:numId w:val="1"/>
+        </w:numPr>
+        <w:spacing w:after="60"/>
+      </w:pPr>
+      <w:r>
+        <w:rPr>
+          <w:sz w:val="20"/>
+          <w:szCs w:val="20"/>
+        </w:rPr>
+        <w:t>Verified that NODE_ENV is read in exactly three places before changing it: the env schema, the logger, and the error handler, where production additionally stops a non-operational 500 attaching the raw error message to the response. That third effect is an improvement rather than a regression.</w:t>
+      </w:r>
+    </w:p>
+    <w:p>
+      <w:pPr>
+        <w:pStyle w:val="ListParagraph"/>
+        <w:numPr>
+          <w:ilvl w:val="0"/>
+          <w:numId w:val="1"/>
+        </w:numPr>
+        <w:spacing w:after="60"/>
+      </w:pPr>
+      <w:r>
+        <w:rPr>
+          <w:sz w:val="20"/>
+          <w:szCs w:val="20"/>
+        </w:rPr>
+        <w:t>My error, and it cost a failed stack start. The first version of this file dropped name: codeguard from the top, because I rebuilt the file starting at services:. Compose then named the project after its directory, so images built as infra-api, a new network and three new volumes appeared, and because container_name is globally unique rather than project-scoped, the new codeguard-detector collided with the one still running. I had also claimed only two lines differed, which was false.</w:t>
+      </w:r>
+    </w:p>
+    <w:p>
+      <w:pPr>
+        <w:pStyle w:val="ListParagraph"/>
+        <w:numPr>
+          <w:ilvl w:val="0"/>
+          <w:numId w:val="1"/>
+        </w:numPr>
+        <w:spacing w:after="60"/>
+      </w:pPr>
+      <w:r>
+        <w:rPr>
+          <w:sz w:val="20"/>
+          <w:szCs w:val="20"/>
+        </w:rPr>
+        <w:t>A second wrong call the same day. When layer2.test.ts then failed with a hook timeout I blamed a cold Mongo volume and predicted the first run would fail and the second pass. The first run passed. The real cause was in vitest's own summary: 26 per cent of a 41.71 second run went to imports against 5 per cent warm, which is 8.6 seconds of module transforming inside a hook limited to ten. A cold Vite cache, not a cold database, and the down -v I prescribed cleared the database while leaving the cache warm.</w:t>
+      </w:r>
+    </w:p>
+    <w:p>
+      <w:pPr>
+        <w:pStyle w:val="ListParagraph"/>
+        <w:numPr>
+          <w:ilvl w:val="0"/>
+          <w:numId w:val="1"/>
+        </w:numPr>
+        <w:spacing w:after="60"/>
+      </w:pPr>
+      <w:r>
+        <w:rPr>
+          <w:sz w:val="20"/>
+          <w:szCs w:val="20"/>
+        </w:rPr>
+        <w:t>Lesson: Up is not healthy. Read the logs, not the status column.</w:t>
+      </w:r>
+    </w:p>
+    <w:p>
+      <w:pPr>
+        <w:spacing w:after="120"/>
+      </w:pPr>
+      <w:r>
+        <w:rPr>
+          <w:b w:val="false"/>
+          <w:bCs w:val="false"/>
+          <w:i w:val="false"/>
+          <w:iCs w:val="false"/>
+          <w:sz w:val="20"/>
+          <w:szCs w:val="20"/>
+        </w:rPr>
+      </w:r>
+    </w:p>
+    <w:p>
+      <w:pPr>
+        <w:pStyle w:val="Heading1"/>
+        <w:pBdr>
+          <w:bottom w:val="single" w:color="8A6D1F" w:sz="8" w:space="4"/>
+        </w:pBdr>
+        <w:spacing w:after="160" w:before="420"/>
+      </w:pPr>
+      <w:r>
+        <w:rPr>
+          <w:b/>
+          <w:bCs/>
+          <w:color w:val="1F3352"/>
+          <w:sz w:val="28"/>
+          <w:szCs w:val="28"/>
+        </w:rPr>
+        <w:t>File 082 — apps/detector/tests/ (six new files)</w:t>
+      </w:r>
+    </w:p>
+    <w:p>
+      <w:pPr>
+        <w:pStyle w:val="Heading3"/>
+        <w:spacing w:after="80" w:before="200"/>
+      </w:pPr>
+      <w:r>
+        <w:rPr>
+          <w:b/>
+          <w:bCs/>
+          <w:color w:val="8A6D1F"/>
+          <w:sz w:val="21"/>
+          <w:szCs w:val="21"/>
+        </w:rPr>
+        <w:t>1 · Why this file exists</w:t>
+      </w:r>
+    </w:p>
+    <w:p>
+      <w:pPr>
+        <w:spacing w:after="120"/>
+      </w:pPr>
+      <w:r>
+        <w:rPr>
+          <w:b w:val="false"/>
+          <w:bCs w:val="false"/>
+          <w:i w:val="false"/>
+          <w:iCs w:val="false"/>
+          <w:sz w:val="20"/>
+          <w:szCs w:val="20"/>
+        </w:rPr>
+        <w:t>The detector had no tests at all. Seven modules holding every algorithm this project is actually about, and the Node suite stubs the detector completely, so nothing verified that the tree edit distance is correct, that normalisation collapses what it claims to, or that the prefilter ranks sanely. Everything proven about them was proven by hand in scratch files that were then deleted.</w:t>
+      </w:r>
+    </w:p>
+    <w:p>
+      <w:pPr>
+        <w:pStyle w:val="Heading3"/>
+        <w:spacing w:after="80" w:before="200"/>
+      </w:pPr>
+      <w:r>
+        <w:rPr>
+          <w:b/>
+          <w:bCs/>
+          <w:color w:val="8A6D1F"/>
+          <w:sz w:val="21"/>
+          <w:szCs w:val="21"/>
+        </w:rPr>
+        <w:t>2 · Why it is a separate file</w:t>
+      </w:r>
+    </w:p>
+    <w:p>
+      <w:pPr>
+        <w:spacing w:after="120"/>
+      </w:pPr>
+      <w:r>
+        <w:rPr>
+          <w:b w:val="false"/>
+          <w:bCs w:val="false"/>
+          <w:i w:val="false"/>
+          <w:iCs w:val="false"/>
+          <w:sz w:val="20"/>
+          <w:szCs w:val="20"/>
+        </w:rPr>
+        <w:t>A separate test package per module, mirroring the Node side, so a red test names which module is broken rather than which service. The scaffolding already existed: pyproject.toml has declared the dev extras and testpaths = ["tests"] since Phase 0, unused for a month.</w:t>
+      </w:r>
+    </w:p>
+    <w:p>
+      <w:pPr>
+        <w:pStyle w:val="Heading3"/>
+        <w:spacing w:after="80" w:before="200"/>
+      </w:pPr>
+      <w:r>
+        <w:rPr>
+          <w:b/>
+          <w:bCs/>
+          <w:color w:val="8A6D1F"/>
+          <w:sz w:val="21"/>
+          <w:szCs w:val="21"/>
+        </w:rPr>
+        <w:t>3 · What we do in this file</w:t>
+      </w:r>
+    </w:p>
+    <w:p>
+      <w:pPr>
+        <w:spacing w:after="120"/>
+      </w:pPr>
+      <w:r>
+        <w:rPr>
+          <w:b w:val="false"/>
+          <w:bCs w:val="false"/>
+          <w:i w:val="false"/>
+          <w:iCs w:val="false"/>
+          <w:sz w:val="20"/>
+          <w:szCs w:val="20"/>
+        </w:rPr>
+        <w:t>conftest.py holds the fixtures and two helpers; test_parsing, test_normalise, test_similarity, test_prefilter, test_units and test_features cover one module each. 85 tests, 0.2 seconds.</w:t>
+      </w:r>
+    </w:p>
+    <w:p>
+      <w:pPr>
+        <w:pStyle w:val="Heading3"/>
+        <w:spacing w:after="80" w:before="200"/>
+      </w:pPr>
+      <w:r>
+        <w:rPr>
+          <w:b/>
+          <w:bCs/>
+          <w:color w:val="8A6D1F"/>
+          <w:sz w:val="21"/>
+          <w:szCs w:val="21"/>
+        </w:rPr>
+        <w:t>4 · Changes made later</w:t>
+      </w:r>
+    </w:p>
+    <w:p>
+      <w:pPr>
+        <w:spacing w:after="120"/>
+      </w:pPr>
+      <w:r>
+        <w:rPr>
+          <w:b w:val="false"/>
+          <w:bCs w:val="false"/>
+          <w:i w:val="false"/>
+          <w:iCs w:val="false"/>
+          <w:sz w:val="20"/>
+          <w:szCs w:val="20"/>
+        </w:rPr>
+        <w:t>06 Oct 2026 — File 083 added test_main.py for the HTTP contract, taking the suite to 112. File 084 added the token tests and the body-limit tests, taking it to 121.</w:t>
+      </w:r>
+    </w:p>
+    <w:p>
+      <w:pPr>
+        <w:pStyle w:val="Heading3"/>
+        <w:spacing w:after="80" w:before="200"/>
+      </w:pPr>
+      <w:r>
+        <w:rPr>
+          <w:b/>
+          <w:bCs/>
+          <w:color w:val="8A6D1F"/>
+          <w:sz w:val="21"/>
+          <w:szCs w:val="21"/>
+        </w:rPr>
+        <w:t>5 · Where it sits</w:t>
+      </w:r>
+    </w:p>
+    <w:p>
+      <w:pPr>
+        <w:spacing w:after="120"/>
+      </w:pPr>
+      <w:r>
+        <w:rPr>
+          <w:b w:val="false"/>
+          <w:bCs w:val="false"/>
+          <w:i w:val="false"/>
+          <w:iCs w:val="false"/>
+          <w:sz w:val="20"/>
+          <w:szCs w:val="20"/>
+        </w:rPr>
+        <w:t>apps/detector/tests, beside app. The Dockerfile copies only app ./app, so tests never enter the image, and .gitignore covers only .venv, __pycache__ and *.pyc, so nothing is silently untracked.</w:t>
+      </w:r>
+    </w:p>
+    <w:p>
+      <w:pPr>
+        <w:pStyle w:val="Heading3"/>
+        <w:spacing w:after="80" w:before="200"/>
+      </w:pPr>
+      <w:r>
+        <w:rPr>
+          <w:b/>
+          <w:bCs/>
+          <w:color w:val="8A6D1F"/>
+          <w:sz w:val="21"/>
+          <w:szCs w:val="21"/>
+        </w:rPr>
+        <w:t>6 · Libraries used here</w:t>
+      </w:r>
+    </w:p>
+    <w:p>
+      <w:pPr>
+        <w:spacing w:after="120"/>
+      </w:pPr>
+      <w:r>
+        <w:rPr>
+          <w:b w:val="false"/>
+          <w:bCs w:val="false"/>
+          <w:i w:val="false"/>
+          <w:iCs w:val="false"/>
+          <w:sz w:val="20"/>
+          <w:szCs w:val="20"/>
+        </w:rPr>
+        <w:t>None new to the runtime. pytest was already declared in pyproject's dev extras and had never been installed.</w:t>
+      </w:r>
+    </w:p>
+    <w:p>
+      <w:pPr>
+        <w:pStyle w:val="Heading3"/>
+        <w:spacing w:after="80" w:before="200"/>
+      </w:pPr>
+      <w:r>
+        <w:rPr>
+          <w:b/>
+          <w:bCs/>
+          <w:color w:val="8A6D1F"/>
+          <w:sz w:val="21"/>
+          <w:szCs w:val="21"/>
+        </w:rPr>
+        <w:t>7 · Functions in this file</w:t>
+      </w:r>
+    </w:p>
+    <w:p>
+      <w:pPr>
+        <w:spacing w:after="120"/>
+      </w:pPr>
+      <w:r>
+        <w:rPr>
+          <w:b w:val="false"/>
+          <w:bCs w:val="false"/>
+          <w:i w:val="false"/>
+          <w:iCs w:val="false"/>
+          <w:sz w:val="20"/>
+          <w:szCs w:val="20"/>
+        </w:rPr>
+        <w:t>tree() and wide_tree() in conftest, plus the tests themselves.</w:t>
+      </w:r>
+    </w:p>
+    <w:p>
+      <w:pPr>
+        <w:pStyle w:val="Heading3"/>
+        <w:spacing w:after="80" w:before="200"/>
+      </w:pPr>
+      <w:r>
+        <w:rPr>
+          <w:b/>
+          <w:bCs/>
+          <w:color w:val="8A6D1F"/>
+          <w:sz w:val="21"/>
+          <w:szCs w:val="21"/>
+        </w:rPr>
+        <w:t>8 · Technical terms introduced</w:t>
+      </w:r>
+    </w:p>
+    <w:p>
+      <w:pPr>
+        <w:spacing w:after="120"/>
+      </w:pPr>
+      <w:r>
+        <w:rPr>
+          <w:b w:val="false"/>
+          <w:bCs w:val="false"/>
+          <w:i w:val="false"/>
+          <w:iCs w:val="false"/>
+          <w:sz w:val="20"/>
+          <w:szCs w:val="20"/>
+        </w:rPr>
+        <w:t>mutation testing · fixture · regression test · property versus example · synthetic tree · test package</w:t>
+      </w:r>
+    </w:p>
+    <w:p>
+      <w:pPr>
+        <w:pStyle w:val="Heading3"/>
+        <w:spacing w:after="80" w:before="200"/>
+      </w:pPr>
+      <w:r>
+        <w:rPr>
+          <w:b/>
+          <w:bCs/>
+          <w:color w:val="8A6D1F"/>
+          <w:sz w:val="21"/>
+          <w:szCs w:val="21"/>
+        </w:rPr>
+        <w:t>9 · Why this approach and not another</w:t>
+      </w:r>
+    </w:p>
+    <w:p>
+      <w:pPr>
+        <w:pStyle w:val="ListParagraph"/>
+        <w:numPr>
+          <w:ilvl w:val="0"/>
+          <w:numId w:val="1"/>
+        </w:numPr>
+        <w:spacing w:after="60"/>
+      </w:pPr>
+      <w:r>
+        <w:rPr>
+          <w:b/>
+          <w:bCs/>
+          <w:sz w:val="20"/>
+          <w:szCs w:val="20"/>
+        </w:rPr>
+        <w:t>Claims covered rather than asserted</w:t>
+      </w:r>
+      <w:r>
+        <w:rPr>
+          <w:sz w:val="20"/>
+          <w:szCs w:val="20"/>
+        </w:rPr>
+        <w:t xml:space="preserve"> — renaming invariance end to end, where a renamed copy scores exactly 1.0, which is the number the report quotes. Until now that was a measurement in a deleted scratch file.</w:t>
+      </w:r>
+    </w:p>
+    <w:p>
+      <w:pPr>
+        <w:pStyle w:val="ListParagraph"/>
+        <w:numPr>
+          <w:ilvl w:val="0"/>
+          <w:numId w:val="1"/>
+        </w:numPr>
+        <w:spacing w:after="60"/>
+      </w:pPr>
+      <w:r>
+        <w:rPr>
+          <w:b/>
+          <w:bCs/>
+          <w:sz w:val="20"/>
+          <w:szCs w:val="20"/>
+        </w:rPr>
+        <w:t>The None rather than zero rule gets two tests, not one</w:t>
+      </w:r>
+      <w:r>
+        <w:rPr>
+          <w:sz w:val="20"/>
+          <w:szCs w:val="20"/>
+        </w:rPr>
+        <w:t xml:space="preserve"> — a loop-free file scores for_loop_ratio None because the question does not apply, and a while-only file scores 0.0 because there were loops and none of them were for loops. Those are different facts and the distinction is the whole of Layer 2's foundation.</w:t>
+      </w:r>
+    </w:p>
+    <w:p>
+      <w:pPr>
+        <w:pStyle w:val="ListParagraph"/>
+        <w:numPr>
+          <w:ilvl w:val="0"/>
+          <w:numId w:val="1"/>
+        </w:numPr>
+        <w:spacing w:after="60"/>
+      </w:pPr>
+      <w:r>
+        <w:rPr>
+          <w:b/>
+          <w:bCs/>
+          <w:sz w:val="20"/>
+          <w:szCs w:val="20"/>
+        </w:rPr>
+        <w:t>Properties where the exact value is not knowable, examples where it is</w:t>
+      </w:r>
+      <w:r>
+        <w:rPr>
+          <w:sz w:val="20"/>
+          <w:szCs w:val="20"/>
+        </w:rPr>
+        <w:t xml:space="preserve"> — similarity symmetry, the 0 to 1 bound and monotonic ceilings are asserted as properties; blank_line_ratio on a four-line fixture is asserted as 0.5. Writing down a discovered number as if it were a requirement is how a test suite starts defending the current behaviour instead of the intended one.</w:t>
+      </w:r>
+    </w:p>
+    <w:p>
+      <w:pPr>
+        <w:pStyle w:val="ListParagraph"/>
+        <w:numPr>
+          <w:ilvl w:val="0"/>
+          <w:numId w:val="1"/>
+        </w:numPr>
+        <w:spacing w:after="60"/>
+      </w:pPr>
+      <w:r>
+        <w:rPr>
+          <w:b/>
+          <w:bCs/>
+          <w:sz w:val="20"/>
+          <w:szCs w:val="20"/>
+        </w:rPr>
+        <w:t>The depth guard is called at the limit rather than fed deep source</w:t>
+      </w:r>
+      <w:r>
+        <w:rPr>
+          <w:sz w:val="20"/>
+          <w:szCs w:val="20"/>
+        </w:rPr>
+        <w:t xml:space="preserve"> — 200 levels of real nesting would hit the parser's own limits long before reaching ours, so the test calls normalise with depth=MAX_DEPTH and checks it truncates to DEEP.</w:t>
+      </w:r>
+    </w:p>
+    <w:p>
+      <w:pPr>
+        <w:pStyle w:val="ListParagraph"/>
+        <w:numPr>
+          <w:ilvl w:val="0"/>
+          <w:numId w:val="1"/>
+        </w:numPr>
+        <w:spacing w:after="60"/>
+      </w:pPr>
+      <w:r>
+        <w:rPr>
+          <w:b/>
+          <w:bCs/>
+          <w:sz w:val="20"/>
+          <w:szCs w:val="20"/>
+        </w:rPr>
+        <w:t>The cost guard is tested with synthetic trees, not parsed code</w:t>
+      </w:r>
+      <w:r>
+        <w:rPr>
+          <w:sz w:val="20"/>
+          <w:szCs w:val="20"/>
+        </w:rPr>
+        <w:t xml:space="preserve"> — two trees whose size product exceeds MAX_PRODUCT would need about 390 nodes each. Building TNode objects directly is faster, clearer, and does not depend on what a parser happens to produce.</w:t>
+      </w:r>
+    </w:p>
+    <w:p>
+      <w:pPr>
+        <w:pStyle w:val="Heading3"/>
+        <w:spacing w:after="80" w:before="200"/>
+      </w:pPr>
+      <w:r>
+        <w:rPr>
+          <w:b/>
+          <w:bCs/>
+          <w:color w:val="8A6D1F"/>
+          <w:sz w:val="21"/>
+          <w:szCs w:val="21"/>
+        </w:rPr>
+        <w:t>Gotcha</w:t>
+      </w:r>
+    </w:p>
+    <w:p>
+      <w:pPr>
+        <w:pStyle w:val="ListParagraph"/>
+        <w:numPr>
+          <w:ilvl w:val="0"/>
+          <w:numId w:val="1"/>
+        </w:numPr>
+        <w:spacing w:after="60"/>
+      </w:pPr>
+      <w:r>
+        <w:rPr>
+          <w:sz w:val="20"/>
+          <w:szCs w:val="20"/>
+        </w:rPr>
+        <w:t>85 passing on the first run is suspicious rather than reassuring, so the suite was mutation tested before being trusted. Six deliberate breakages, one at a time: identifiers no longer collapsing to ID, comments no longer dropped, shortlist_pairs becoming one-directional, mean returning 0.0 instead of None, the identical-bracket short circuit removed, and the size-gap prune no longer firing. Five were caught immediately.</w:t>
+      </w:r>
+    </w:p>
+    <w:p>
+      <w:pPr>
+        <w:pStyle w:val="ListParagraph"/>
+        <w:numPr>
+          <w:ilvl w:val="0"/>
+          <w:numId w:val="1"/>
+        </w:numPr>
+        <w:spacing w:after="60"/>
+      </w:pPr>
+      <w:r>
+        <w:rPr>
+          <w:sz w:val="20"/>
+          <w:szCs w:val="20"/>
+        </w:rPr>
+        <w:t>The miss was the useful part. Deleting the size prune changed nothing, which independently confirms the Phase 4 correction that the prune never fired once on real function pairs, because functions inside one file have similar sizes. The existing test checked ceiling_for in isolation; nothing proved compare_unit_sets actually prunes. Two tests were added that force a two-node unit against a two-hundred-node one, and the mutation is now caught. That guard has been observed working exactly once, in a test written for the purpose.</w:t>
+      </w:r>
+    </w:p>
+    <w:p>
+      <w:pPr>
+        <w:pStyle w:val="ListParagraph"/>
+        <w:numPr>
+          <w:ilvl w:val="0"/>
+          <w:numId w:val="1"/>
+        </w:numPr>
+        <w:spacing w:after="60"/>
+      </w:pPr>
+      <w:r>
+        <w:rPr>
+          <w:sz w:val="20"/>
+          <w:szCs w:val="20"/>
+        </w:rPr>
+        <w:t>One regression test is worth naming. test_the_shortlist_nominates_from_both_sides pins the File 064 starvation bug: every unit of A prefers b[0], so a one-directional shortlist never offers b[1] to anybody and its real partner goes unmatched. That bug was found twice during Phase 4 and now cannot return silently.</w:t>
+      </w:r>
+    </w:p>
+    <w:p>
+      <w:pPr>
+        <w:pStyle w:val="ListParagraph"/>
+        <w:numPr>
+          <w:ilvl w:val="0"/>
+          <w:numId w:val="1"/>
+        </w:numPr>
+        <w:spacing w:after="60"/>
+      </w:pPr>
+      <w:r>
+        <w:rPr>
+          <w:sz w:val="20"/>
+          <w:szCs w:val="20"/>
+        </w:rPr>
+        <w:t>Carry-over: pyproject.toml's dependencies list disagrees with requirements.txt. It names fastapi, uvicorn, pydantic and pydantic-settings but omits tree-sitter, the two grammars and apted, while requirements.txt lists those and drops pydantic-settings. The Dockerfile installs from requirements.txt, so the image is right and the project metadata is wrong.</w:t>
+      </w:r>
+    </w:p>
+    <w:p>
+      <w:pPr>
+        <w:spacing w:after="120"/>
+      </w:pPr>
+      <w:r>
+        <w:rPr>
+          <w:b w:val="false"/>
+          <w:bCs w:val="false"/>
+          <w:i w:val="false"/>
+          <w:iCs w:val="false"/>
+          <w:sz w:val="20"/>
+          <w:szCs w:val="20"/>
+        </w:rPr>
+      </w:r>
+    </w:p>
+    <w:p>
+      <w:pPr>
+        <w:pStyle w:val="Heading1"/>
+        <w:pBdr>
+          <w:bottom w:val="single" w:color="8A6D1F" w:sz="8" w:space="4"/>
+        </w:pBdr>
+        <w:spacing w:after="160" w:before="420"/>
+      </w:pPr>
+      <w:r>
+        <w:rPr>
+          <w:b/>
+          <w:bCs/>
+          <w:color w:val="1F3352"/>
+          <w:sz w:val="28"/>
+          <w:szCs w:val="28"/>
+        </w:rPr>
+        <w:t>File 083 — apps/detector/tests/test_main.py · .github/workflows/ci.yml</w:t>
+      </w:r>
+    </w:p>
+    <w:p>
+      <w:pPr>
+        <w:pStyle w:val="Heading3"/>
+        <w:spacing w:after="80" w:before="200"/>
+      </w:pPr>
+      <w:r>
+        <w:rPr>
+          <w:b/>
+          <w:bCs/>
+          <w:color w:val="8A6D1F"/>
+          <w:sz w:val="21"/>
+          <w:szCs w:val="21"/>
+        </w:rPr>
+        <w:t>1 · Why this file exists</w:t>
+      </w:r>
+    </w:p>
+    <w:p>
+      <w:pPr>
+        <w:spacing w:after="120"/>
+      </w:pPr>
+      <w:r>
+        <w:rPr>
+          <w:b w:val="false"/>
+          <w:bCs w:val="false"/>
+          <w:i w:val="false"/>
+          <w:iCs w:val="false"/>
+          <w:sz w:val="20"/>
+          <w:szCs w:val="20"/>
+        </w:rPr>
+        <w:t>Every other test in the detector exercises a module in isolation. This one drives the two endpoints as the Node API actually sees them, which is the cross-language contract that had been checked by hand since File 073. The same entry adds the first automated gate the project has ever had.</w:t>
+      </w:r>
+    </w:p>
+    <w:p>
+      <w:pPr>
+        <w:pStyle w:val="Heading3"/>
+        <w:spacing w:after="80" w:before="200"/>
+      </w:pPr>
+      <w:r>
+        <w:rPr>
+          <w:b/>
+          <w:bCs/>
+          <w:color w:val="8A6D1F"/>
+          <w:sz w:val="21"/>
+          <w:szCs w:val="21"/>
+        </w:rPr>
+        <w:t>2 · Why it is a separate file</w:t>
+      </w:r>
+    </w:p>
+    <w:p>
+      <w:pPr>
+        <w:spacing w:after="120"/>
+      </w:pPr>
+      <w:r>
+        <w:rPr>
+          <w:b w:val="false"/>
+          <w:bCs w:val="false"/>
+          <w:i w:val="false"/>
+          <w:iCs w:val="false"/>
+          <w:sz w:val="20"/>
+          <w:szCs w:val="20"/>
+        </w:rPr>
+        <w:t>test_main.py is separate because its subject is the HTTP surface rather than any one module, and because it needs fastapi's TestClient and therefore httpx, which the runtime image must not carry. The workflow is separate because it belongs to the repository rather than to either service.</w:t>
+      </w:r>
+    </w:p>
+    <w:p>
+      <w:pPr>
+        <w:pStyle w:val="Heading3"/>
+        <w:spacing w:after="80" w:before="200"/>
+      </w:pPr>
+      <w:r>
+        <w:rPr>
+          <w:b/>
+          <w:bCs/>
+          <w:color w:val="8A6D1F"/>
+          <w:sz w:val="21"/>
+          <w:szCs w:val="21"/>
+        </w:rPr>
+        <w:t>3 · What we do in this file</w:t>
+      </w:r>
+    </w:p>
+    <w:p>
+      <w:pPr>
+        <w:spacing w:after="120"/>
+      </w:pPr>
+      <w:r>
+        <w:rPr>
+          <w:b w:val="false"/>
+          <w:bCs w:val="false"/>
+          <w:i w:val="false"/>
+          <w:iCs w:val="false"/>
+          <w:sz w:val="20"/>
+          <w:szCs w:val="20"/>
+        </w:rPr>
+        <w:t>27 tests over /health, /analyze and /features. requirements-dev.txt pulls in the runtime list and adds pytest, httpx and ruff. A pretest hook makes npm test typecheck first. The workflow runs the API's typecheck and the detector's ruff and pytest.</w:t>
+      </w:r>
+    </w:p>
+    <w:p>
+      <w:pPr>
+        <w:pStyle w:val="Heading3"/>
+        <w:spacing w:after="80" w:before="200"/>
+      </w:pPr>
+      <w:r>
+        <w:rPr>
+          <w:b/>
+          <w:bCs/>
+          <w:color w:val="8A6D1F"/>
+          <w:sz w:val="21"/>
+          <w:szCs w:val="21"/>
+        </w:rPr>
+        <w:t>4 · Changes made later</w:t>
+      </w:r>
+    </w:p>
+    <w:p>
+      <w:pPr>
+        <w:spacing w:after="120"/>
+      </w:pPr>
+      <w:r>
+        <w:rPr>
+          <w:b w:val="false"/>
+          <w:bCs w:val="false"/>
+          <w:i w:val="false"/>
+          <w:iCs w:val="false"/>
+          <w:sz w:val="20"/>
+          <w:szCs w:val="20"/>
+        </w:rPr>
+        <w:t>06 Oct 2026 — File 084 added the token and body-limit tests to this file, and every request in it now carries the shared secret.</w:t>
+      </w:r>
+    </w:p>
+    <w:p>
+      <w:pPr>
+        <w:pStyle w:val="Heading3"/>
+        <w:spacing w:after="80" w:before="200"/>
+      </w:pPr>
+      <w:r>
+        <w:rPr>
+          <w:b/>
+          <w:bCs/>
+          <w:color w:val="8A6D1F"/>
+          <w:sz w:val="21"/>
+          <w:szCs w:val="21"/>
+        </w:rPr>
+        <w:t>5 · Where it sits</w:t>
+      </w:r>
+    </w:p>
+    <w:p>
+      <w:pPr>
+        <w:spacing w:after="120"/>
+      </w:pPr>
+      <w:r>
+        <w:rPr>
+          <w:b w:val="false"/>
+          <w:bCs w:val="false"/>
+          <w:i w:val="false"/>
+          <w:iCs w:val="false"/>
+          <w:sz w:val="20"/>
+          <w:szCs w:val="20"/>
+        </w:rPr>
+        <w:t>apps/detector/tests/test_main.py and .github/workflows/ci.yml, with apps/detector/requirements-dev.txt and one line in apps/api/package.json.</w:t>
+      </w:r>
+    </w:p>
+    <w:p>
+      <w:pPr>
+        <w:pStyle w:val="Heading3"/>
+        <w:spacing w:after="80" w:before="200"/>
+      </w:pPr>
+      <w:r>
+        <w:rPr>
+          <w:b/>
+          <w:bCs/>
+          <w:color w:val="8A6D1F"/>
+          <w:sz w:val="21"/>
+          <w:szCs w:val="21"/>
+        </w:rPr>
+        <w:t>6 · Libraries used here</w:t>
+      </w:r>
+    </w:p>
+    <w:p>
+      <w:pPr>
+        <w:spacing w:after="120"/>
+      </w:pPr>
+      <w:r>
+        <w:rPr>
+          <w:b w:val="false"/>
+          <w:bCs w:val="false"/>
+          <w:i w:val="false"/>
+          <w:iCs w:val="false"/>
+          <w:sz w:val="20"/>
+          <w:szCs w:val="20"/>
+        </w:rPr>
+        <w:t>httpx, for fastapi's TestClient. Declared in requirements-dev.txt rather than requirements.txt, because the Dockerfile installs from the latter and the image must not carry test tooling.</w:t>
+      </w:r>
+    </w:p>
+    <w:p>
+      <w:pPr>
+        <w:pStyle w:val="Heading3"/>
+        <w:spacing w:after="80" w:before="200"/>
+      </w:pPr>
+      <w:r>
+        <w:rPr>
+          <w:b/>
+          <w:bCs/>
+          <w:color w:val="8A6D1F"/>
+          <w:sz w:val="21"/>
+          <w:szCs w:val="21"/>
+        </w:rPr>
+        <w:t>7 · Functions in this file</w:t>
+      </w:r>
+    </w:p>
+    <w:p>
+      <w:pPr>
+        <w:spacing w:after="120"/>
+      </w:pPr>
+      <w:r>
+        <w:rPr>
+          <w:b w:val="false"/>
+          <w:bCs w:val="false"/>
+          <w:i w:val="false"/>
+          <w:iCs w:val="false"/>
+          <w:sz w:val="20"/>
+          <w:szCs w:val="20"/>
+        </w:rPr>
+        <w:t>analyze() and features() request helpers, plus the tests.</w:t>
+      </w:r>
+    </w:p>
+    <w:p>
+      <w:pPr>
+        <w:pStyle w:val="Heading3"/>
+        <w:spacing w:after="80" w:before="200"/>
+      </w:pPr>
+      <w:r>
+        <w:rPr>
+          <w:b/>
+          <w:bCs/>
+          <w:color w:val="8A6D1F"/>
+          <w:sz w:val="21"/>
+          <w:szCs w:val="21"/>
+        </w:rPr>
+        <w:t>8 · Technical terms introduced</w:t>
+      </w:r>
+    </w:p>
+    <w:p>
+      <w:pPr>
+        <w:spacing w:after="120"/>
+      </w:pPr>
+      <w:r>
+        <w:rPr>
+          <w:b w:val="false"/>
+          <w:bCs w:val="false"/>
+          <w:i w:val="false"/>
+          <w:iCs w:val="false"/>
+          <w:sz w:val="20"/>
+          <w:szCs w:val="20"/>
+        </w:rPr>
+        <w:t>TestClient · pretest hook · continuous integration gate · isort · service container · cheap versus exact ranking inversion</w:t>
+      </w:r>
+    </w:p>
+    <w:p>
+      <w:pPr>
+        <w:pStyle w:val="Heading3"/>
+        <w:spacing w:after="80" w:before="200"/>
+      </w:pPr>
+      <w:r>
+        <w:rPr>
+          <w:b/>
+          <w:bCs/>
+          <w:color w:val="8A6D1F"/>
+          <w:sz w:val="21"/>
+          <w:szCs w:val="21"/>
+        </w:rPr>
+        <w:t>9 · Why this approach and not another</w:t>
+      </w:r>
+    </w:p>
+    <w:p>
+      <w:pPr>
+        <w:pStyle w:val="ListParagraph"/>
+        <w:numPr>
+          <w:ilvl w:val="0"/>
+          <w:numId w:val="1"/>
+        </w:numPr>
+        <w:spacing w:after="60"/>
+      </w:pPr>
+      <w:r>
+        <w:rPr>
+          <w:sz w:val="20"/>
+          <w:szCs w:val="20"/>
+        </w:rPr>
+        <w:t>An open question from File 070 is now settled rather than believed. That entry recorded uncertainty about whether response_model_exclude_none strips None values inside a dict field. Measured: it does not. All ten keys return, with explicit null for the three that do not apply.</w:t>
+      </w:r>
+    </w:p>
+    <w:p>
+      <w:pPr>
+        <w:pStyle w:val="ListParagraph"/>
+        <w:numPr>
+          <w:ilvl w:val="0"/>
+          <w:numId w:val="1"/>
+        </w:numPr>
+        <w:spacing w:after="60"/>
+      </w:pPr>
+      <w:r>
+        <w:rPr>
+          <w:b/>
+          <w:bCs/>
+          <w:sz w:val="20"/>
+          <w:szCs w:val="20"/>
+        </w:rPr>
+        <w:t>The test that matters is written against the weaker contract anyway</w:t>
+      </w:r>
+      <w:r>
+        <w:rPr>
+          <w:sz w:val="20"/>
+          <w:szCs w:val="20"/>
+        </w:rPr>
+        <w:t xml:space="preserve"> — it asserts only that an unmeasurable feature is never 0, because the Node side treats absent and null identically and should not be coupled to the serialiser's choice. Pinning the stronger behaviour is a second, separate test.</w:t>
+      </w:r>
+    </w:p>
+    <w:p>
+      <w:pPr>
+        <w:pStyle w:val="ListParagraph"/>
+        <w:numPr>
+          <w:ilvl w:val="0"/>
+          <w:numId w:val="1"/>
+        </w:numPr>
+        <w:spacing w:after="60"/>
+      </w:pPr>
+      <w:r>
+        <w:rPr>
+          <w:b/>
+          <w:bCs/>
+          <w:sz w:val="20"/>
+          <w:szCs w:val="20"/>
+        </w:rPr>
+        <w:t>An unparsable submission is a 200 with a reason, not a 500</w:t>
+      </w:r>
+      <w:r>
+        <w:rPr>
+          <w:sz w:val="20"/>
+          <w:szCs w:val="20"/>
+        </w:rPr>
+        <w:t xml:space="preserve"> — the contract says a broken file is an answer about the file rather than a failure of the service, and the test says so explicitly so nobody optimises it into an error later.</w:t>
+      </w:r>
+    </w:p>
+    <w:p>
+      <w:pPr>
+        <w:pStyle w:val="ListParagraph"/>
+        <w:numPr>
+          <w:ilvl w:val="0"/>
+          <w:numId w:val="1"/>
+        </w:numPr>
+        <w:spacing w:after="60"/>
+      </w:pPr>
+      <w:r>
+        <w:rPr>
+          <w:b/>
+          <w:bCs/>
+          <w:sz w:val="20"/>
+          <w:szCs w:val="20"/>
+        </w:rPr>
+        <w:t>CI runs only what needs no services and no secrets</w:t>
+      </w:r>
+      <w:r>
+        <w:rPr>
+          <w:sz w:val="20"/>
+          <w:szCs w:val="20"/>
+        </w:rPr>
+        <w:t xml:space="preserve"> — the API's typecheck and the detector's ruff and pytest. The integration suite needs Mongo, Redis and an object store, and it reads infra/.env, which is not in the repository. A workflow that is red on every push because it cannot find a secret is worse than no workflow.</w:t>
+      </w:r>
+    </w:p>
+    <w:p>
+      <w:pPr>
+        <w:pStyle w:val="ListParagraph"/>
+        <w:numPr>
+          <w:ilvl w:val="0"/>
+          <w:numId w:val="1"/>
+        </w:numPr>
+        <w:spacing w:after="60"/>
+      </w:pPr>
+      <w:r>
+        <w:rPr>
+          <w:b/>
+          <w:bCs/>
+          <w:sz w:val="20"/>
+          <w:szCs w:val="20"/>
+        </w:rPr>
+        <w:t>A pretest hook rather than discipline</w:t>
+      </w:r>
+      <w:r>
+        <w:rPr>
+          <w:sz w:val="20"/>
+          <w:szCs w:val="20"/>
+        </w:rPr>
+        <w:t xml:space="preserve"> — the typecheck gate had been run by hand for six consecutive files. npm now runs it automatically, so a type error cannot reach a test run.</w:t>
+      </w:r>
+    </w:p>
+    <w:p>
+      <w:pPr>
+        <w:pStyle w:val="Heading3"/>
+        <w:spacing w:after="80" w:before="200"/>
+      </w:pPr>
+      <w:r>
+        <w:rPr>
+          <w:b/>
+          <w:bCs/>
+          <w:color w:val="8A6D1F"/>
+          <w:sz w:val="21"/>
+          <w:szCs w:val="21"/>
+        </w:rPr>
+        <w:t>Gotcha</w:t>
+      </w:r>
+    </w:p>
+    <w:p>
+      <w:pPr>
+        <w:pStyle w:val="ListParagraph"/>
+        <w:numPr>
+          <w:ilvl w:val="0"/>
+          <w:numId w:val="1"/>
+        </w:numPr>
+        <w:spacing w:after="60"/>
+      </w:pPr>
+      <w:r>
+        <w:rPr>
+          <w:sz w:val="20"/>
+          <w:szCs w:val="20"/>
+        </w:rPr>
+        <w:t>Mutation tested again: seven breakages, six caught immediately. The miss was removing matches.sort(...), and the reason is interesting rather than embarrassing. The prefilter already ranks by label bag, so the cheap order usually coincides with the exact order and the sort looks redundant.</w:t>
+      </w:r>
+    </w:p>
+    <w:p>
+      <w:pPr>
+        <w:pStyle w:val="ListParagraph"/>
+        <w:numPr>
+          <w:ilvl w:val="0"/>
+          <w:numId w:val="1"/>
+        </w:numPr>
+        <w:spacing w:after="60"/>
+      </w:pPr>
+      <w:r>
+        <w:rPr>
+          <w:sz w:val="20"/>
+          <w:szCs w:val="20"/>
+        </w:rPr>
+        <w:t>Finding a case where they disagree took one experiment. A candidate holding the target's exact label multiset in a different nesting scores 1.0000 on the cheap score, because label bags ignore shape, and 0.8462 on APTED. Without the final sort it is presented above an exact copy. That case is now a test and the mutation is caught.</w:t>
+      </w:r>
+    </w:p>
+    <w:p>
+      <w:pPr>
+        <w:pStyle w:val="ListParagraph"/>
+        <w:numPr>
+          <w:ilvl w:val="0"/>
+          <w:numId w:val="1"/>
+        </w:numPr>
+        <w:spacing w:after="60"/>
+      </w:pPr>
+      <w:r>
+        <w:rPr>
+          <w:sz w:val="20"/>
+          <w:szCs w:val="20"/>
+        </w:rPr>
+        <w:t>Building the gate found three faults before the gate existed. ruff had been failing on features.py since 01 Oct, because a comment sat inside its import block and broke isort's I001: five days red, unnoticed, because ruff only ever ran by hand. package.json declared typecheck twice, so the first was silently dead code, which is legal JSON and warns nobody. And npm test never typechecked.</w:t>
+      </w:r>
+    </w:p>
+    <w:p>
+      <w:pPr>
+        <w:pStyle w:val="ListParagraph"/>
+        <w:numPr>
+          <w:ilvl w:val="0"/>
+          <w:numId w:val="1"/>
+        </w:numPr>
+        <w:spacing w:after="60"/>
+      </w:pPr>
+      <w:r>
+        <w:rPr>
+          <w:sz w:val="20"/>
+          <w:szCs w:val="20"/>
+        </w:rPr>
+        <w:t>The gate then caught me within a day, rejecting File 084 because I had inserted a constant out of alphabetical order in an import block.</w:t>
+      </w:r>
+    </w:p>
+    <w:p>
+      <w:pPr>
+        <w:pStyle w:val="ListParagraph"/>
+        <w:numPr>
+          <w:ilvl w:val="0"/>
+          <w:numId w:val="1"/>
+        </w:numPr>
+        <w:spacing w:after="60"/>
+      </w:pPr>
+      <w:r>
+        <w:rPr>
+          <w:sz w:val="20"/>
+          <w:szCs w:val="20"/>
+        </w:rPr>
+        <w:t>Carry-over: GitHub Actions service containers cannot be given a container command, and the object store needs server /data, so an integration job would run docker compose up -d against the existing compose file rather than using Actions services. That is also more faithful to how the stack really starts.</w:t>
+      </w:r>
+    </w:p>
+    <w:p>
+      <w:pPr>
+        <w:spacing w:after="120"/>
+      </w:pPr>
+      <w:r>
+        <w:rPr>
+          <w:b w:val="false"/>
+          <w:bCs w:val="false"/>
+          <w:i w:val="false"/>
+          <w:iCs w:val="false"/>
+          <w:sz w:val="20"/>
+          <w:szCs w:val="20"/>
+        </w:rPr>
+      </w:r>
+    </w:p>
+    <w:p>
+      <w:pPr>
+        <w:pStyle w:val="Heading1"/>
+        <w:pBdr>
+          <w:bottom w:val="single" w:color="8A6D1F" w:sz="8" w:space="4"/>
+        </w:pBdr>
+        <w:spacing w:after="160" w:before="420"/>
+      </w:pPr>
+      <w:r>
+        <w:rPr>
+          <w:b/>
+          <w:bCs/>
+          <w:color w:val="1F3352"/>
+          <w:sz w:val="28"/>
+          <w:szCs w:val="28"/>
+        </w:rPr>
+        <w:t>File 084 — apps/detector/app/main.py (revisit) · apps/api/src/services/detectorClient.ts (revisit)</w:t>
+      </w:r>
+    </w:p>
+    <w:p>
+      <w:pPr>
+        <w:pStyle w:val="Heading3"/>
+        <w:spacing w:after="80" w:before="200"/>
+      </w:pPr>
+      <w:r>
+        <w:rPr>
+          <w:b/>
+          <w:bCs/>
+          <w:color w:val="8A6D1F"/>
+          <w:sz w:val="21"/>
+          <w:szCs w:val="21"/>
+        </w:rPr>
+        <w:t>1 · Why this file exists</w:t>
+      </w:r>
+    </w:p>
+    <w:p>
+      <w:pPr>
+        <w:spacing w:after="120"/>
+      </w:pPr>
+      <w:r>
+        <w:rPr>
+          <w:b w:val="false"/>
+          <w:bCs w:val="false"/>
+          <w:i w:val="false"/>
+          <w:iCs w:val="false"/>
+          <w:sz w:val="20"/>
+          <w:szCs w:val="20"/>
+        </w:rPr>
+        <w:t>The detector had no authentication and no body limit, so anything able to reach port 8000 could submit work or read back scores, and an unbounded POST was buffered into memory before any field cap rejected it. This closes the gap File 070 opened and every entry since has carried.</w:t>
+      </w:r>
+    </w:p>
+    <w:p>
+      <w:pPr>
+        <w:pStyle w:val="Heading3"/>
+        <w:spacing w:after="80" w:before="200"/>
+      </w:pPr>
+      <w:r>
+        <w:rPr>
+          <w:b/>
+          <w:bCs/>
+          <w:color w:val="8A6D1F"/>
+          <w:sz w:val="21"/>
+          <w:szCs w:val="21"/>
+        </w:rPr>
+        <w:t>2 · Why it is a separate file</w:t>
+      </w:r>
+    </w:p>
+    <w:p>
+      <w:pPr>
+        <w:spacing w:after="120"/>
+      </w:pPr>
+      <w:r>
+        <w:rPr>
+          <w:b w:val="false"/>
+          <w:bCs w:val="false"/>
+          <w:i w:val="false"/>
+          <w:iCs w:val="false"/>
+          <w:sz w:val="20"/>
+          <w:szCs w:val="20"/>
+        </w:rPr>
+        <w:t>Not separate files. The check belongs beside the endpoints it guards, and the header belongs in the one function that already speaks HTTP to the detector, where the timeout and unreachable messages also live.</w:t>
+      </w:r>
+    </w:p>
+    <w:p>
+      <w:pPr>
+        <w:pStyle w:val="Heading3"/>
+        <w:spacing w:after="80" w:before="200"/>
+      </w:pPr>
+      <w:r>
+        <w:rPr>
+          <w:b/>
+          <w:bCs/>
+          <w:color w:val="8A6D1F"/>
+          <w:sz w:val="21"/>
+          <w:szCs w:val="21"/>
+        </w:rPr>
+        <w:t>3 · What we do in this file</w:t>
+      </w:r>
+    </w:p>
+    <w:p>
+      <w:pPr>
+        <w:spacing w:after="120"/>
+      </w:pPr>
+      <w:r>
+        <w:rPr>
+          <w:b w:val="false"/>
+          <w:bCs w:val="false"/>
+          <w:i w:val="false"/>
+          <w:iCs w:val="false"/>
+          <w:sz w:val="20"/>
+          <w:szCs w:val="20"/>
+        </w:rPr>
+        <w:t>/analyze and /features require an X-Detector-Token header, compared in constant time. A middleware refuses a declared content-length above 16 MB with 413. The service refuses to start without the token. detectorClient sends the header, env.ts validates it, and both in-process test stubs answer 401 without it.</w:t>
+      </w:r>
+    </w:p>
+    <w:p>
+      <w:pPr>
+        <w:pStyle w:val="Heading3"/>
+        <w:spacing w:after="80" w:before="200"/>
+      </w:pPr>
+      <w:r>
+        <w:rPr>
+          <w:b/>
+          <w:bCs/>
+          <w:color w:val="8A6D1F"/>
+          <w:sz w:val="21"/>
+          <w:szCs w:val="21"/>
+        </w:rPr>
+        <w:t>4 · Changes made later</w:t>
+      </w:r>
+    </w:p>
+    <w:p>
+      <w:pPr>
+        <w:spacing w:after="120"/>
+      </w:pPr>
+      <w:r>
+        <w:rPr>
+          <w:b w:val="false"/>
+          <w:bCs w:val="false"/>
+          <w:i w:val="false"/>
+          <w:iCs w:val="false"/>
+          <w:sz w:val="20"/>
+          <w:szCs w:val="20"/>
+        </w:rPr>
+        <w:t>[ Date any later change to this file here. ]</w:t>
+      </w:r>
+    </w:p>
+    <w:p>
+      <w:pPr>
+        <w:pStyle w:val="Heading3"/>
+        <w:spacing w:after="80" w:before="200"/>
+      </w:pPr>
+      <w:r>
+        <w:rPr>
+          <w:b/>
+          <w:bCs/>
+          <w:color w:val="8A6D1F"/>
+          <w:sz w:val="21"/>
+          <w:szCs w:val="21"/>
+        </w:rPr>
+        <w:t>5 · Where it sits</w:t>
+      </w:r>
+    </w:p>
+    <w:p>
+      <w:pPr>
+        <w:spacing w:after="120"/>
+      </w:pPr>
+      <w:r>
+        <w:rPr>
+          <w:b w:val="false"/>
+          <w:bCs w:val="false"/>
+          <w:i w:val="false"/>
+          <w:iCs w:val="false"/>
+          <w:sz w:val="20"/>
+          <w:szCs w:val="20"/>
+        </w:rPr>
+        <w:t>apps/detector/app/main.py and apps/api/src/services/detectorClient.ts, with DETECTOR_TOKEN added to env.ts, a throwaway token in helpers.ts and conftest.py, an environment block in the detector's compose service, and the real value in infra/.env, which is not in the repository.</w:t>
+      </w:r>
+    </w:p>
+    <w:p>
+      <w:pPr>
+        <w:pStyle w:val="Heading3"/>
+        <w:spacing w:after="80" w:before="200"/>
+      </w:pPr>
+      <w:r>
+        <w:rPr>
+          <w:b/>
+          <w:bCs/>
+          <w:color w:val="8A6D1F"/>
+          <w:sz w:val="21"/>
+          <w:szCs w:val="21"/>
+        </w:rPr>
+        <w:t>6 · Libraries used here</w:t>
+      </w:r>
+    </w:p>
+    <w:p>
+      <w:pPr>
+        <w:spacing w:after="120"/>
+      </w:pPr>
+      <w:r>
+        <w:rPr>
+          <w:b w:val="false"/>
+          <w:bCs w:val="false"/>
+          <w:i w:val="false"/>
+          <w:iCs w:val="false"/>
+          <w:sz w:val="20"/>
+          <w:szCs w:val="20"/>
+        </w:rPr>
+        <w:t>None new. secrets and os are standard library.</w:t>
+      </w:r>
+    </w:p>
+    <w:p>
+      <w:pPr>
+        <w:pStyle w:val="Heading3"/>
+        <w:spacing w:after="80" w:before="200"/>
+      </w:pPr>
+      <w:r>
+        <w:rPr>
+          <w:b/>
+          <w:bCs/>
+          <w:color w:val="8A6D1F"/>
+          <w:sz w:val="21"/>
+          <w:szCs w:val="21"/>
+        </w:rPr>
+        <w:t>7 · Functions in this file</w:t>
+      </w:r>
+    </w:p>
+    <w:p>
+      <w:pPr>
+        <w:spacing w:after="120"/>
+      </w:pPr>
+      <w:r>
+        <w:rPr>
+          <w:b w:val="false"/>
+          <w:bCs w:val="false"/>
+          <w:i w:val="false"/>
+          <w:iCs w:val="false"/>
+          <w:sz w:val="20"/>
+          <w:szCs w:val="20"/>
+        </w:rPr>
+        <w:t>require_token and limit_body_size in main.py; the revised postJson in detectorClient.ts.</w:t>
+      </w:r>
+    </w:p>
+    <w:p>
+      <w:pPr>
+        <w:pStyle w:val="Heading3"/>
+        <w:spacing w:after="80" w:before="200"/>
+      </w:pPr>
+      <w:r>
+        <w:rPr>
+          <w:b/>
+          <w:bCs/>
+          <w:color w:val="8A6D1F"/>
+          <w:sz w:val="21"/>
+          <w:szCs w:val="21"/>
+        </w:rPr>
+        <w:t>8 · Technical terms introduced</w:t>
+      </w:r>
+    </w:p>
+    <w:p>
+      <w:pPr>
+        <w:spacing w:after="120"/>
+      </w:pPr>
+      <w:r>
+        <w:rPr>
+          <w:b w:val="false"/>
+          <w:bCs w:val="false"/>
+          <w:i w:val="false"/>
+          <w:iCs w:val="false"/>
+          <w:sz w:val="20"/>
+          <w:szCs w:val="20"/>
+        </w:rPr>
+        <w:t>shared secret · constant-time comparison · timing attack · fail closed · content-length · chunked transfer encoding · 413 Payload Too Large · latin-1 header decoding</w:t>
+      </w:r>
+    </w:p>
+    <w:p>
+      <w:pPr>
+        <w:pStyle w:val="Heading3"/>
+        <w:spacing w:after="80" w:before="200"/>
+      </w:pPr>
+      <w:r>
+        <w:rPr>
+          <w:b/>
+          <w:bCs/>
+          <w:color w:val="8A6D1F"/>
+          <w:sz w:val="21"/>
+          <w:szCs w:val="21"/>
+        </w:rPr>
+        <w:t>9 · Why this approach and not another</w:t>
+      </w:r>
+    </w:p>
+    <w:p>
+      <w:pPr>
+        <w:pStyle w:val="ListParagraph"/>
+        <w:numPr>
+          <w:ilvl w:val="0"/>
+          <w:numId w:val="1"/>
+        </w:numPr>
+        <w:spacing w:after="60"/>
+      </w:pPr>
+      <w:r>
+        <w:rPr>
+          <w:b/>
+          <w:bCs/>
+          <w:sz w:val="20"/>
+          <w:szCs w:val="20"/>
+        </w:rPr>
+        <w:t>One token rather than per-caller credentials</w:t>
+      </w:r>
+      <w:r>
+        <w:rPr>
+          <w:sz w:val="20"/>
+          <w:szCs w:val="20"/>
+        </w:rPr>
+        <w:t xml:space="preserve"> — there is exactly one caller and nothing public is meant to reach this service, so anything heavier would be ceremony that nobody maintains.</w:t>
+      </w:r>
+    </w:p>
+    <w:p>
+      <w:pPr>
+        <w:pStyle w:val="ListParagraph"/>
+        <w:numPr>
+          <w:ilvl w:val="0"/>
+          <w:numId w:val="1"/>
+        </w:numPr>
+        <w:spacing w:after="60"/>
+      </w:pPr>
+      <w:r>
+        <w:rPr>
+          <w:b/>
+          <w:bCs/>
+          <w:sz w:val="20"/>
+          <w:szCs w:val="20"/>
+        </w:rPr>
+        <w:t>compare_digest rather than ==</w:t>
+      </w:r>
+      <w:r>
+        <w:rPr>
+          <w:sz w:val="20"/>
+          <w:szCs w:val="20"/>
+        </w:rPr>
+        <w:t xml:space="preserve"> — how long the comparison takes must not reveal how much of the token was correct. A straight equality check short-circuits on the first wrong byte, which is measurable over enough requests.</w:t>
+      </w:r>
+    </w:p>
+    <w:p>
+      <w:pPr>
+        <w:pStyle w:val="ListParagraph"/>
+        <w:numPr>
+          <w:ilvl w:val="0"/>
+          <w:numId w:val="1"/>
+        </w:numPr>
+        <w:spacing w:after="60"/>
+      </w:pPr>
+      <w:r>
+        <w:rPr>
+          <w:b/>
+          <w:bCs/>
+          <w:sz w:val="20"/>
+          <w:szCs w:val="20"/>
+        </w:rPr>
+        <w:t>Compared as bytes rather than strings, which is not pedantry</w:t>
+      </w:r>
+      <w:r>
+        <w:rPr>
+          <w:sz w:val="20"/>
+          <w:szCs w:val="20"/>
+        </w:rPr>
+        <w:t xml:space="preserve"> — header values travel as bytes and starlette decodes them as latin-1, so the handler really can be handed a non-ascii string. compare_digest on str raises on exactly that, which would turn a bad token into a 500 instead of a 401. The test for it has to send raw bytes, because an HTTP client refuses to encode a non-ascii string into a header at all.</w:t>
+      </w:r>
+    </w:p>
+    <w:p>
+      <w:pPr>
+        <w:pStyle w:val="ListParagraph"/>
+        <w:numPr>
+          <w:ilvl w:val="0"/>
+          <w:numId w:val="1"/>
+        </w:numPr>
+        <w:spacing w:after="60"/>
+      </w:pPr>
+      <w:r>
+        <w:rPr>
+          <w:b/>
+          <w:bCs/>
+          <w:sz w:val="20"/>
+          <w:szCs w:val="20"/>
+        </w:rPr>
+        <w:t>/health stays open</w:t>
+      </w:r>
+      <w:r>
+        <w:rPr>
+          <w:sz w:val="20"/>
+          <w:szCs w:val="20"/>
+        </w:rPr>
+        <w:t xml:space="preserve"> — compose health-checks it with no token and it reveals only ok and a version. Guarding it would break the healthcheck to protect nothing.</w:t>
+      </w:r>
+    </w:p>
+    <w:p>
+      <w:pPr>
+        <w:pStyle w:val="ListParagraph"/>
+        <w:numPr>
+          <w:ilvl w:val="0"/>
+          <w:numId w:val="1"/>
+        </w:numPr>
+        <w:spacing w:after="60"/>
+      </w:pPr>
+      <w:r>
+        <w:rPr>
+          <w:b/>
+          <w:bCs/>
+          <w:sz w:val="20"/>
+          <w:szCs w:val="20"/>
+        </w:rPr>
+        <w:t>The body limit checks the declared length, not the stream</w:t>
+      </w:r>
+      <w:r>
+        <w:rPr>
+          <w:sz w:val="20"/>
+          <w:szCs w:val="20"/>
+        </w:rPr>
+        <w:t xml:space="preserve"> — Pydantic already caps every field, but only once the whole body has been buffered, so the memory is spent before anything rejects it. Reading the header first is what makes the refusal cheap. 16 MB because the largest honest request is one source plus fifty candidates at 256 KB each, about 13 MB before JSON escaping.</w:t>
+      </w:r>
+    </w:p>
+    <w:p>
+      <w:pPr>
+        <w:pStyle w:val="ListParagraph"/>
+        <w:numPr>
+          <w:ilvl w:val="0"/>
+          <w:numId w:val="1"/>
+        </w:numPr>
+        <w:spacing w:after="60"/>
+      </w:pPr>
+      <w:r>
+        <w:rPr>
+          <w:b/>
+          <w:bCs/>
+          <w:sz w:val="20"/>
+          <w:szCs w:val="20"/>
+        </w:rPr>
+        <w:t>The service refuses to start without a token</w:t>
+      </w:r>
+      <w:r>
+        <w:rPr>
+          <w:sz w:val="20"/>
+          <w:szCs w:val="20"/>
+        </w:rPr>
+        <w:t xml:space="preserve"> — a security control that quietly switches itself off when misconfigured is worse than none, because nobody finds out. Same reasoning as the satisfies guard on the trust table in File 072: an absent value must break loudly rather than default to something plausible.</w:t>
+      </w:r>
+    </w:p>
+    <w:p>
+      <w:pPr>
+        <w:pStyle w:val="ListParagraph"/>
+        <w:numPr>
+          <w:ilvl w:val="0"/>
+          <w:numId w:val="1"/>
+        </w:numPr>
+        <w:spacing w:after="60"/>
+      </w:pPr>
+      <w:r>
+        <w:rPr>
+          <w:b/>
+          <w:bCs/>
+          <w:sz w:val="20"/>
+          <w:szCs w:val="20"/>
+        </w:rPr>
+        <w:t>Both test stubs answer 401 without the header</w:t>
+      </w:r>
+      <w:r>
+        <w:rPr>
+          <w:sz w:val="20"/>
+          <w:szCs w:val="20"/>
+        </w:rPr>
+        <w:t xml:space="preserve"> — nothing previously verified that the Node client actually sends it, so forgetting would have passed all 63 Node tests and failed only against the real detector. Five lines in each stub closes the blind spot flagged in File 073.</w:t>
+      </w:r>
+    </w:p>
+    <w:p>
+      <w:pPr>
+        <w:pStyle w:val="Heading3"/>
+        <w:spacing w:after="80" w:before="200"/>
+      </w:pPr>
+      <w:r>
+        <w:rPr>
+          <w:b/>
+          <w:bCs/>
+          <w:color w:val="8A6D1F"/>
+          <w:sz w:val="21"/>
+          <w:szCs w:val="21"/>
+        </w:rPr>
+        <w:t>Gotcha</w:t>
+      </w:r>
+    </w:p>
+    <w:p>
+      <w:pPr>
+        <w:pStyle w:val="ListParagraph"/>
+        <w:numPr>
+          <w:ilvl w:val="0"/>
+          <w:numId w:val="1"/>
+        </w:numPr>
+        <w:spacing w:after="60"/>
+      </w:pPr>
+      <w:r>
+        <w:rPr>
+          <w:sz w:val="20"/>
+          <w:szCs w:val="20"/>
+        </w:rPr>
+        <w:t>Mutation tested: six breakages, six caught. Comparing as str instead of bytes, the check never rejecting, /analyze losing its dependency, the body limit not firing, the limit raised to 16 GB, and a missing token treated as valid. Nineteen mutations across the detector suite now, none missed.</w:t>
+      </w:r>
+    </w:p>
+    <w:p>
+      <w:pPr>
+        <w:pStyle w:val="ListParagraph"/>
+        <w:numPr>
+          <w:ilvl w:val="0"/>
+          <w:numId w:val="1"/>
+        </w:numPr>
+        <w:spacing w:after="60"/>
+      </w:pPr>
+      <w:r>
+        <w:rPr>
+          <w:sz w:val="20"/>
+          <w:szCs w:val="20"/>
+        </w:rPr>
+        <w:t>A known hole, stated rather than hidden: a chunked request declares no content-length and slips past the middleware, leaving the per-field caps as the only backstop. Enforcing it on the stream means reading incrementally and aborting mid-body, which is worth doing if the detector is ever exposed beyond localhost and not worth it while it is bound to 127.0.0.1.</w:t>
+      </w:r>
+    </w:p>
+    <w:p>
+      <w:pPr>
+        <w:pStyle w:val="ListParagraph"/>
+        <w:numPr>
+          <w:ilvl w:val="0"/>
+          <w:numId w:val="1"/>
+        </w:numPr>
+        <w:spacing w:after="60"/>
+      </w:pPr>
+      <w:r>
+        <w:rPr>
+          <w:sz w:val="20"/>
+          <w:szCs w:val="20"/>
+        </w:rPr>
+        <w:t>Carry-over: the local test run reports two pytest warnings while a clean environment on current package versions reports none, so they belong to the versions pinned in the detector's virtual environment. Warnings become failures at the next major version, so they want naming with pytest -rw.</w:t>
+      </w:r>
+    </w:p>
+    <w:p>
+      <w:pPr>
+        <w:spacing w:after="120"/>
+      </w:pPr>
+      <w:r>
+        <w:rPr>
+          <w:b w:val="false"/>
+          <w:bCs w:val="false"/>
+          <w:i w:val="false"/>
+          <w:iCs w:val="false"/>
+          <w:sz w:val="20"/>
+          <w:szCs w:val="20"/>
+        </w:rPr>
+      </w:r>
+    </w:p>
+    <w:p>
+      <w:pPr>
+        <w:pStyle w:val="Heading1"/>
+        <w:pBdr>
+          <w:bottom w:val="single" w:color="8A6D1F" w:sz="8" w:space="4"/>
+        </w:pBdr>
+        <w:spacing w:after="160" w:before="420"/>
+      </w:pPr>
+      <w:r>
+        <w:rPr>
+          <w:b/>
+          <w:bCs/>
+          <w:color w:val="1F3352"/>
+          <w:sz w:val="28"/>
+          <w:szCs w:val="28"/>
+        </w:rPr>
         <w:t>Next entry</w:t>
       </w:r>
     </w:p>
@@ -38835,7 +41039,7 @@
           <w:sz w:val="20"/>
           <w:szCs w:val="20"/>
         </w:rPr>
-        <w:t>[ File 081 — Layer 3, or the Phase 6 opening, undecided ]</w:t>
+        <w:t>[ File 085 — the npm advisory, or Java, undecided ]</w:t>
       </w:r>
     </w:p>
     <w:sectPr>

</xml_diff>